<commit_message>
Version final del informe
</commit_message>
<xml_diff>
--- a/PDS_Actividad_02_Grupo06.docx
+++ b/PDS_Actividad_02_Grupo06.docx
@@ -19,7 +19,7 @@
           <w:szCs w:val="72"/>
         </w:rPr>
         <w:drawing>
-          <wp:anchor behindDoc="1" distT="0" distB="0" distL="0" distR="0" simplePos="0" locked="0" layoutInCell="1" allowOverlap="1" relativeHeight="29">
+          <wp:anchor behindDoc="1" distT="0" distB="0" distL="0" distR="0" simplePos="0" locked="0" layoutInCell="1" allowOverlap="1" relativeHeight="146">
             <wp:simplePos x="0" y="0"/>
             <wp:positionH relativeFrom="column">
               <wp:posOffset>-1121410</wp:posOffset>
@@ -533,7 +533,7 @@
         <mc:AlternateContent>
           <mc:Choice Requires="wps">
             <w:drawing>
-              <wp:anchor behindDoc="0" distT="0" distB="22225" distL="0" distR="20955" simplePos="0" locked="0" layoutInCell="1" allowOverlap="1" relativeHeight="138" wp14:anchorId="078E150B">
+              <wp:anchor behindDoc="0" distT="3175" distB="3810" distL="635" distR="635" simplePos="0" locked="0" layoutInCell="1" allowOverlap="1" relativeHeight="147" wp14:anchorId="078E150B">
                 <wp:simplePos x="0" y="0"/>
                 <wp:positionH relativeFrom="column">
                   <wp:posOffset>-71120</wp:posOffset>
@@ -559,10 +559,7 @@
                         </a:prstGeom>
                         <a:ln>
                           <a:solidFill>
-                            <a:srgbClr val="ffc000">
-                              <a:lumMod val="60000"/>
-                              <a:lumOff val="40000"/>
-                            </a:srgbClr>
+                            <a:srgbClr val="ffd966"/>
                           </a:solidFill>
                         </a:ln>
                       </wps:spPr>
@@ -602,8 +599,6 @@
         <w:pStyle w:val="Heading2"/>
         <w:rPr/>
       </w:pPr>
-      <w:bookmarkStart w:id="1" w:name="_Toc86936452"/>
-      <w:bookmarkStart w:id="2" w:name="_Toc86936453"/>
       <w:r>
         <w:rPr/>
         <w:t>Fecha</w:t>
@@ -678,7 +673,16 @@
           <w:sz w:val="20"/>
           <w:szCs w:val="20"/>
         </w:rPr>
-        <w:t>Grupo XX</w:t>
+        <w:t xml:space="preserve">Grupo </w:t>
+      </w:r>
+      <w:r>
+        <w:rPr>
+          <w:rFonts w:cs="Calibri" w:ascii="Calibri" w:hAnsi="Calibri" w:asciiTheme="minorHAnsi" w:cstheme="minorHAnsi" w:hAnsiTheme="minorHAnsi"/>
+          <w:color w:themeColor="background2" w:themeShade="80" w:val="767171"/>
+          <w:sz w:val="20"/>
+          <w:szCs w:val="20"/>
+        </w:rPr>
+        <w:t>06</w:t>
       </w:r>
     </w:p>
     <w:p>
@@ -842,7 +846,7 @@
           <w:szCs w:val="20"/>
         </w:rPr>
       </w:pPr>
-      <w:bookmarkStart w:id="3" w:name="_Toc86936453"/>
+      <w:bookmarkStart w:id="1" w:name="_Toc86936453"/>
       <w:r>
         <w:rPr>
           <w:rFonts w:cs="Calibri" w:ascii="Calibri" w:hAnsi="Calibri" w:asciiTheme="minorHAnsi" w:cstheme="minorHAnsi" w:hAnsiTheme="minorHAnsi"/>
@@ -852,7 +856,7 @@
         </w:rPr>
         <w:t>RA2. Modela soluciones de software aplicando patrones estructurales de acuerdo con el contexto y las necesidades de diseño.</w:t>
       </w:r>
-      <w:bookmarkEnd w:id="3"/>
+      <w:bookmarkEnd w:id="1"/>
     </w:p>
     <w:p>
       <w:pPr>
@@ -1069,7 +1073,7 @@
           <w:szCs w:val="20"/>
         </w:rPr>
       </w:pPr>
-      <w:bookmarkStart w:id="4" w:name="_Toc86936452"/>
+      <w:bookmarkStart w:id="2" w:name="_Toc86936452"/>
       <w:r>
         <w:rPr>
           <w:rFonts w:cs="Calibri" w:ascii="Calibri" w:hAnsi="Calibri" w:asciiTheme="minorHAnsi" w:cstheme="minorHAnsi" w:hAnsiTheme="minorHAnsi"/>
@@ -1079,7 +1083,7 @@
         </w:rPr>
         <w:t xml:space="preserve">Seguir las instrucciones del ejercicio. </w:t>
       </w:r>
-      <w:bookmarkEnd w:id="4"/>
+      <w:bookmarkEnd w:id="2"/>
     </w:p>
     <w:p>
       <w:pPr>
@@ -2097,33 +2101,6 @@
           <w:szCs w:val="20"/>
         </w:rPr>
         <w:t>Una recomendación modificada o rechazada.</w:t>
-      </w:r>
-    </w:p>
-    <w:p>
-      <w:pPr>
-        <w:pStyle w:val="NormalWeb"/>
-        <w:numPr>
-          <w:ilvl w:val="0"/>
-          <w:numId w:val="3"/>
-        </w:numPr>
-        <w:shd w:val="clear" w:color="auto" w:fill="FFFFFF"/>
-        <w:spacing w:beforeAutospacing="0" w:before="0" w:afterAutospacing="0" w:after="60"/>
-        <w:jc w:val="both"/>
-        <w:rPr>
-          <w:rFonts w:ascii="Calibri" w:hAnsi="Calibri" w:cs="Calibri" w:asciiTheme="minorHAnsi" w:cstheme="minorHAnsi" w:hAnsiTheme="minorHAnsi"/>
-          <w:color w:themeColor="background2" w:themeShade="80" w:val="767171"/>
-          <w:sz w:val="20"/>
-          <w:szCs w:val="20"/>
-        </w:rPr>
-      </w:pPr>
-      <w:r>
-        <w:rPr>
-          <w:rFonts w:cs="Calibri" w:ascii="Calibri" w:hAnsi="Calibri" w:asciiTheme="minorHAnsi" w:cstheme="minorHAnsi" w:hAnsiTheme="minorHAnsi"/>
-          <w:color w:themeColor="background2" w:themeShade="80" w:val="767171"/>
-          <w:sz w:val="20"/>
-          <w:szCs w:val="20"/>
-        </w:rPr>
-        <w:t>Justificación de ambas decisiones.</w:t>
       </w:r>
     </w:p>
     <w:p>
@@ -2143,23 +2120,29 @@
           <w:textDirection w:val="lrTb"/>
           <w:docGrid w:type="default" w:linePitch="360" w:charSpace="0"/>
         </w:sectPr>
-        <w:pStyle w:val="Normal"/>
-        <w:rPr>
-          <w:rFonts w:eastAsia="Times New Roman" w:cs="Calibri" w:cstheme="minorHAnsi"/>
+        <w:pStyle w:val="NormalWeb"/>
+        <w:numPr>
+          <w:ilvl w:val="0"/>
+          <w:numId w:val="3"/>
+        </w:numPr>
+        <w:shd w:val="clear" w:color="auto" w:fill="FFFFFF"/>
+        <w:spacing w:beforeAutospacing="0" w:before="0" w:afterAutospacing="0" w:after="60"/>
+        <w:jc w:val="both"/>
+        <w:rPr>
+          <w:rFonts w:ascii="Calibri" w:hAnsi="Calibri" w:cs="Calibri" w:asciiTheme="minorHAnsi" w:cstheme="minorHAnsi" w:hAnsiTheme="minorHAnsi"/>
           <w:color w:themeColor="background2" w:themeShade="80" w:val="767171"/>
           <w:sz w:val="20"/>
           <w:szCs w:val="20"/>
-          <w:lang w:eastAsia="es-ES_tradnl"/>
-        </w:rPr>
-      </w:pPr>
-      <w:r>
-        <w:rPr>
-          <w:rFonts w:eastAsia="Times New Roman" w:cs="Calibri" w:cstheme="minorHAnsi"/>
+        </w:rPr>
+      </w:pPr>
+      <w:r>
+        <w:rPr>
+          <w:rFonts w:cs="Calibri" w:ascii="Calibri" w:hAnsi="Calibri" w:asciiTheme="minorHAnsi" w:cstheme="minorHAnsi" w:hAnsiTheme="minorHAnsi"/>
           <w:color w:themeColor="background2" w:themeShade="80" w:val="767171"/>
           <w:sz w:val="20"/>
           <w:szCs w:val="20"/>
-          <w:lang w:eastAsia="es-ES_tradnl"/>
-        </w:rPr>
+        </w:rPr>
+        <w:t>Justificación de ambas decisiones.</w:t>
       </w:r>
       <w:r>
         <w:br w:type="page"/>
@@ -2657,6 +2640,7 @@
             <w:pPr>
               <w:pStyle w:val="Normal"/>
               <w:widowControl/>
+              <w:suppressAutoHyphens w:val="true"/>
               <w:spacing w:before="0" w:after="0"/>
               <w:jc w:val="center"/>
               <w:rPr>
@@ -2690,6 +2674,7 @@
             <w:pPr>
               <w:pStyle w:val="Normal"/>
               <w:widowControl/>
+              <w:suppressAutoHyphens w:val="true"/>
               <w:spacing w:before="0" w:after="0"/>
               <w:jc w:val="center"/>
               <w:cnfStyle w:val="100000000000" w:firstRow="1" w:lastRow="0" w:firstColumn="0" w:lastColumn="0" w:oddVBand="0" w:evenVBand="0" w:oddHBand="0" w:evenHBand="0" w:firstRowFirstColumn="0" w:firstRowLastColumn="0" w:lastRowFirstColumn="0" w:lastRowLastColumn="0"/>
@@ -2728,6 +2713,7 @@
             <w:pPr>
               <w:pStyle w:val="Normal"/>
               <w:widowControl/>
+              <w:suppressAutoHyphens w:val="true"/>
               <w:spacing w:before="0" w:after="0"/>
               <w:jc w:val="left"/>
               <w:rPr>
@@ -2761,6 +2747,7 @@
             <w:pPr>
               <w:pStyle w:val="Normal"/>
               <w:widowControl/>
+              <w:suppressAutoHyphens w:val="true"/>
               <w:spacing w:before="0" w:after="0"/>
               <w:jc w:val="left"/>
               <w:cnfStyle w:val="000000000000" w:firstRow="0" w:lastRow="0" w:firstColumn="0" w:lastColumn="0" w:oddVBand="0" w:evenVBand="0" w:oddHBand="0" w:evenHBand="0" w:firstRowFirstColumn="0" w:firstRowLastColumn="0" w:lastRowFirstColumn="0" w:lastRowLastColumn="0"/>
@@ -2817,6 +2804,7 @@
             <w:pPr>
               <w:pStyle w:val="Normal"/>
               <w:widowControl/>
+              <w:suppressAutoHyphens w:val="true"/>
               <w:spacing w:before="0" w:after="0"/>
               <w:jc w:val="left"/>
               <w:rPr>
@@ -2850,6 +2838,7 @@
             <w:pPr>
               <w:pStyle w:val="Normal"/>
               <w:widowControl/>
+              <w:suppressAutoHyphens w:val="true"/>
               <w:spacing w:before="0" w:after="0"/>
               <w:jc w:val="left"/>
               <w:cnfStyle w:val="000000000000" w:firstRow="0" w:lastRow="0" w:firstColumn="0" w:lastColumn="0" w:oddVBand="0" w:evenVBand="0" w:oddHBand="0" w:evenHBand="0" w:firstRowFirstColumn="0" w:firstRowLastColumn="0" w:lastRowFirstColumn="0" w:lastRowLastColumn="0"/>
@@ -2920,6 +2909,7 @@
             <w:pPr>
               <w:pStyle w:val="Normal"/>
               <w:widowControl/>
+              <w:suppressAutoHyphens w:val="true"/>
               <w:spacing w:before="0" w:after="0"/>
               <w:jc w:val="left"/>
               <w:rPr>
@@ -2953,6 +2943,7 @@
             <w:pPr>
               <w:pStyle w:val="Normal"/>
               <w:widowControl/>
+              <w:suppressAutoHyphens w:val="true"/>
               <w:spacing w:before="0" w:after="0"/>
               <w:jc w:val="left"/>
               <w:cnfStyle w:val="000000000000" w:firstRow="0" w:lastRow="0" w:firstColumn="0" w:lastColumn="0" w:oddVBand="0" w:evenVBand="0" w:oddHBand="0" w:evenHBand="0" w:firstRowFirstColumn="0" w:firstRowLastColumn="0" w:lastRowFirstColumn="0" w:lastRowLastColumn="0"/>
@@ -3021,6 +3012,7 @@
             <w:pPr>
               <w:pStyle w:val="Normal"/>
               <w:widowControl/>
+              <w:suppressAutoHyphens w:val="true"/>
               <w:spacing w:before="0" w:after="0"/>
               <w:jc w:val="left"/>
               <w:rPr>
@@ -3054,6 +3046,7 @@
             <w:pPr>
               <w:pStyle w:val="Normal"/>
               <w:widowControl/>
+              <w:suppressAutoHyphens w:val="true"/>
               <w:spacing w:before="0" w:after="0"/>
               <w:jc w:val="left"/>
               <w:cnfStyle w:val="000000000000" w:firstRow="0" w:lastRow="0" w:firstColumn="0" w:lastColumn="0" w:oddVBand="0" w:evenVBand="0" w:oddHBand="0" w:evenHBand="0" w:firstRowFirstColumn="0" w:firstRowLastColumn="0" w:lastRowFirstColumn="0" w:lastRowLastColumn="0"/>
@@ -3100,6 +3093,7 @@
             <w:pPr>
               <w:pStyle w:val="Normal"/>
               <w:widowControl/>
+              <w:suppressAutoHyphens w:val="true"/>
               <w:spacing w:before="0" w:after="0"/>
               <w:jc w:val="left"/>
               <w:rPr>
@@ -3133,6 +3127,7 @@
             <w:pPr>
               <w:pStyle w:val="Normal"/>
               <w:widowControl/>
+              <w:suppressAutoHyphens w:val="true"/>
               <w:spacing w:before="0" w:after="0"/>
               <w:jc w:val="left"/>
               <w:cnfStyle w:val="000000000000" w:firstRow="0" w:lastRow="0" w:firstColumn="0" w:lastColumn="0" w:oddVBand="0" w:evenVBand="0" w:oddHBand="0" w:evenHBand="0" w:firstRowFirstColumn="0" w:firstRowLastColumn="0" w:lastRowFirstColumn="0" w:lastRowLastColumn="0"/>
@@ -3179,6 +3174,7 @@
             <w:pPr>
               <w:pStyle w:val="Normal"/>
               <w:widowControl/>
+              <w:suppressAutoHyphens w:val="true"/>
               <w:spacing w:before="0" w:after="0"/>
               <w:jc w:val="left"/>
               <w:rPr>
@@ -3212,6 +3208,7 @@
             <w:pPr>
               <w:pStyle w:val="Normal"/>
               <w:widowControl/>
+              <w:suppressAutoHyphens w:val="true"/>
               <w:spacing w:before="0" w:after="0"/>
               <w:jc w:val="left"/>
               <w:cnfStyle w:val="000000000000" w:firstRow="0" w:lastRow="0" w:firstColumn="0" w:lastColumn="0" w:oddVBand="0" w:evenVBand="0" w:oddHBand="0" w:evenHBand="0" w:firstRowFirstColumn="0" w:firstRowLastColumn="0" w:lastRowFirstColumn="0" w:lastRowLastColumn="0"/>
@@ -3292,6 +3289,7 @@
     <w:p>
       <w:pPr>
         <w:pStyle w:val="Heading2"/>
+        <w:spacing w:before="0" w:after="0"/>
         <w:rPr>
           <w:rFonts w:ascii="Calibri" w:hAnsi="Calibri" w:cs="Calibri" w:asciiTheme="minorHAnsi" w:cstheme="minorHAnsi" w:hAnsiTheme="minorHAnsi"/>
           <w:sz w:val="20"/>
@@ -3336,7 +3334,7 @@
       </w:pPr>
       <w:r>
         <w:drawing>
-          <wp:anchor behindDoc="0" distT="0" distB="0" distL="114300" distR="114300" simplePos="0" locked="0" layoutInCell="0" allowOverlap="1" relativeHeight="139">
+          <wp:anchor behindDoc="0" distT="0" distB="0" distL="114300" distR="114300" simplePos="0" locked="0" layoutInCell="0" allowOverlap="1" relativeHeight="148">
             <wp:simplePos x="0" y="0"/>
             <wp:positionH relativeFrom="margin">
               <wp:posOffset>-175260</wp:posOffset>
@@ -3349,9 +3347,9 @@
             <wp:wrapTight wrapText="bothSides">
               <wp:wrapPolygon edited="0">
                 <wp:start x="-13" y="0"/>
-                <wp:lineTo x="-13" y="26522"/>
-                <wp:lineTo x="27099" y="26522"/>
-                <wp:lineTo x="27099" y="0"/>
+                <wp:lineTo x="-13" y="26480"/>
+                <wp:lineTo x="27071" y="26480"/>
+                <wp:lineTo x="27071" y="0"/>
                 <wp:lineTo x="-13" y="0"/>
               </wp:wrapPolygon>
             </wp:wrapTight>
@@ -3449,7 +3447,7 @@
           <w:szCs w:val="20"/>
         </w:rPr>
         <w:drawing>
-          <wp:anchor behindDoc="0" distT="0" distB="0" distL="114300" distR="114300" simplePos="0" locked="0" layoutInCell="0" allowOverlap="1" relativeHeight="140">
+          <wp:anchor behindDoc="0" distT="0" distB="0" distL="114300" distR="114300" simplePos="0" locked="0" layoutInCell="0" allowOverlap="1" relativeHeight="149">
             <wp:simplePos x="0" y="0"/>
             <wp:positionH relativeFrom="column">
               <wp:posOffset>-864235</wp:posOffset>
@@ -3460,7 +3458,7 @@
             <wp:extent cx="7099935" cy="6383655"/>
             <wp:effectExtent l="0" t="0" r="0" b="0"/>
             <wp:wrapTopAndBottom/>
-            <wp:docPr id="26" name="Imagen4" descr=""/>
+            <wp:docPr id="26" name="Imagen12" descr=""/>
             <wp:cNvGraphicFramePr>
               <a:graphicFrameLocks xmlns:a="http://schemas.openxmlformats.org/drawingml/2006/main" noChangeAspect="1"/>
             </wp:cNvGraphicFramePr>
@@ -3468,7 +3466,7 @@
               <a:graphicData uri="http://schemas.openxmlformats.org/drawingml/2006/picture">
                 <pic:pic xmlns:pic="http://schemas.openxmlformats.org/drawingml/2006/picture">
                   <pic:nvPicPr>
-                    <pic:cNvPr id="26" name="Imagen4" descr=""/>
+                    <pic:cNvPr id="26" name="Imagen12" descr=""/>
                     <pic:cNvPicPr>
                       <a:picLocks noChangeAspect="1" noChangeArrowheads="1"/>
                     </pic:cNvPicPr>
@@ -3580,7 +3578,7 @@
           <w:szCs w:val="20"/>
         </w:rPr>
         <w:drawing>
-          <wp:anchor behindDoc="0" distT="0" distB="0" distL="114300" distR="114300" simplePos="0" locked="0" layoutInCell="0" allowOverlap="1" relativeHeight="141">
+          <wp:anchor behindDoc="0" distT="0" distB="0" distL="114300" distR="114300" simplePos="0" locked="0" layoutInCell="0" allowOverlap="1" relativeHeight="150">
             <wp:simplePos x="0" y="0"/>
             <wp:positionH relativeFrom="column">
               <wp:posOffset>-368300</wp:posOffset>
@@ -3591,7 +3589,7 @@
             <wp:extent cx="6230620" cy="3014980"/>
             <wp:effectExtent l="0" t="0" r="0" b="0"/>
             <wp:wrapTopAndBottom/>
-            <wp:docPr id="27" name="Imagen5" descr=""/>
+            <wp:docPr id="27" name="Imagen13" descr=""/>
             <wp:cNvGraphicFramePr>
               <a:graphicFrameLocks xmlns:a="http://schemas.openxmlformats.org/drawingml/2006/main" noChangeAspect="1"/>
             </wp:cNvGraphicFramePr>
@@ -3599,7 +3597,7 @@
               <a:graphicData uri="http://schemas.openxmlformats.org/drawingml/2006/picture">
                 <pic:pic xmlns:pic="http://schemas.openxmlformats.org/drawingml/2006/picture">
                   <pic:nvPicPr>
-                    <pic:cNvPr id="27" name="Imagen5" descr=""/>
+                    <pic:cNvPr id="27" name="Imagen13" descr=""/>
                     <pic:cNvPicPr>
                       <a:picLocks noChangeAspect="1" noChangeArrowheads="1"/>
                     </pic:cNvPicPr>
@@ -3625,20 +3623,6 @@
             </a:graphic>
           </wp:anchor>
         </w:drawing>
-      </w:r>
-    </w:p>
-    <w:p>
-      <w:pPr>
-        <w:pStyle w:val="Normal"/>
-        <w:rPr>
-          <w:b/>
-          <w:bCs/>
-          <w:sz w:val="20"/>
-          <w:szCs w:val="20"/>
-        </w:rPr>
-      </w:pPr>
-      <w:r>
-        <w:rPr/>
       </w:r>
     </w:p>
     <w:p>
@@ -3698,6 +3682,7 @@
             <w:pPr>
               <w:pStyle w:val="Normal"/>
               <w:widowControl/>
+              <w:suppressAutoHyphens w:val="true"/>
               <w:spacing w:before="0" w:after="0"/>
               <w:jc w:val="center"/>
               <w:rPr>
@@ -3731,6 +3716,7 @@
             <w:pPr>
               <w:pStyle w:val="Normal"/>
               <w:widowControl/>
+              <w:suppressAutoHyphens w:val="true"/>
               <w:spacing w:before="0" w:after="0"/>
               <w:jc w:val="center"/>
               <w:cnfStyle w:val="100000000000" w:firstRow="1" w:lastRow="0" w:firstColumn="0" w:lastColumn="0" w:oddVBand="0" w:evenVBand="0" w:oddHBand="0" w:evenHBand="0" w:firstRowFirstColumn="0" w:firstRowLastColumn="0" w:lastRowFirstColumn="0" w:lastRowLastColumn="0"/>
@@ -3769,6 +3755,7 @@
             <w:pPr>
               <w:pStyle w:val="Normal"/>
               <w:widowControl/>
+              <w:suppressAutoHyphens w:val="true"/>
               <w:spacing w:before="0" w:after="0"/>
               <w:jc w:val="left"/>
               <w:rPr>
@@ -3814,6 +3801,7 @@
             <w:pPr>
               <w:pStyle w:val="Normal"/>
               <w:widowControl/>
+              <w:suppressAutoHyphens w:val="true"/>
               <w:spacing w:before="0" w:after="0"/>
               <w:jc w:val="left"/>
               <w:cnfStyle w:val="000000000000" w:firstRow="0" w:lastRow="0" w:firstColumn="0" w:lastColumn="0" w:oddVBand="0" w:evenVBand="0" w:oddHBand="0" w:evenHBand="0" w:firstRowFirstColumn="0" w:firstRowLastColumn="0" w:lastRowFirstColumn="0" w:lastRowLastColumn="0"/>
@@ -3872,6 +3860,7 @@
             <w:pPr>
               <w:pStyle w:val="Normal"/>
               <w:widowControl/>
+              <w:suppressAutoHyphens w:val="true"/>
               <w:spacing w:before="0" w:after="0"/>
               <w:jc w:val="left"/>
               <w:rPr>
@@ -3905,6 +3894,7 @@
             <w:pPr>
               <w:pStyle w:val="Normal"/>
               <w:widowControl/>
+              <w:suppressAutoHyphens w:val="true"/>
               <w:spacing w:before="0" w:after="0"/>
               <w:jc w:val="left"/>
               <w:cnfStyle w:val="000000000000" w:firstRow="0" w:lastRow="0" w:firstColumn="0" w:lastColumn="0" w:oddVBand="0" w:evenVBand="0" w:oddHBand="0" w:evenHBand="0" w:firstRowFirstColumn="0" w:firstRowLastColumn="0" w:lastRowFirstColumn="0" w:lastRowLastColumn="0"/>
@@ -3965,6 +3955,7 @@
             <w:pPr>
               <w:pStyle w:val="Normal"/>
               <w:widowControl/>
+              <w:suppressAutoHyphens w:val="true"/>
               <w:spacing w:before="0" w:after="0"/>
               <w:jc w:val="left"/>
               <w:rPr>
@@ -4010,6 +4001,7 @@
             <w:pPr>
               <w:pStyle w:val="Normal"/>
               <w:widowControl/>
+              <w:suppressAutoHyphens w:val="true"/>
               <w:spacing w:before="0" w:after="0"/>
               <w:jc w:val="left"/>
               <w:cnfStyle w:val="000000000000" w:firstRow="0" w:lastRow="0" w:firstColumn="0" w:lastColumn="0" w:oddVBand="0" w:evenVBand="0" w:oddHBand="0" w:evenHBand="0" w:firstRowFirstColumn="0" w:firstRowLastColumn="0" w:lastRowFirstColumn="0" w:lastRowLastColumn="0"/>
@@ -4068,6 +4060,7 @@
             <w:pPr>
               <w:pStyle w:val="Normal"/>
               <w:widowControl/>
+              <w:suppressAutoHyphens w:val="true"/>
               <w:spacing w:before="0" w:after="0"/>
               <w:jc w:val="left"/>
               <w:rPr>
@@ -4127,6 +4120,7 @@
             <w:pPr>
               <w:pStyle w:val="Normal"/>
               <w:widowControl/>
+              <w:suppressAutoHyphens w:val="true"/>
               <w:spacing w:before="0" w:after="0"/>
               <w:jc w:val="left"/>
               <w:cnfStyle w:val="000000000000" w:firstRow="0" w:lastRow="0" w:firstColumn="0" w:lastColumn="0" w:oddVBand="0" w:evenVBand="0" w:oddHBand="0" w:evenHBand="0" w:firstRowFirstColumn="0" w:firstRowLastColumn="0" w:lastRowFirstColumn="0" w:lastRowLastColumn="0"/>
@@ -4185,6 +4179,7 @@
             <w:pPr>
               <w:pStyle w:val="Normal"/>
               <w:widowControl/>
+              <w:suppressAutoHyphens w:val="true"/>
               <w:spacing w:before="0" w:after="0"/>
               <w:jc w:val="left"/>
               <w:rPr>
@@ -4218,6 +4213,7 @@
             <w:pPr>
               <w:pStyle w:val="Normal"/>
               <w:widowControl/>
+              <w:suppressAutoHyphens w:val="true"/>
               <w:spacing w:before="0" w:after="0"/>
               <w:jc w:val="left"/>
               <w:cnfStyle w:val="000000000000" w:firstRow="0" w:lastRow="0" w:firstColumn="0" w:lastColumn="0" w:oddVBand="0" w:evenVBand="0" w:oddHBand="0" w:evenHBand="0" w:firstRowFirstColumn="0" w:firstRowLastColumn="0" w:lastRowFirstColumn="0" w:lastRowLastColumn="0"/>
@@ -4370,7 +4366,7 @@
       </w:r>
       <w:r>
         <w:drawing>
-          <wp:anchor behindDoc="0" distT="0" distB="0" distL="114300" distR="114300" simplePos="0" locked="0" layoutInCell="0" allowOverlap="1" relativeHeight="145">
+          <wp:anchor behindDoc="0" distT="0" distB="0" distL="114300" distR="114300" simplePos="0" locked="0" layoutInCell="0" allowOverlap="1" relativeHeight="154">
             <wp:simplePos x="0" y="0"/>
             <wp:positionH relativeFrom="column">
               <wp:posOffset>146685</wp:posOffset>
@@ -4381,7 +4377,7 @@
             <wp:extent cx="4756150" cy="1989455"/>
             <wp:effectExtent l="0" t="0" r="0" b="0"/>
             <wp:wrapTopAndBottom/>
-            <wp:docPr id="28" name="Imagen7" descr=""/>
+            <wp:docPr id="28" name="Imagen14" descr=""/>
             <wp:cNvGraphicFramePr>
               <a:graphicFrameLocks xmlns:a="http://schemas.openxmlformats.org/drawingml/2006/main" noChangeAspect="1"/>
             </wp:cNvGraphicFramePr>
@@ -4389,7 +4385,7 @@
               <a:graphicData uri="http://schemas.openxmlformats.org/drawingml/2006/picture">
                 <pic:pic xmlns:pic="http://schemas.openxmlformats.org/drawingml/2006/picture">
                   <pic:nvPicPr>
-                    <pic:cNvPr id="28" name="Imagen7" descr=""/>
+                    <pic:cNvPr id="28" name="Imagen14" descr=""/>
                     <pic:cNvPicPr>
                       <a:picLocks noChangeAspect="1" noChangeArrowheads="1"/>
                     </pic:cNvPicPr>
@@ -4438,7 +4434,7 @@
           <w:szCs w:val="20"/>
         </w:rPr>
         <w:drawing>
-          <wp:anchor behindDoc="0" distT="0" distB="0" distL="114300" distR="114300" simplePos="0" locked="0" layoutInCell="0" allowOverlap="1" relativeHeight="142">
+          <wp:anchor behindDoc="0" distT="0" distB="0" distL="114300" distR="114300" simplePos="0" locked="0" layoutInCell="0" allowOverlap="1" relativeHeight="151">
             <wp:simplePos x="0" y="0"/>
             <wp:positionH relativeFrom="column">
               <wp:posOffset>-497840</wp:posOffset>
@@ -4496,7 +4492,7 @@
       </w:pPr>
       <w:r>
         <w:drawing>
-          <wp:anchor behindDoc="0" distT="0" distB="0" distL="114300" distR="114300" simplePos="0" locked="0" layoutInCell="0" allowOverlap="1" relativeHeight="143">
+          <wp:anchor behindDoc="0" distT="0" distB="0" distL="114300" distR="114300" simplePos="0" locked="0" layoutInCell="0" allowOverlap="1" relativeHeight="152">
             <wp:simplePos x="0" y="0"/>
             <wp:positionH relativeFrom="page">
               <wp:posOffset>419100</wp:posOffset>
@@ -4507,7 +4503,7 @@
             <wp:extent cx="6743700" cy="808990"/>
             <wp:effectExtent l="0" t="0" r="0" b="0"/>
             <wp:wrapTopAndBottom/>
-            <wp:docPr id="30" name="Imagen12" descr=""/>
+            <wp:docPr id="30" name="Imagen16" descr=""/>
             <wp:cNvGraphicFramePr>
               <a:graphicFrameLocks xmlns:a="http://schemas.openxmlformats.org/drawingml/2006/main" noChangeAspect="1"/>
             </wp:cNvGraphicFramePr>
@@ -4515,7 +4511,7 @@
               <a:graphicData uri="http://schemas.openxmlformats.org/drawingml/2006/picture">
                 <pic:pic xmlns:pic="http://schemas.openxmlformats.org/drawingml/2006/picture">
                   <pic:nvPicPr>
-                    <pic:cNvPr id="30" name="Imagen12" descr=""/>
+                    <pic:cNvPr id="30" name="Imagen16" descr=""/>
                     <pic:cNvPicPr>
                       <a:picLocks noChangeAspect="1" noChangeArrowheads="1"/>
                     </pic:cNvPicPr>
@@ -4583,7 +4579,7 @@
       </w:pPr>
       <w:r>
         <w:drawing>
-          <wp:anchor behindDoc="0" distT="0" distB="0" distL="114300" distR="0" simplePos="0" locked="0" layoutInCell="0" allowOverlap="1" relativeHeight="144">
+          <wp:anchor behindDoc="0" distT="0" distB="0" distL="114300" distR="0" simplePos="0" locked="0" layoutInCell="0" allowOverlap="1" relativeHeight="153">
             <wp:simplePos x="0" y="0"/>
             <wp:positionH relativeFrom="margin">
               <wp:align>right</wp:align>
@@ -4594,7 +4590,7 @@
             <wp:extent cx="5396230" cy="1811020"/>
             <wp:effectExtent l="0" t="0" r="0" b="0"/>
             <wp:wrapTopAndBottom/>
-            <wp:docPr id="31" name="Imagen13" descr=""/>
+            <wp:docPr id="31" name="Imagen17" descr=""/>
             <wp:cNvGraphicFramePr>
               <a:graphicFrameLocks xmlns:a="http://schemas.openxmlformats.org/drawingml/2006/main" noChangeAspect="1"/>
             </wp:cNvGraphicFramePr>
@@ -4602,7 +4598,7 @@
               <a:graphicData uri="http://schemas.openxmlformats.org/drawingml/2006/picture">
                 <pic:pic xmlns:pic="http://schemas.openxmlformats.org/drawingml/2006/picture">
                   <pic:nvPicPr>
-                    <pic:cNvPr id="31" name="Imagen13" descr=""/>
+                    <pic:cNvPr id="31" name="Imagen17" descr=""/>
                     <pic:cNvPicPr>
                       <a:picLocks noChangeAspect="1" noChangeArrowheads="1"/>
                     </pic:cNvPicPr>
@@ -4710,40 +4706,58 @@
         </w:numPr>
         <w:jc w:val="both"/>
         <w:rPr>
+          <w:highlight w:val="none"/>
+          <w:shd w:fill="auto" w:val="clear"/>
+        </w:rPr>
+      </w:pPr>
+      <w:r>
+        <w:rPr>
           <w:b/>
           <w:bCs/>
-          <w:highlight w:val="none"/>
-          <w:shd w:fill="FFFF00" w:val="clear"/>
-        </w:rPr>
-      </w:pPr>
-      <w:r>
-        <w:rPr>
-          <w:b/>
-          <w:bCs/>
-          <w:sz w:val="20"/>
-          <w:szCs w:val="20"/>
-          <w:shd w:fill="FFFF00" w:val="clear"/>
+          <w:sz w:val="20"/>
+          <w:szCs w:val="20"/>
+          <w:shd w:fill="auto" w:val="clear"/>
         </w:rPr>
         <w:t>Prompt principal:</w:t>
       </w:r>
     </w:p>
     <w:p>
       <w:pPr>
-        <w:pStyle w:val="ListParagraph"/>
-        <w:ind w:left="360"/>
+        <w:pStyle w:val="Normal"/>
         <w:jc w:val="both"/>
         <w:rPr>
           <w:sz w:val="20"/>
           <w:szCs w:val="20"/>
-          <w:highlight w:val="none"/>
-          <w:shd w:fill="FFFF00" w:val="clear"/>
-        </w:rPr>
-      </w:pPr>
-      <w:r>
-        <w:rPr>
-          <w:sz w:val="20"/>
-          <w:szCs w:val="20"/>
-          <w:shd w:fill="FFFF00" w:val="clear"/>
+        </w:rPr>
+      </w:pPr>
+      <w:r>
+        <w:rPr>
+          <w:sz w:val="20"/>
+          <w:szCs w:val="20"/>
+        </w:rPr>
+        <w:t>“</w:t>
+      </w:r>
+      <w:r>
+        <w:rPr>
+          <w:sz w:val="20"/>
+          <w:szCs w:val="20"/>
+        </w:rPr>
+        <w:t>Analiza el Escenario 01 del archivo .md proporcionado, identifica el problema estructural y propón una solución aplicando el patrón de diseño Composite, representada mediante un diagrama UML e implementada en Python”.</w:t>
+      </w:r>
+    </w:p>
+    <w:p>
+      <w:pPr>
+        <w:pStyle w:val="Normal"/>
+        <w:jc w:val="both"/>
+        <w:rPr>
+          <w:sz w:val="20"/>
+          <w:szCs w:val="20"/>
+        </w:rPr>
+      </w:pPr>
+      <w:r>
+        <w:rPr>
+          <w:sz w:val="20"/>
+          <w:szCs w:val="20"/>
         </w:rPr>
       </w:r>
     </w:p>
@@ -4756,10 +4770,69 @@
         </w:numPr>
         <w:jc w:val="both"/>
         <w:rPr>
+          <w:highlight w:val="none"/>
+          <w:shd w:fill="auto" w:val="clear"/>
+        </w:rPr>
+      </w:pPr>
+      <w:r>
+        <w:rPr>
           <w:b/>
           <w:bCs/>
-          <w:highlight w:val="none"/>
-          <w:shd w:fill="FFFF00" w:val="clear"/>
+          <w:sz w:val="20"/>
+          <w:szCs w:val="20"/>
+          <w:shd w:fill="auto" w:val="clear"/>
+        </w:rPr>
+        <w:t>Recomendación aceptada:</w:t>
+      </w:r>
+    </w:p>
+    <w:p>
+      <w:pPr>
+        <w:pStyle w:val="Normal"/>
+        <w:jc w:val="both"/>
+        <w:rPr>
+          <w:sz w:val="20"/>
+          <w:szCs w:val="20"/>
+        </w:rPr>
+      </w:pPr>
+      <w:r>
+        <w:rPr>
+          <w:sz w:val="20"/>
+          <w:szCs w:val="20"/>
+        </w:rPr>
+        <w:t>I</w:t>
+      </w:r>
+      <w:r>
+        <w:rPr>
+          <w:sz w:val="20"/>
+          <w:szCs w:val="20"/>
+        </w:rPr>
+        <w:t>mplementar la variante "segura" de Composite: declarar agregar() y eliminar() solo en GrupoPresupuestario y no en la abstracción común ElementoPresupuestario.</w:t>
+      </w:r>
+    </w:p>
+    <w:p>
+      <w:pPr>
+        <w:pStyle w:val="Normal"/>
+        <w:jc w:val="both"/>
+        <w:rPr>
+          <w:sz w:val="20"/>
+          <w:szCs w:val="20"/>
+        </w:rPr>
+      </w:pPr>
+      <w:r>
+        <w:rPr>
+          <w:sz w:val="20"/>
+          <w:szCs w:val="20"/>
+        </w:rPr>
+        <w:t xml:space="preserve"> </w:t>
+      </w:r>
+    </w:p>
+    <w:p>
+      <w:pPr>
+        <w:pStyle w:val="Normal"/>
+        <w:jc w:val="both"/>
+        <w:rPr>
+          <w:sz w:val="20"/>
+          <w:szCs w:val="20"/>
         </w:rPr>
       </w:pPr>
       <w:r>
@@ -4768,28 +4841,44 @@
           <w:bCs/>
           <w:sz w:val="20"/>
           <w:szCs w:val="20"/>
-          <w:shd w:fill="FFFF00" w:val="clear"/>
-        </w:rPr>
-        <w:t>Recomendación aceptada:</w:t>
-      </w:r>
-    </w:p>
-    <w:p>
-      <w:pPr>
-        <w:pStyle w:val="ListParagraph"/>
-        <w:numPr>
-          <w:ilvl w:val="0"/>
-          <w:numId w:val="0"/>
-        </w:numPr>
-        <w:ind w:hanging="0" w:left="360"/>
+        </w:rPr>
+        <w:t>Justificación de la aceptación:</w:t>
+      </w:r>
+      <w:r>
+        <w:rPr>
+          <w:sz w:val="20"/>
+          <w:szCs w:val="20"/>
+        </w:rPr>
+        <w:t xml:space="preserve"> </w:t>
+      </w:r>
+      <w:r>
+        <w:rPr>
+          <w:sz w:val="20"/>
+          <w:szCs w:val="20"/>
+        </w:rPr>
+        <w:t>e</w:t>
+      </w:r>
+      <w:r>
+        <w:rPr>
+          <w:sz w:val="20"/>
+          <w:szCs w:val="20"/>
+        </w:rPr>
+        <w:t>n la variante "transparente", PartidaPresupuestaria heredaría un método agregar() que no tiene sentido para ella y que solo podría lanzar una excepción en tiempo de ejecución. Con la variante segura, el modelo refleja el dominio (una partida no contiene elementos) y el error se evita por diseño. Se verificó que el costo de esta decisión es aceptable: solo quien construye el árbol necesita conocer GrupoPresupuestario, mientras que las consultas que exige el escenario (código, descripción, valor total y estructura) siguen siendo totalmente uniformes a través de ElementoPresupuestario.</w:t>
+      </w:r>
+    </w:p>
+    <w:p>
+      <w:pPr>
+        <w:pStyle w:val="Normal"/>
         <w:jc w:val="both"/>
         <w:rPr>
-          <w:highlight w:val="none"/>
-          <w:shd w:fill="FFFF00" w:val="clear"/>
-        </w:rPr>
-      </w:pPr>
-      <w:r>
-        <w:rPr>
-          <w:shd w:fill="FFFF00" w:val="clear"/>
+          <w:sz w:val="20"/>
+          <w:szCs w:val="20"/>
+        </w:rPr>
+      </w:pPr>
+      <w:r>
+        <w:rPr>
+          <w:sz w:val="20"/>
+          <w:szCs w:val="20"/>
         </w:rPr>
       </w:r>
     </w:p>
@@ -4803,7 +4892,7 @@
         <w:jc w:val="both"/>
         <w:rPr>
           <w:highlight w:val="none"/>
-          <w:shd w:fill="FFFF00" w:val="clear"/>
+          <w:shd w:fill="auto" w:val="clear"/>
         </w:rPr>
       </w:pPr>
       <w:r>
@@ -4812,7 +4901,7 @@
           <w:bCs/>
           <w:sz w:val="20"/>
           <w:szCs w:val="20"/>
-          <w:shd w:fill="FFFF00" w:val="clear"/>
+          <w:shd w:fill="auto" w:val="clear"/>
         </w:rPr>
         <w:t>Recomendación modificada o rechazada:</w:t>
       </w:r>
@@ -4846,16 +4935,174 @@
           <w:sz w:val="20"/>
           <w:szCs w:val="20"/>
           <w:highlight w:val="none"/>
-          <w:shd w:fill="FFFF00" w:val="clear"/>
+          <w:shd w:fill="auto" w:val="clear"/>
         </w:rPr>
       </w:pPr>
       <w:r>
         <w:rPr>
           <w:rFonts w:cs="Calibri" w:cstheme="minorHAnsi"/>
-          <w:sz w:val="20"/>
-          <w:szCs w:val="20"/>
-          <w:shd w:fill="FFFF00" w:val="clear"/>
-        </w:rPr>
+          <w:b/>
+          <w:bCs/>
+          <w:sz w:val="20"/>
+          <w:szCs w:val="20"/>
+          <w:shd w:fill="auto" w:val="clear"/>
+        </w:rPr>
+        <w:t>Recomendación de la IA:</w:t>
+      </w:r>
+      <w:r>
+        <w:rPr>
+          <w:rFonts w:cs="Calibri" w:cstheme="minorHAnsi"/>
+          <w:sz w:val="20"/>
+          <w:szCs w:val="20"/>
+          <w:shd w:fill="auto" w:val="clear"/>
+        </w:rPr>
+        <w:t xml:space="preserve"> al agregar un elemento en la interfaz gráfica, la selección del árbol debía tener prioridad sobre el prefijo del código; la ubicación por prefijo (PR-01 → grupo PR) solo se aplicaba si no había nada seleccionado.</w:t>
+      </w:r>
+    </w:p>
+    <w:p>
+      <w:pPr>
+        <w:pStyle w:val="Normal"/>
+        <w:jc w:val="both"/>
+        <w:rPr>
+          <w:rFonts w:cs="Calibri" w:cstheme="minorHAnsi"/>
+          <w:sz w:val="20"/>
+          <w:szCs w:val="20"/>
+          <w:highlight w:val="none"/>
+          <w:shd w:fill="auto" w:val="clear"/>
+        </w:rPr>
+      </w:pPr>
+      <w:r>
+        <w:rPr>
+          <w:rFonts w:cs="Calibri" w:cstheme="minorHAnsi"/>
+          <w:sz w:val="20"/>
+          <w:szCs w:val="20"/>
+          <w:shd w:fill="auto" w:val="clear"/>
+        </w:rPr>
+        <w:t xml:space="preserve"> </w:t>
+      </w:r>
+    </w:p>
+    <w:p>
+      <w:pPr>
+        <w:pStyle w:val="Normal"/>
+        <w:jc w:val="both"/>
+        <w:rPr>
+          <w:rFonts w:cs="Calibri" w:cstheme="minorHAnsi"/>
+          <w:sz w:val="20"/>
+          <w:szCs w:val="20"/>
+          <w:highlight w:val="none"/>
+          <w:shd w:fill="auto" w:val="clear"/>
+        </w:rPr>
+      </w:pPr>
+      <w:r>
+        <w:rPr>
+          <w:rFonts w:cs="Calibri" w:cstheme="minorHAnsi"/>
+          <w:b/>
+          <w:bCs/>
+          <w:sz w:val="20"/>
+          <w:szCs w:val="20"/>
+          <w:shd w:fill="auto" w:val="clear"/>
+        </w:rPr>
+        <w:t>Decisión:</w:t>
+      </w:r>
+      <w:r>
+        <w:rPr>
+          <w:rFonts w:cs="Calibri" w:cstheme="minorHAnsi"/>
+          <w:sz w:val="20"/>
+          <w:szCs w:val="20"/>
+          <w:shd w:fill="auto" w:val="clear"/>
+        </w:rPr>
+        <w:t xml:space="preserve"> </w:t>
+      </w:r>
+      <w:r>
+        <w:rPr>
+          <w:rFonts w:cs="Calibri" w:cstheme="minorHAnsi"/>
+          <w:sz w:val="20"/>
+          <w:szCs w:val="20"/>
+          <w:shd w:fill="auto" w:val="clear"/>
+        </w:rPr>
+        <w:t>R</w:t>
+      </w:r>
+      <w:r>
+        <w:rPr>
+          <w:rFonts w:cs="Calibri" w:cstheme="minorHAnsi"/>
+          <w:sz w:val="20"/>
+          <w:szCs w:val="20"/>
+          <w:shd w:fill="auto" w:val="clear"/>
+        </w:rPr>
+        <w:t xml:space="preserve">echazada y reemplazada, </w:t>
+      </w:r>
+      <w:r>
+        <w:rPr>
+          <w:rFonts w:cs="Calibri" w:cstheme="minorHAnsi"/>
+          <w:sz w:val="20"/>
+          <w:szCs w:val="20"/>
+          <w:shd w:fill="auto" w:val="clear"/>
+        </w:rPr>
+        <w:t>a</w:t>
+      </w:r>
+      <w:r>
+        <w:rPr>
+          <w:rFonts w:cs="Calibri" w:cstheme="minorHAnsi"/>
+          <w:sz w:val="20"/>
+          <w:szCs w:val="20"/>
+          <w:shd w:fill="auto" w:val="clear"/>
+        </w:rPr>
+        <w:t>l probar la aplicación, el grupo detectó un comportamiento incorrecto: después de crear el grupo PR la interfaz dejaba seleccionada la raíz, y la partida PR-01 terminaba fuera de PR. Se reprodujo el caso y se invirtió la regla: si el prefijo del código existe como grupo, ese grupo tiene prioridad; la selección solo se usa cuando el prefijo no existe. Además se agregó que, al crear un grupo, se reubiquen automáticamente los elementos existentes con su prefijo y que una partida con el mismo código que el grupo pase a ser su primera subpartida numerada (PR -&gt; PR-01).</w:t>
+      </w:r>
+    </w:p>
+    <w:p>
+      <w:pPr>
+        <w:pStyle w:val="Normal"/>
+        <w:jc w:val="both"/>
+        <w:rPr>
+          <w:rFonts w:cs="Calibri" w:cstheme="minorHAnsi"/>
+          <w:sz w:val="20"/>
+          <w:szCs w:val="20"/>
+          <w:highlight w:val="none"/>
+          <w:shd w:fill="auto" w:val="clear"/>
+        </w:rPr>
+      </w:pPr>
+      <w:r>
+        <w:rPr>
+          <w:rFonts w:cs="Calibri" w:cstheme="minorHAnsi"/>
+          <w:sz w:val="20"/>
+          <w:szCs w:val="20"/>
+          <w:shd w:fill="auto" w:val="clear"/>
+        </w:rPr>
+        <w:t xml:space="preserve"> </w:t>
+      </w:r>
+    </w:p>
+    <w:p>
+      <w:pPr>
+        <w:pStyle w:val="Normal"/>
+        <w:jc w:val="both"/>
+        <w:rPr>
+          <w:rFonts w:cs="Calibri" w:cstheme="minorHAnsi"/>
+          <w:sz w:val="20"/>
+          <w:szCs w:val="20"/>
+          <w:highlight w:val="none"/>
+          <w:shd w:fill="auto" w:val="clear"/>
+        </w:rPr>
+      </w:pPr>
+      <w:r>
+        <w:rPr>
+          <w:rFonts w:cs="Calibri" w:cstheme="minorHAnsi"/>
+          <w:b/>
+          <w:bCs/>
+          <w:sz w:val="20"/>
+          <w:szCs w:val="20"/>
+          <w:shd w:fill="auto" w:val="clear"/>
+        </w:rPr>
+        <w:t>Justificación:</w:t>
+      </w:r>
+      <w:r>
+        <w:rPr>
+          <w:rFonts w:cs="Calibri" w:cstheme="minorHAnsi"/>
+          <w:sz w:val="20"/>
+          <w:szCs w:val="20"/>
+          <w:shd w:fill="auto" w:val="clear"/>
+        </w:rPr>
+        <w:t xml:space="preserve"> la recomendación original era técnicamente coherente, pero producía un resultado contrario a la convención de codificación de la institución, que es la que el usuario espera. La IA no tenía forma de conocer esa expectativa: el error solo se descubrió probando la aplicación con casos reales, lo que confirma que las propuestas de la IA deben validarse y no aceptarse de forma automática.</w:t>
       </w:r>
     </w:p>
     <w:p>
@@ -5083,8 +5330,8 @@
         <w:tblLook w:val="04a0" w:noHBand="0" w:noVBand="1" w:firstColumn="1" w:lastRow="0" w:lastColumn="0" w:firstRow="1"/>
       </w:tblPr>
       <w:tblGrid>
-        <w:gridCol w:w="1559"/>
-        <w:gridCol w:w="3686"/>
+        <w:gridCol w:w="1558"/>
+        <w:gridCol w:w="3687"/>
         <w:gridCol w:w="4962"/>
       </w:tblGrid>
       <w:tr>
@@ -5094,7 +5341,7 @@
         </w:trPr>
         <w:tc>
           <w:tcPr>
-            <w:tcW w:w="1559" w:type="dxa"/>
+            <w:tcW w:w="1558" w:type="dxa"/>
             <w:cnfStyle w:val="001000000000" w:firstRow="0" w:lastRow="0" w:firstColumn="1" w:lastColumn="0" w:oddVBand="0" w:evenVBand="0" w:oddHBand="0" w:evenHBand="0" w:firstRowFirstColumn="0" w:firstRowLastColumn="0" w:lastRowFirstColumn="0" w:lastRowLastColumn="0"/>
             <w:tcBorders>
               <w:bottom w:val="single" w:sz="12" w:space="0" w:color="666666"/>
@@ -5105,6 +5352,7 @@
             <w:pPr>
               <w:pStyle w:val="Normal"/>
               <w:widowControl/>
+              <w:suppressAutoHyphens w:val="true"/>
               <w:spacing w:before="0" w:after="0"/>
               <w:jc w:val="center"/>
               <w:rPr>
@@ -5128,7 +5376,7 @@
         </w:tc>
         <w:tc>
           <w:tcPr>
-            <w:tcW w:w="3686" w:type="dxa"/>
+            <w:tcW w:w="3687" w:type="dxa"/>
             <w:tcBorders>
               <w:bottom w:val="single" w:sz="12" w:space="0" w:color="666666"/>
             </w:tcBorders>
@@ -5138,6 +5386,7 @@
             <w:pPr>
               <w:pStyle w:val="Normal"/>
               <w:widowControl/>
+              <w:suppressAutoHyphens w:val="true"/>
               <w:spacing w:before="0" w:after="0"/>
               <w:jc w:val="center"/>
               <w:cnfStyle w:val="100000000000" w:firstRow="1" w:lastRow="0" w:firstColumn="0" w:lastColumn="0" w:oddVBand="0" w:evenVBand="0" w:oddHBand="0" w:evenHBand="0" w:firstRowFirstColumn="0" w:firstRowLastColumn="0" w:lastRowFirstColumn="0" w:lastRowLastColumn="0"/>
@@ -5172,6 +5421,7 @@
             <w:pPr>
               <w:pStyle w:val="Normal"/>
               <w:widowControl/>
+              <w:suppressAutoHyphens w:val="true"/>
               <w:spacing w:before="0" w:after="0"/>
               <w:jc w:val="center"/>
               <w:cnfStyle w:val="100000000000" w:firstRow="1" w:lastRow="0" w:firstColumn="0" w:lastColumn="0" w:oddVBand="0" w:evenVBand="0" w:oddHBand="0" w:evenHBand="0" w:firstRowFirstColumn="0" w:firstRowLastColumn="0" w:lastRowFirstColumn="0" w:lastRowLastColumn="0"/>
@@ -5201,7 +5451,7 @@
         </w:trPr>
         <w:tc>
           <w:tcPr>
-            <w:tcW w:w="1559" w:type="dxa"/>
+            <w:tcW w:w="1558" w:type="dxa"/>
             <w:cnfStyle w:val="001000000000" w:firstRow="0" w:lastRow="0" w:firstColumn="1" w:lastColumn="0" w:oddVBand="0" w:evenVBand="0" w:oddHBand="0" w:evenHBand="0" w:firstRowFirstColumn="0" w:firstRowLastColumn="0" w:lastRowFirstColumn="0" w:lastRowLastColumn="0"/>
             <w:tcBorders/>
             <w:vAlign w:val="center"/>
@@ -5210,6 +5460,7 @@
             <w:pPr>
               <w:pStyle w:val="Normal"/>
               <w:widowControl/>
+              <w:suppressAutoHyphens w:val="true"/>
               <w:spacing w:before="0" w:after="0"/>
               <w:jc w:val="center"/>
               <w:rPr>
@@ -5235,7 +5486,7 @@
         </w:tc>
         <w:tc>
           <w:tcPr>
-            <w:tcW w:w="3686" w:type="dxa"/>
+            <w:tcW w:w="3687" w:type="dxa"/>
             <w:tcBorders/>
             <w:vAlign w:val="center"/>
           </w:tcPr>
@@ -5243,6 +5494,7 @@
             <w:pPr>
               <w:pStyle w:val="Normal"/>
               <w:widowControl/>
+              <w:suppressAutoHyphens w:val="true"/>
               <w:spacing w:before="0" w:after="0"/>
               <w:jc w:val="center"/>
               <w:cnfStyle w:val="000000000000" w:firstRow="0" w:lastRow="0" w:firstColumn="0" w:lastColumn="0" w:oddVBand="0" w:evenVBand="0" w:oddHBand="0" w:evenHBand="0" w:firstRowFirstColumn="0" w:firstRowLastColumn="0" w:lastRowFirstColumn="0" w:lastRowLastColumn="0"/>
@@ -5273,6 +5525,7 @@
             <w:pPr>
               <w:pStyle w:val="Normal"/>
               <w:widowControl/>
+              <w:suppressAutoHyphens w:val="true"/>
               <w:spacing w:before="0" w:after="0"/>
               <w:jc w:val="center"/>
               <w:cnfStyle w:val="000000000000" w:firstRow="0" w:lastRow="0" w:firstColumn="0" w:lastColumn="0" w:oddVBand="0" w:evenVBand="0" w:oddHBand="0" w:evenHBand="0" w:firstRowFirstColumn="0" w:firstRowLastColumn="0" w:lastRowFirstColumn="0" w:lastRowLastColumn="0"/>
@@ -5301,7 +5554,7 @@
         </w:trPr>
         <w:tc>
           <w:tcPr>
-            <w:tcW w:w="1559" w:type="dxa"/>
+            <w:tcW w:w="1558" w:type="dxa"/>
             <w:cnfStyle w:val="001000000000" w:firstRow="0" w:lastRow="0" w:firstColumn="1" w:lastColumn="0" w:oddVBand="0" w:evenVBand="0" w:oddHBand="0" w:evenHBand="0" w:firstRowFirstColumn="0" w:firstRowLastColumn="0" w:lastRowFirstColumn="0" w:lastRowLastColumn="0"/>
             <w:tcBorders/>
             <w:vAlign w:val="center"/>
@@ -5310,6 +5563,7 @@
             <w:pPr>
               <w:pStyle w:val="Normal"/>
               <w:widowControl/>
+              <w:suppressAutoHyphens w:val="true"/>
               <w:spacing w:before="0" w:after="0"/>
               <w:jc w:val="center"/>
               <w:rPr>
@@ -5335,7 +5589,7 @@
         </w:tc>
         <w:tc>
           <w:tcPr>
-            <w:tcW w:w="3686" w:type="dxa"/>
+            <w:tcW w:w="3687" w:type="dxa"/>
             <w:tcBorders/>
             <w:vAlign w:val="center"/>
           </w:tcPr>
@@ -5343,6 +5597,7 @@
             <w:pPr>
               <w:pStyle w:val="Normal"/>
               <w:widowControl/>
+              <w:suppressAutoHyphens w:val="true"/>
               <w:spacing w:before="0" w:after="0"/>
               <w:jc w:val="center"/>
               <w:cnfStyle w:val="000000000000" w:firstRow="0" w:lastRow="0" w:firstColumn="0" w:lastColumn="0" w:oddVBand="0" w:evenVBand="0" w:oddHBand="0" w:evenHBand="0" w:firstRowFirstColumn="0" w:firstRowLastColumn="0" w:lastRowFirstColumn="0" w:lastRowLastColumn="0"/>
@@ -5373,6 +5628,7 @@
             <w:pPr>
               <w:pStyle w:val="Normal"/>
               <w:widowControl/>
+              <w:suppressAutoHyphens w:val="true"/>
               <w:spacing w:before="0" w:after="0"/>
               <w:jc w:val="center"/>
               <w:cnfStyle w:val="000000000000" w:firstRow="0" w:lastRow="0" w:firstColumn="0" w:lastColumn="0" w:oddVBand="0" w:evenVBand="0" w:oddHBand="0" w:evenHBand="0" w:firstRowFirstColumn="0" w:firstRowLastColumn="0" w:lastRowFirstColumn="0" w:lastRowLastColumn="0"/>
@@ -5400,7 +5656,7 @@
         </w:trPr>
         <w:tc>
           <w:tcPr>
-            <w:tcW w:w="1559" w:type="dxa"/>
+            <w:tcW w:w="1558" w:type="dxa"/>
             <w:cnfStyle w:val="001000000000" w:firstRow="0" w:lastRow="0" w:firstColumn="1" w:lastColumn="0" w:oddVBand="0" w:evenVBand="0" w:oddHBand="0" w:evenHBand="0" w:firstRowFirstColumn="0" w:firstRowLastColumn="0" w:lastRowFirstColumn="0" w:lastRowLastColumn="0"/>
             <w:tcBorders/>
             <w:vAlign w:val="center"/>
@@ -5409,6 +5665,7 @@
             <w:pPr>
               <w:pStyle w:val="Normal"/>
               <w:widowControl/>
+              <w:suppressAutoHyphens w:val="true"/>
               <w:spacing w:before="0" w:after="0"/>
               <w:jc w:val="center"/>
               <w:rPr>
@@ -5434,7 +5691,7 @@
         </w:tc>
         <w:tc>
           <w:tcPr>
-            <w:tcW w:w="3686" w:type="dxa"/>
+            <w:tcW w:w="3687" w:type="dxa"/>
             <w:tcBorders/>
             <w:vAlign w:val="center"/>
           </w:tcPr>
@@ -5442,6 +5699,7 @@
             <w:pPr>
               <w:pStyle w:val="Normal"/>
               <w:widowControl/>
+              <w:suppressAutoHyphens w:val="true"/>
               <w:spacing w:before="0" w:after="0"/>
               <w:jc w:val="center"/>
               <w:cnfStyle w:val="000000000000" w:firstRow="0" w:lastRow="0" w:firstColumn="0" w:lastColumn="0" w:oddVBand="0" w:evenVBand="0" w:oddHBand="0" w:evenHBand="0" w:firstRowFirstColumn="0" w:firstRowLastColumn="0" w:lastRowFirstColumn="0" w:lastRowLastColumn="0"/>
@@ -5460,19 +5718,7 @@
                 <w:szCs w:val="20"/>
                 <w:lang w:val="es-EC" w:eastAsia="en-US" w:bidi="ar-SA"/>
               </w:rPr>
-              <w:t>LocalD</w:t>
-            </w:r>
-            <w:r>
-              <w:rPr>
-                <w:rFonts w:eastAsia="Calibri" w:cs=""/>
-                <w:b/>
-                <w:bCs/>
-                <w:kern w:val="0"/>
-                <w:sz w:val="20"/>
-                <w:szCs w:val="20"/>
-                <w:lang w:val="es-EC" w:eastAsia="en-US" w:bidi="ar-SA"/>
-              </w:rPr>
-              <w:t>ate</w:t>
+              <w:t>LocalDate</w:t>
             </w:r>
             <w:r>
               <w:rPr>
@@ -5496,6 +5742,7 @@
             <w:pPr>
               <w:pStyle w:val="Normal"/>
               <w:widowControl/>
+              <w:suppressAutoHyphens w:val="true"/>
               <w:spacing w:before="0" w:after="0"/>
               <w:jc w:val="center"/>
               <w:cnfStyle w:val="000000000000" w:firstRow="0" w:lastRow="0" w:firstColumn="0" w:lastColumn="0" w:oddVBand="0" w:evenVBand="0" w:oddHBand="0" w:evenHBand="0" w:firstRowFirstColumn="0" w:firstRowLastColumn="0" w:lastRowFirstColumn="0" w:lastRowLastColumn="0"/>
@@ -5523,7 +5770,7 @@
         </w:trPr>
         <w:tc>
           <w:tcPr>
-            <w:tcW w:w="1559" w:type="dxa"/>
+            <w:tcW w:w="1558" w:type="dxa"/>
             <w:cnfStyle w:val="001000000000" w:firstRow="0" w:lastRow="0" w:firstColumn="1" w:lastColumn="0" w:oddVBand="0" w:evenVBand="0" w:oddHBand="0" w:evenHBand="0" w:firstRowFirstColumn="0" w:firstRowLastColumn="0" w:lastRowFirstColumn="0" w:lastRowLastColumn="0"/>
             <w:tcBorders/>
             <w:vAlign w:val="center"/>
@@ -5532,6 +5779,7 @@
             <w:pPr>
               <w:pStyle w:val="Normal"/>
               <w:widowControl/>
+              <w:suppressAutoHyphens w:val="true"/>
               <w:spacing w:before="0" w:after="0"/>
               <w:jc w:val="center"/>
               <w:rPr>
@@ -5557,7 +5805,7 @@
         </w:tc>
         <w:tc>
           <w:tcPr>
-            <w:tcW w:w="3686" w:type="dxa"/>
+            <w:tcW w:w="3687" w:type="dxa"/>
             <w:tcBorders/>
             <w:vAlign w:val="center"/>
           </w:tcPr>
@@ -5565,6 +5813,7 @@
             <w:pPr>
               <w:pStyle w:val="Normal"/>
               <w:widowControl/>
+              <w:suppressAutoHyphens w:val="true"/>
               <w:spacing w:before="0" w:after="0"/>
               <w:jc w:val="center"/>
               <w:cnfStyle w:val="000000000000" w:firstRow="0" w:lastRow="0" w:firstColumn="0" w:lastColumn="0" w:oddVBand="0" w:evenVBand="0" w:oddHBand="0" w:evenHBand="0" w:firstRowFirstColumn="0" w:firstRowLastColumn="0" w:lastRowFirstColumn="0" w:lastRowLastColumn="0"/>
@@ -5595,6 +5844,7 @@
             <w:pPr>
               <w:pStyle w:val="Normal"/>
               <w:widowControl/>
+              <w:suppressAutoHyphens w:val="true"/>
               <w:spacing w:before="0" w:after="0"/>
               <w:jc w:val="center"/>
               <w:cnfStyle w:val="000000000000" w:firstRow="0" w:lastRow="0" w:firstColumn="0" w:lastColumn="0" w:oddVBand="0" w:evenVBand="0" w:oddHBand="0" w:evenHBand="0" w:firstRowFirstColumn="0" w:firstRowLastColumn="0" w:lastRowFirstColumn="0" w:lastRowLastColumn="0"/>
@@ -5827,6 +6077,7 @@
             <w:pPr>
               <w:pStyle w:val="Normal"/>
               <w:widowControl/>
+              <w:suppressAutoHyphens w:val="true"/>
               <w:spacing w:before="0" w:after="0"/>
               <w:jc w:val="center"/>
               <w:rPr>
@@ -5860,6 +6111,7 @@
             <w:pPr>
               <w:pStyle w:val="Normal"/>
               <w:widowControl/>
+              <w:suppressAutoHyphens w:val="true"/>
               <w:spacing w:before="0" w:after="0"/>
               <w:jc w:val="center"/>
               <w:cnfStyle w:val="100000000000" w:firstRow="1" w:lastRow="0" w:firstColumn="0" w:lastColumn="0" w:oddVBand="0" w:evenVBand="0" w:oddHBand="0" w:evenHBand="0" w:firstRowFirstColumn="0" w:firstRowLastColumn="0" w:lastRowFirstColumn="0" w:lastRowLastColumn="0"/>
@@ -5878,19 +6130,7 @@
                 <w:szCs w:val="20"/>
                 <w:lang w:val="es-EC" w:eastAsia="en-US" w:bidi="ar-SA"/>
               </w:rPr>
-              <w:t xml:space="preserve">Cómo lo resuelve </w:t>
-            </w:r>
-            <w:r>
-              <w:rPr>
-                <w:rFonts w:eastAsia="Calibri" w:cs=""/>
-                <w:b/>
-                <w:bCs/>
-                <w:kern w:val="0"/>
-                <w:sz w:val="20"/>
-                <w:szCs w:val="20"/>
-                <w:lang w:val="es-EC" w:eastAsia="en-US" w:bidi="ar-SA"/>
-              </w:rPr>
-              <w:t>Adapter</w:t>
+              <w:t>Cómo lo resuelve Adapter</w:t>
             </w:r>
           </w:p>
         </w:tc>
@@ -5910,6 +6150,7 @@
             <w:pPr>
               <w:pStyle w:val="Normal"/>
               <w:widowControl/>
+              <w:suppressAutoHyphens w:val="true"/>
               <w:spacing w:before="0" w:after="0"/>
               <w:jc w:val="left"/>
               <w:rPr>
@@ -5943,6 +6184,7 @@
             <w:pPr>
               <w:pStyle w:val="Normal"/>
               <w:widowControl/>
+              <w:suppressAutoHyphens w:val="true"/>
               <w:spacing w:before="0" w:after="0"/>
               <w:jc w:val="left"/>
               <w:cnfStyle w:val="000000000000" w:firstRow="0" w:lastRow="0" w:firstColumn="0" w:lastColumn="0" w:oddVBand="0" w:evenVBand="0" w:oddHBand="0" w:evenHBand="0" w:firstRowFirstColumn="0" w:firstRowLastColumn="0" w:lastRowFirstColumn="0" w:lastRowLastColumn="0"/>
@@ -6003,6 +6245,7 @@
             <w:pPr>
               <w:pStyle w:val="Normal"/>
               <w:widowControl/>
+              <w:suppressAutoHyphens w:val="true"/>
               <w:spacing w:before="0" w:after="0"/>
               <w:jc w:val="left"/>
               <w:rPr>
@@ -6036,6 +6279,7 @@
             <w:pPr>
               <w:pStyle w:val="Normal"/>
               <w:widowControl/>
+              <w:suppressAutoHyphens w:val="true"/>
               <w:spacing w:before="0" w:after="0"/>
               <w:jc w:val="left"/>
               <w:cnfStyle w:val="000000000000" w:firstRow="0" w:lastRow="0" w:firstColumn="0" w:lastColumn="0" w:oddVBand="0" w:evenVBand="0" w:oddHBand="0" w:evenHBand="0" w:firstRowFirstColumn="0" w:firstRowLastColumn="0" w:lastRowFirstColumn="0" w:lastRowLastColumn="0"/>
@@ -6106,6 +6350,7 @@
             <w:pPr>
               <w:pStyle w:val="Normal"/>
               <w:widowControl/>
+              <w:suppressAutoHyphens w:val="true"/>
               <w:spacing w:before="0" w:after="0"/>
               <w:jc w:val="left"/>
               <w:rPr>
@@ -6139,6 +6384,7 @@
             <w:pPr>
               <w:pStyle w:val="Normal"/>
               <w:widowControl/>
+              <w:suppressAutoHyphens w:val="true"/>
               <w:spacing w:before="0" w:after="0"/>
               <w:jc w:val="left"/>
               <w:cnfStyle w:val="000000000000" w:firstRow="0" w:lastRow="0" w:firstColumn="0" w:lastColumn="0" w:oddVBand="0" w:evenVBand="0" w:oddHBand="0" w:evenHBand="0" w:firstRowFirstColumn="0" w:firstRowLastColumn="0" w:lastRowFirstColumn="0" w:lastRowLastColumn="0"/>
@@ -6211,6 +6457,7 @@
             <w:pPr>
               <w:pStyle w:val="Normal"/>
               <w:widowControl/>
+              <w:suppressAutoHyphens w:val="true"/>
               <w:spacing w:before="0" w:after="0"/>
               <w:jc w:val="left"/>
               <w:rPr>
@@ -6230,31 +6477,7 @@
                 <w:szCs w:val="20"/>
                 <w:lang w:val="es-EC" w:eastAsia="en-US" w:bidi="ar-SA"/>
               </w:rPr>
-              <w:t xml:space="preserve">El resto de la aplicación no conoce </w:t>
-            </w:r>
-            <w:r>
-              <w:rPr>
-                <w:rFonts w:eastAsia="Calibri" w:cs=""/>
-                <w:b w:val="false"/>
-                <w:bCs w:val="false"/>
-                <w:kern w:val="0"/>
-                <w:sz w:val="20"/>
-                <w:szCs w:val="20"/>
-                <w:lang w:val="es-EC" w:eastAsia="en-US" w:bidi="ar-SA"/>
-              </w:rPr>
-              <w:t>a</w:t>
-            </w:r>
-            <w:r>
-              <w:rPr>
-                <w:rFonts w:eastAsia="Calibri" w:cs=""/>
-                <w:b w:val="false"/>
-                <w:bCs w:val="false"/>
-                <w:kern w:val="0"/>
-                <w:sz w:val="20"/>
-                <w:szCs w:val="20"/>
-                <w:lang w:val="es-EC" w:eastAsia="en-US" w:bidi="ar-SA"/>
-              </w:rPr>
-              <w:t>l fabricante</w:t>
+              <w:t>El resto de la aplicación no conoce al fabricante</w:t>
             </w:r>
           </w:p>
         </w:tc>
@@ -6268,6 +6491,7 @@
             <w:pPr>
               <w:pStyle w:val="Normal"/>
               <w:widowControl/>
+              <w:suppressAutoHyphens w:val="true"/>
               <w:spacing w:before="0" w:after="0"/>
               <w:jc w:val="left"/>
               <w:cnfStyle w:val="000000000000" w:firstRow="0" w:lastRow="0" w:firstColumn="0" w:lastColumn="0" w:oddVBand="0" w:evenVBand="0" w:oddHBand="0" w:evenHBand="0" w:firstRowFirstColumn="0" w:firstRowLastColumn="0" w:lastRowFirstColumn="0" w:lastRowLastColumn="0"/>
@@ -6380,6 +6604,7 @@
             <w:pPr>
               <w:pStyle w:val="Normal"/>
               <w:widowControl/>
+              <w:suppressAutoHyphens w:val="true"/>
               <w:spacing w:before="0" w:after="0"/>
               <w:jc w:val="left"/>
               <w:rPr>
@@ -6413,6 +6638,7 @@
             <w:pPr>
               <w:pStyle w:val="Normal"/>
               <w:widowControl/>
+              <w:suppressAutoHyphens w:val="true"/>
               <w:spacing w:before="0" w:after="0"/>
               <w:jc w:val="left"/>
               <w:cnfStyle w:val="000000000000" w:firstRow="0" w:lastRow="0" w:firstColumn="0" w:lastColumn="0" w:oddVBand="0" w:evenVBand="0" w:oddHBand="0" w:evenHBand="0" w:firstRowFirstColumn="0" w:firstRowLastColumn="0" w:lastRowFirstColumn="0" w:lastRowLastColumn="0"/>
@@ -6537,21 +6763,6 @@
           <w:szCs w:val="20"/>
         </w:rPr>
       </w:r>
-    </w:p>
-    <w:p>
-      <w:pPr>
-        <w:pStyle w:val="Normal"/>
-        <w:rPr>
-          <w:sz w:val="20"/>
-          <w:szCs w:val="20"/>
-        </w:rPr>
-      </w:pPr>
-      <w:r>
-        <w:rPr>
-          <w:sz w:val="20"/>
-          <w:szCs w:val="20"/>
-        </w:rPr>
-      </w:r>
       <w:r>
         <w:br w:type="page"/>
       </w:r>
@@ -6692,14 +6903,7 @@
           <w:sz w:val="20"/>
           <w:szCs w:val="20"/>
         </w:rPr>
-        <w:t>N</w:t>
-      </w:r>
-      <w:r>
-        <w:rPr>
-          <w:sz w:val="20"/>
-          <w:szCs w:val="20"/>
-        </w:rPr>
-        <w:t>o hereda ni expone al sistema los métodos del fabricante;</w:t>
+        <w:t>No hereda ni expone al sistema los métodos del fabricante;</w:t>
       </w:r>
     </w:p>
     <w:p>
@@ -6719,14 +6923,7 @@
           <w:sz w:val="20"/>
           <w:szCs w:val="20"/>
         </w:rPr>
-        <w:t>p</w:t>
-      </w:r>
-      <w:r>
-        <w:rPr>
-          <w:sz w:val="20"/>
-          <w:szCs w:val="20"/>
-        </w:rPr>
-        <w:t>uede envolver cualquier instancia ya configurada de la biblioteca (por ejemplo, un equipo concreto o un doble de prueba);</w:t>
+        <w:t>puede envolver cualquier instancia ya configurada de la biblioteca (por ejemplo, un equipo concreto o un doble de prueba);</w:t>
       </w:r>
     </w:p>
     <w:p>
@@ -6746,14 +6943,7 @@
           <w:sz w:val="20"/>
           <w:szCs w:val="20"/>
         </w:rPr>
-        <w:t>N</w:t>
-      </w:r>
-      <w:r>
-        <w:rPr>
-          <w:sz w:val="20"/>
-          <w:szCs w:val="20"/>
-        </w:rPr>
-        <w:t>o queda acoplado a la jerarquía interna de la biblioteca, que puede cambiar entre versiones. Además, Java no permite heredar de dos clases, por lo que la variante de clases solo sería posible si el Target fuera una interfaz, y aun así acoplaría el adaptador a la implementación del fabricante.</w:t>
+        <w:t>No queda acoplado a la jerarquía interna de la biblioteca, que puede cambiar entre versiones. Además, Java no permite heredar de dos clases, por lo que la variante de clases solo sería posible si el Target fuera una interfaz, y aun así acoplaría el adaptador a la implementación del fabricante.</w:t>
       </w:r>
     </w:p>
     <w:p>
@@ -6788,7 +6978,7 @@
         </w:rPr>
         <w:t>Diagrama de clases</w:t>
       </w:r>
-      <w:bookmarkStart w:id="5" w:name="_Toc86936454"/>
+      <w:bookmarkStart w:id="3" w:name="_Toc86936454"/>
     </w:p>
     <w:p>
       <w:pPr>
@@ -6845,7 +7035,7 @@
           <w:szCs w:val="20"/>
         </w:rPr>
         <w:drawing>
-          <wp:anchor behindDoc="0" distT="0" distB="0" distL="0" distR="0" simplePos="0" locked="0" layoutInCell="0" allowOverlap="1" relativeHeight="149">
+          <wp:anchor behindDoc="0" distT="0" distB="0" distL="0" distR="0" simplePos="0" locked="0" layoutInCell="0" allowOverlap="1" relativeHeight="158">
             <wp:simplePos x="0" y="0"/>
             <wp:positionH relativeFrom="column">
               <wp:posOffset>-944880</wp:posOffset>
@@ -6856,7 +7046,7 @@
             <wp:extent cx="7279005" cy="4013200"/>
             <wp:effectExtent l="0" t="0" r="0" b="0"/>
             <wp:wrapSquare wrapText="largest"/>
-            <wp:docPr id="32" name="Imagen14" descr=""/>
+            <wp:docPr id="32" name="Imagen18" descr=""/>
             <wp:cNvGraphicFramePr>
               <a:graphicFrameLocks xmlns:a="http://schemas.openxmlformats.org/drawingml/2006/main" noChangeAspect="1"/>
             </wp:cNvGraphicFramePr>
@@ -6864,7 +7054,7 @@
               <a:graphicData uri="http://schemas.openxmlformats.org/drawingml/2006/picture">
                 <pic:pic xmlns:pic="http://schemas.openxmlformats.org/drawingml/2006/picture">
                   <pic:nvPicPr>
-                    <pic:cNvPr id="32" name="Imagen14" descr=""/>
+                    <pic:cNvPr id="32" name="Imagen18" descr=""/>
                     <pic:cNvPicPr>
                       <a:picLocks noChangeAspect="1" noChangeArrowheads="1"/>
                     </pic:cNvPicPr>
@@ -6922,21 +7112,7 @@
           <w:sz w:val="20"/>
           <w:szCs w:val="20"/>
         </w:rPr>
-        <w:t>(instancias creadas por Main al consultar el colaborador 100 el 2024-01-15, que no conoce el proveedor actual y resuelve el nuevo fabricante</w:t>
-      </w:r>
-      <w:r>
-        <w:rPr>
-          <w:sz w:val="20"/>
-          <w:szCs w:val="20"/>
-        </w:rPr>
-        <w:t>)</w:t>
-      </w:r>
-      <w:r>
-        <w:rPr>
-          <w:sz w:val="20"/>
-          <w:szCs w:val="20"/>
-        </w:rPr>
-        <w:t>.</w:t>
+        <w:t>(instancias creadas por Main al consultar el colaborador 100 el 2024-01-15, que no conoce el proveedor actual y resuelve el nuevo fabricante).</w:t>
       </w:r>
       <w:r>
         <w:rPr>
@@ -6966,7 +7142,7 @@
           <w:szCs w:val="20"/>
         </w:rPr>
         <w:drawing>
-          <wp:anchor behindDoc="0" distT="0" distB="0" distL="0" distR="0" simplePos="0" locked="0" layoutInCell="0" allowOverlap="1" relativeHeight="150">
+          <wp:anchor behindDoc="0" distT="0" distB="0" distL="0" distR="0" simplePos="0" locked="0" layoutInCell="0" allowOverlap="1" relativeHeight="159">
             <wp:simplePos x="0" y="0"/>
             <wp:positionH relativeFrom="column">
               <wp:posOffset>330835</wp:posOffset>
@@ -7089,6 +7265,7 @@
             <w:pPr>
               <w:pStyle w:val="Normal"/>
               <w:widowControl/>
+              <w:suppressAutoHyphens w:val="true"/>
               <w:spacing w:before="0" w:after="0"/>
               <w:jc w:val="center"/>
               <w:rPr>
@@ -7122,6 +7299,7 @@
             <w:pPr>
               <w:pStyle w:val="Normal"/>
               <w:widowControl/>
+              <w:suppressAutoHyphens w:val="true"/>
               <w:spacing w:before="0" w:after="0"/>
               <w:jc w:val="center"/>
               <w:cnfStyle w:val="100000000000" w:firstRow="1" w:lastRow="0" w:firstColumn="0" w:lastColumn="0" w:oddVBand="0" w:evenVBand="0" w:oddHBand="0" w:evenHBand="0" w:firstRowFirstColumn="0" w:firstRowLastColumn="0" w:lastRowFirstColumn="0" w:lastRowLastColumn="0"/>
@@ -7160,6 +7338,7 @@
             <w:pPr>
               <w:pStyle w:val="Normal"/>
               <w:widowControl/>
+              <w:suppressAutoHyphens w:val="true"/>
               <w:spacing w:before="0" w:after="0"/>
               <w:jc w:val="left"/>
               <w:rPr>
@@ -7193,6 +7372,7 @@
             <w:pPr>
               <w:pStyle w:val="Normal"/>
               <w:widowControl/>
+              <w:suppressAutoHyphens w:val="true"/>
               <w:spacing w:before="0" w:after="0"/>
               <w:jc w:val="left"/>
               <w:cnfStyle w:val="000000000000" w:firstRow="0" w:lastRow="0" w:firstColumn="0" w:lastColumn="0" w:oddVBand="0" w:evenVBand="0" w:oddHBand="0" w:evenHBand="0" w:firstRowFirstColumn="0" w:firstRowLastColumn="0" w:lastRowFirstColumn="0" w:lastRowLastColumn="0"/>
@@ -7234,6 +7414,7 @@
             <w:pPr>
               <w:pStyle w:val="Normal"/>
               <w:widowControl/>
+              <w:suppressAutoHyphens w:val="true"/>
               <w:spacing w:before="0" w:after="0"/>
               <w:jc w:val="left"/>
               <w:rPr>
@@ -7267,6 +7448,7 @@
             <w:pPr>
               <w:pStyle w:val="Normal"/>
               <w:widowControl/>
+              <w:suppressAutoHyphens w:val="true"/>
               <w:spacing w:before="0" w:after="0"/>
               <w:jc w:val="left"/>
               <w:cnfStyle w:val="000000000000" w:firstRow="0" w:lastRow="0" w:firstColumn="0" w:lastColumn="0" w:oddVBand="0" w:evenVBand="0" w:oddHBand="0" w:evenHBand="0" w:firstRowFirstColumn="0" w:firstRowLastColumn="0" w:lastRowFirstColumn="0" w:lastRowLastColumn="0"/>
@@ -7310,6 +7492,7 @@
             <w:pPr>
               <w:pStyle w:val="Normal"/>
               <w:widowControl/>
+              <w:suppressAutoHyphens w:val="true"/>
               <w:spacing w:before="0" w:after="0"/>
               <w:jc w:val="left"/>
               <w:rPr>
@@ -7343,6 +7526,7 @@
             <w:pPr>
               <w:pStyle w:val="Normal"/>
               <w:widowControl/>
+              <w:suppressAutoHyphens w:val="true"/>
               <w:spacing w:before="0" w:after="0"/>
               <w:jc w:val="left"/>
               <w:cnfStyle w:val="000000000000" w:firstRow="0" w:lastRow="0" w:firstColumn="0" w:lastColumn="0" w:oddVBand="0" w:evenVBand="0" w:oddHBand="0" w:evenHBand="0" w:firstRowFirstColumn="0" w:firstRowLastColumn="0" w:lastRowFirstColumn="0" w:lastRowLastColumn="0"/>
@@ -7384,6 +7568,7 @@
             <w:pPr>
               <w:pStyle w:val="Normal"/>
               <w:widowControl/>
+              <w:suppressAutoHyphens w:val="true"/>
               <w:spacing w:before="0" w:after="0"/>
               <w:jc w:val="left"/>
               <w:rPr>
@@ -7417,6 +7602,7 @@
             <w:pPr>
               <w:pStyle w:val="Normal"/>
               <w:widowControl/>
+              <w:suppressAutoHyphens w:val="true"/>
               <w:spacing w:before="0" w:after="0"/>
               <w:jc w:val="left"/>
               <w:cnfStyle w:val="000000000000" w:firstRow="0" w:lastRow="0" w:firstColumn="0" w:lastColumn="0" w:oddVBand="0" w:evenVBand="0" w:oddHBand="0" w:evenHBand="0" w:firstRowFirstColumn="0" w:firstRowLastColumn="0" w:lastRowFirstColumn="0" w:lastRowLastColumn="0"/>
@@ -7458,6 +7644,7 @@
             <w:pPr>
               <w:pStyle w:val="Normal"/>
               <w:widowControl/>
+              <w:suppressAutoHyphens w:val="true"/>
               <w:spacing w:before="0" w:after="0"/>
               <w:jc w:val="left"/>
               <w:rPr>
@@ -7491,6 +7678,7 @@
             <w:pPr>
               <w:pStyle w:val="Normal"/>
               <w:widowControl/>
+              <w:suppressAutoHyphens w:val="true"/>
               <w:spacing w:before="0" w:after="0"/>
               <w:jc w:val="left"/>
               <w:cnfStyle w:val="000000000000" w:firstRow="0" w:lastRow="0" w:firstColumn="0" w:lastColumn="0" w:oddVBand="0" w:evenVBand="0" w:oddHBand="0" w:evenHBand="0" w:firstRowFirstColumn="0" w:firstRowLastColumn="0" w:lastRowFirstColumn="0" w:lastRowLastColumn="0"/>
@@ -7534,6 +7722,7 @@
             <w:pPr>
               <w:pStyle w:val="Normal"/>
               <w:widowControl/>
+              <w:suppressAutoHyphens w:val="true"/>
               <w:spacing w:before="0" w:after="0"/>
               <w:jc w:val="left"/>
               <w:rPr>
@@ -7569,6 +7758,7 @@
             <w:pPr>
               <w:pStyle w:val="Normal"/>
               <w:widowControl/>
+              <w:suppressAutoHyphens w:val="true"/>
               <w:spacing w:before="0" w:after="0"/>
               <w:jc w:val="left"/>
               <w:cnfStyle w:val="000000000000" w:firstRow="0" w:lastRow="0" w:firstColumn="0" w:lastColumn="0" w:oddVBand="0" w:evenVBand="0" w:oddHBand="0" w:evenHBand="0" w:firstRowFirstColumn="0" w:firstRowLastColumn="0" w:lastRowFirstColumn="0" w:lastRowLastColumn="0"/>
@@ -7612,6 +7802,7 @@
             <w:pPr>
               <w:pStyle w:val="Normal"/>
               <w:widowControl/>
+              <w:suppressAutoHyphens w:val="true"/>
               <w:spacing w:before="0" w:after="0"/>
               <w:jc w:val="left"/>
               <w:rPr>
@@ -7647,6 +7838,7 @@
             <w:pPr>
               <w:pStyle w:val="Normal"/>
               <w:widowControl/>
+              <w:suppressAutoHyphens w:val="true"/>
               <w:spacing w:before="0" w:after="0"/>
               <w:jc w:val="left"/>
               <w:cnfStyle w:val="000000000000" w:firstRow="0" w:lastRow="0" w:firstColumn="0" w:lastColumn="0" w:oddVBand="0" w:evenVBand="0" w:oddHBand="0" w:evenHBand="0" w:firstRowFirstColumn="0" w:firstRowLastColumn="0" w:lastRowFirstColumn="0" w:lastRowLastColumn="0"/>
@@ -7692,6 +7884,7 @@
             <w:pPr>
               <w:pStyle w:val="Normal"/>
               <w:widowControl/>
+              <w:suppressAutoHyphens w:val="true"/>
               <w:spacing w:before="0" w:after="0"/>
               <w:jc w:val="left"/>
               <w:rPr>
@@ -7727,6 +7920,7 @@
             <w:pPr>
               <w:pStyle w:val="Normal"/>
               <w:widowControl/>
+              <w:suppressAutoHyphens w:val="true"/>
               <w:spacing w:before="0" w:after="0"/>
               <w:jc w:val="left"/>
               <w:cnfStyle w:val="000000000000" w:firstRow="0" w:lastRow="0" w:firstColumn="0" w:lastColumn="0" w:oddVBand="0" w:evenVBand="0" w:oddHBand="0" w:evenHBand="0" w:firstRowFirstColumn="0" w:firstRowLastColumn="0" w:lastRowFirstColumn="0" w:lastRowLastColumn="0"/>
@@ -7772,6 +7966,7 @@
             <w:pPr>
               <w:pStyle w:val="Normal"/>
               <w:widowControl/>
+              <w:suppressAutoHyphens w:val="true"/>
               <w:spacing w:before="0" w:after="0"/>
               <w:jc w:val="left"/>
               <w:rPr>
@@ -7807,6 +8002,7 @@
             <w:pPr>
               <w:pStyle w:val="Normal"/>
               <w:widowControl/>
+              <w:suppressAutoHyphens w:val="true"/>
               <w:spacing w:before="0" w:after="0"/>
               <w:jc w:val="left"/>
               <w:cnfStyle w:val="000000000000" w:firstRow="0" w:lastRow="0" w:firstColumn="0" w:lastColumn="0" w:oddVBand="0" w:evenVBand="0" w:oddHBand="0" w:evenHBand="0" w:firstRowFirstColumn="0" w:firstRowLastColumn="0" w:lastRowFirstColumn="0" w:lastRowLastColumn="0"/>
@@ -7838,25 +8034,6 @@
     </w:tbl>
     <w:p>
       <w:pPr>
-        <w:pStyle w:val="ListParagraph"/>
-        <w:rPr>
-          <w:b/>
-          <w:bCs/>
-          <w:sz w:val="20"/>
-          <w:szCs w:val="20"/>
-        </w:rPr>
-      </w:pPr>
-      <w:r>
-        <w:rPr>
-          <w:b/>
-          <w:bCs/>
-          <w:sz w:val="20"/>
-          <w:szCs w:val="20"/>
-        </w:rPr>
-      </w:r>
-    </w:p>
-    <w:p>
-      <w:pPr>
         <w:pStyle w:val="Heading2"/>
         <w:rPr>
           <w:rFonts w:ascii="Calibri" w:hAnsi="Calibri" w:cs="Calibri" w:asciiTheme="minorHAnsi" w:cstheme="minorHAnsi" w:hAnsiTheme="minorHAnsi"/>
@@ -7945,7 +8122,7 @@
           <w:szCs w:val="20"/>
         </w:rPr>
         <w:drawing>
-          <wp:anchor behindDoc="0" distT="0" distB="0" distL="0" distR="0" simplePos="0" locked="0" layoutInCell="0" allowOverlap="1" relativeHeight="146">
+          <wp:anchor behindDoc="0" distT="0" distB="0" distL="0" distR="0" simplePos="0" locked="0" layoutInCell="0" allowOverlap="1" relativeHeight="155">
             <wp:simplePos x="0" y="0"/>
             <wp:positionH relativeFrom="column">
               <wp:posOffset>-304800</wp:posOffset>
@@ -7956,7 +8133,7 @@
             <wp:extent cx="5847080" cy="2482215"/>
             <wp:effectExtent l="0" t="0" r="0" b="0"/>
             <wp:wrapTopAndBottom/>
-            <wp:docPr id="41" name="Imagen3" descr=""/>
+            <wp:docPr id="41" name="Imagen20" descr=""/>
             <wp:cNvGraphicFramePr>
               <a:graphicFrameLocks xmlns:a="http://schemas.openxmlformats.org/drawingml/2006/main" noChangeAspect="1"/>
             </wp:cNvGraphicFramePr>
@@ -7964,7 +8141,7 @@
               <a:graphicData uri="http://schemas.openxmlformats.org/drawingml/2006/picture">
                 <pic:pic xmlns:pic="http://schemas.openxmlformats.org/drawingml/2006/picture">
                   <pic:nvPicPr>
-                    <pic:cNvPr id="41" name="Imagen3" descr=""/>
+                    <pic:cNvPr id="41" name="Imagen20" descr=""/>
                     <pic:cNvPicPr>
                       <a:picLocks noChangeAspect="1" noChangeArrowheads="1"/>
                     </pic:cNvPicPr>
@@ -8004,19 +8181,49 @@
           <w:sz w:val="20"/>
           <w:szCs w:val="20"/>
         </w:rPr>
+      </w:r>
+    </w:p>
+    <w:p>
+      <w:pPr>
+        <w:pStyle w:val="Normal"/>
+        <w:rPr>
+          <w:sz w:val="20"/>
+          <w:szCs w:val="20"/>
+        </w:rPr>
+      </w:pPr>
+      <w:r>
+        <w:rPr>
+          <w:sz w:val="20"/>
+          <w:szCs w:val="20"/>
+        </w:rPr>
+      </w:r>
+    </w:p>
+    <w:p>
+      <w:pPr>
+        <w:pStyle w:val="Normal"/>
+        <w:rPr>
+          <w:sz w:val="20"/>
+          <w:szCs w:val="20"/>
+        </w:rPr>
+      </w:pPr>
+      <w:r>
+        <w:rPr>
+          <w:sz w:val="20"/>
+          <w:szCs w:val="20"/>
+        </w:rPr>
         <w:drawing>
-          <wp:anchor behindDoc="0" distT="0" distB="0" distL="0" distR="0" simplePos="0" locked="0" layoutInCell="0" allowOverlap="1" relativeHeight="151">
+          <wp:anchor behindDoc="0" distT="0" distB="0" distL="0" distR="0" simplePos="0" locked="0" layoutInCell="0" allowOverlap="1" relativeHeight="160">
             <wp:simplePos x="0" y="0"/>
             <wp:positionH relativeFrom="column">
-              <wp:posOffset>-855980</wp:posOffset>
+              <wp:posOffset>-746125</wp:posOffset>
             </wp:positionH>
             <wp:positionV relativeFrom="paragraph">
-              <wp:posOffset>255905</wp:posOffset>
+              <wp:posOffset>301625</wp:posOffset>
             </wp:positionV>
             <wp:extent cx="7140575" cy="4594860"/>
             <wp:effectExtent l="0" t="0" r="0" b="0"/>
             <wp:wrapSquare wrapText="largest"/>
-            <wp:docPr id="42" name="Imagen16" descr=""/>
+            <wp:docPr id="42" name="Imagen21" descr=""/>
             <wp:cNvGraphicFramePr>
               <a:graphicFrameLocks xmlns:a="http://schemas.openxmlformats.org/drawingml/2006/main" noChangeAspect="1"/>
             </wp:cNvGraphicFramePr>
@@ -8024,7 +8231,7 @@
               <a:graphicData uri="http://schemas.openxmlformats.org/drawingml/2006/picture">
                 <pic:pic xmlns:pic="http://schemas.openxmlformats.org/drawingml/2006/picture">
                   <pic:nvPicPr>
-                    <pic:cNvPr id="42" name="Imagen16" descr=""/>
+                    <pic:cNvPr id="42" name="Imagen21" descr=""/>
                     <pic:cNvPicPr>
                       <a:picLocks noChangeAspect="1" noChangeArrowheads="1"/>
                     </pic:cNvPicPr>
@@ -8055,43 +8262,55 @@
       <w:pPr>
         <w:pStyle w:val="Normal"/>
         <w:rPr>
-          <w:sz w:val="20"/>
-          <w:szCs w:val="20"/>
-        </w:rPr>
-      </w:pPr>
-      <w:r>
-        <w:rPr>
-          <w:sz w:val="20"/>
-          <w:szCs w:val="20"/>
-        </w:rPr>
+          <w:b/>
+          <w:bCs/>
+          <w:sz w:val="20"/>
+          <w:szCs w:val="20"/>
+        </w:rPr>
+      </w:pPr>
+      <w:r>
+        <w:rPr/>
       </w:r>
     </w:p>
     <w:p>
       <w:pPr>
         <w:pStyle w:val="Normal"/>
         <w:rPr>
-          <w:sz w:val="20"/>
-          <w:szCs w:val="20"/>
-        </w:rPr>
-      </w:pPr>
-      <w:r>
-        <w:rPr>
-          <w:sz w:val="20"/>
-          <w:szCs w:val="20"/>
-        </w:rPr>
+          <w:b/>
+          <w:bCs/>
+          <w:sz w:val="20"/>
+          <w:szCs w:val="20"/>
+        </w:rPr>
+      </w:pPr>
+      <w:r>
+        <w:rPr/>
+      </w:r>
+    </w:p>
+    <w:p>
+      <w:pPr>
+        <w:pStyle w:val="Normal"/>
+        <w:rPr>
+          <w:b/>
+          <w:bCs/>
+          <w:sz w:val="20"/>
+          <w:szCs w:val="20"/>
+        </w:rPr>
+      </w:pPr>
+      <w:r>
+        <w:rPr/>
         <w:drawing>
-          <wp:anchor behindDoc="0" distT="0" distB="0" distL="0" distR="0" simplePos="0" locked="0" layoutInCell="0" allowOverlap="1" relativeHeight="152">
+          <wp:anchor behindDoc="0" distT="0" distB="0" distL="0" distR="0" simplePos="0" locked="0" layoutInCell="0" allowOverlap="1" relativeHeight="161">
             <wp:simplePos x="0" y="0"/>
             <wp:positionH relativeFrom="column">
-              <wp:posOffset>-788035</wp:posOffset>
+              <wp:posOffset>-838835</wp:posOffset>
             </wp:positionH>
             <wp:positionV relativeFrom="paragraph">
-              <wp:posOffset>43180</wp:posOffset>
+              <wp:posOffset>84455</wp:posOffset>
             </wp:positionV>
             <wp:extent cx="7002145" cy="2439670"/>
             <wp:effectExtent l="0" t="0" r="0" b="0"/>
             <wp:wrapSquare wrapText="largest"/>
-            <wp:docPr id="43" name="Imagen18" descr=""/>
+            <wp:docPr id="43" name="Imagen22" descr=""/>
             <wp:cNvGraphicFramePr>
               <a:graphicFrameLocks xmlns:a="http://schemas.openxmlformats.org/drawingml/2006/main" noChangeAspect="1"/>
             </wp:cNvGraphicFramePr>
@@ -8099,7 +8318,7 @@
               <a:graphicData uri="http://schemas.openxmlformats.org/drawingml/2006/picture">
                 <pic:pic xmlns:pic="http://schemas.openxmlformats.org/drawingml/2006/picture">
                   <pic:nvPicPr>
-                    <pic:cNvPr id="43" name="Imagen18" descr=""/>
+                    <pic:cNvPr id="43" name="Imagen22" descr=""/>
                     <pic:cNvPicPr>
                       <a:picLocks noChangeAspect="1" noChangeArrowheads="1"/>
                     </pic:cNvPicPr>
@@ -8164,7 +8383,7 @@
           <w:szCs w:val="20"/>
         </w:rPr>
         <w:drawing>
-          <wp:anchor behindDoc="0" distT="0" distB="0" distL="0" distR="0" simplePos="0" locked="0" layoutInCell="0" allowOverlap="1" relativeHeight="147">
+          <wp:anchor behindDoc="0" distT="0" distB="0" distL="0" distR="0" simplePos="0" locked="0" layoutInCell="0" allowOverlap="1" relativeHeight="156">
             <wp:simplePos x="0" y="0"/>
             <wp:positionH relativeFrom="column">
               <wp:posOffset>-780415</wp:posOffset>
@@ -8175,7 +8394,7 @@
             <wp:extent cx="6972300" cy="784860"/>
             <wp:effectExtent l="0" t="0" r="0" b="0"/>
             <wp:wrapTopAndBottom/>
-            <wp:docPr id="44" name="Imagen17" descr=""/>
+            <wp:docPr id="44" name="Imagen23" descr=""/>
             <wp:cNvGraphicFramePr>
               <a:graphicFrameLocks xmlns:a="http://schemas.openxmlformats.org/drawingml/2006/main" noChangeAspect="1"/>
             </wp:cNvGraphicFramePr>
@@ -8183,7 +8402,7 @@
               <a:graphicData uri="http://schemas.openxmlformats.org/drawingml/2006/picture">
                 <pic:pic xmlns:pic="http://schemas.openxmlformats.org/drawingml/2006/picture">
                   <pic:nvPicPr>
-                    <pic:cNvPr id="44" name="Imagen17" descr=""/>
+                    <pic:cNvPr id="44" name="Imagen23" descr=""/>
                     <pic:cNvPicPr>
                       <a:picLocks noChangeAspect="1" noChangeArrowheads="1"/>
                     </pic:cNvPicPr>
@@ -8214,32 +8433,24 @@
     <w:p>
       <w:pPr>
         <w:pStyle w:val="Normal"/>
+        <w:jc w:val="both"/>
+        <w:rPr/>
+      </w:pPr>
+      <w:r>
         <w:rPr>
           <w:b/>
           <w:bCs/>
           <w:sz w:val="20"/>
           <w:szCs w:val="20"/>
         </w:rPr>
-      </w:pPr>
-      <w:r>
-        <w:rPr>
-          <w:b/>
-          <w:bCs/>
-          <w:sz w:val="20"/>
-          <w:szCs w:val="20"/>
-        </w:rPr>
         <w:t xml:space="preserve">Salida de la aplicación: </w:t>
       </w:r>
     </w:p>
     <w:p>
       <w:pPr>
         <w:pStyle w:val="Normal"/>
-        <w:rPr>
-          <w:b/>
-          <w:bCs/>
-          <w:sz w:val="20"/>
-          <w:szCs w:val="20"/>
-        </w:rPr>
+        <w:jc w:val="both"/>
+        <w:rPr/>
       </w:pPr>
       <w:r>
         <w:rPr>
@@ -8268,17 +8479,21 @@
         </w:rPr>
       </w:pPr>
       <w:r>
-        <w:rPr/>
+        <w:rPr>
+          <w:rFonts w:cs="Calibri" w:cstheme="minorHAnsi" w:ascii="Calibri" w:hAnsi="Calibri"/>
+          <w:sz w:val="20"/>
+          <w:szCs w:val="20"/>
+        </w:rPr>
         <w:drawing>
-          <wp:anchor behindDoc="0" distT="0" distB="0" distL="0" distR="0" simplePos="0" locked="0" layoutInCell="0" allowOverlap="1" relativeHeight="148">
+          <wp:anchor behindDoc="0" distT="0" distB="0" distL="0" distR="0" simplePos="0" locked="0" layoutInCell="0" allowOverlap="1" relativeHeight="157">
             <wp:simplePos x="0" y="0"/>
             <wp:positionH relativeFrom="column">
               <wp:posOffset>0</wp:posOffset>
             </wp:positionH>
             <wp:positionV relativeFrom="paragraph">
-              <wp:posOffset>129540</wp:posOffset>
+              <wp:posOffset>55880</wp:posOffset>
             </wp:positionV>
-            <wp:extent cx="5657215" cy="3314700"/>
+            <wp:extent cx="5686425" cy="3331845"/>
             <wp:effectExtent l="0" t="0" r="0" b="0"/>
             <wp:wrapTopAndBottom/>
             <wp:docPr id="45" name="Imagen19" descr=""/>
@@ -8303,7 +8518,7 @@
                   <pic:spPr bwMode="auto">
                     <a:xfrm>
                       <a:off x="0" y="0"/>
-                      <a:ext cx="5657215" cy="3314700"/>
+                      <a:ext cx="5686425" cy="3331845"/>
                     </a:xfrm>
                     <a:prstGeom prst="rect">
                       <a:avLst/>
@@ -8319,11 +8534,8 @@
     <w:p>
       <w:pPr>
         <w:pStyle w:val="Heading2"/>
-        <w:rPr>
-          <w:rFonts w:ascii="Calibri" w:hAnsi="Calibri" w:cs="Calibri" w:asciiTheme="minorHAnsi" w:cstheme="minorHAnsi" w:hAnsiTheme="minorHAnsi"/>
-          <w:sz w:val="20"/>
-          <w:szCs w:val="20"/>
-        </w:rPr>
+        <w:jc w:val="both"/>
+        <w:rPr/>
       </w:pPr>
       <w:r>
         <w:rPr>
@@ -8337,10 +8549,8 @@
     <w:p>
       <w:pPr>
         <w:pStyle w:val="Normal"/>
-        <w:rPr>
-          <w:sz w:val="20"/>
-          <w:szCs w:val="20"/>
-        </w:rPr>
+        <w:jc w:val="both"/>
+        <w:rPr/>
       </w:pPr>
       <w:r>
         <w:rPr>
@@ -8469,10 +8679,7 @@
         <w:pStyle w:val="ListParagraph"/>
         <w:ind w:left="360"/>
         <w:jc w:val="both"/>
-        <w:rPr>
-          <w:sz w:val="20"/>
-          <w:szCs w:val="20"/>
-        </w:rPr>
+        <w:rPr/>
       </w:pPr>
       <w:r>
         <w:rPr>
@@ -8486,6 +8693,7 @@
       <w:pPr>
         <w:pStyle w:val="ListParagraph"/>
         <w:ind w:left="360"/>
+        <w:jc w:val="both"/>
         <w:rPr>
           <w:sz w:val="20"/>
           <w:szCs w:val="20"/>
@@ -8505,10 +8713,8 @@
           <w:ilvl w:val="0"/>
           <w:numId w:val="4"/>
         </w:numPr>
-        <w:rPr>
-          <w:b/>
-          <w:bCs/>
-        </w:rPr>
+        <w:jc w:val="both"/>
+        <w:rPr/>
       </w:pPr>
       <w:r>
         <w:rPr>
@@ -8528,26 +8734,75 @@
           <w:numId w:val="0"/>
         </w:numPr>
         <w:ind w:hanging="0" w:left="360"/>
-        <w:rPr>
-          <w:sz w:val="20"/>
-          <w:szCs w:val="20"/>
-        </w:rPr>
+        <w:jc w:val="both"/>
+        <w:rPr>
+          <w:sz w:val="20"/>
+          <w:szCs w:val="20"/>
+        </w:rPr>
+      </w:pPr>
+      <w:r>
+        <w:rPr>
+          <w:sz w:val="20"/>
+          <w:szCs w:val="20"/>
+        </w:rPr>
+      </w:r>
+    </w:p>
+    <w:p>
+      <w:pPr>
+        <w:pStyle w:val="ListParagraph"/>
+        <w:ind w:left="360"/>
+        <w:jc w:val="both"/>
+        <w:rPr/>
       </w:pPr>
       <w:r>
         <w:rPr>
           <w:b/>
           <w:bCs/>
-        </w:rPr>
+          <w:sz w:val="20"/>
+          <w:szCs w:val="20"/>
+        </w:rPr>
+        <w:t xml:space="preserve">Recomendación: </w:t>
+      </w:r>
+      <w:r>
+        <w:rPr>
+          <w:b w:val="false"/>
+          <w:bCs w:val="false"/>
+          <w:sz w:val="20"/>
+          <w:szCs w:val="20"/>
+        </w:rPr>
+        <w:t>M</w:t>
+      </w:r>
+      <w:r>
+        <w:rPr>
+          <w:sz w:val="20"/>
+          <w:szCs w:val="20"/>
+        </w:rPr>
+        <w:t>antener el Adapter de objetos (composición) y concentrar en AdaptadorAsistencia toda la conversión entre los tipos del fabricante (long, java.util.Date, Marcacion con tipo en texto) y los del sistema institucional (String, LocalDate, LocalTime, RegistroAsistencia). Además, añadir DispositivoProveedorActual y SistemaAsistencia.</w:t>
       </w:r>
     </w:p>
     <w:p>
       <w:pPr>
         <w:pStyle w:val="ListParagraph"/>
         <w:ind w:left="360"/>
-        <w:rPr>
-          <w:sz w:val="20"/>
-          <w:szCs w:val="20"/>
-        </w:rPr>
+        <w:jc w:val="both"/>
+        <w:rPr>
+          <w:sz w:val="20"/>
+          <w:szCs w:val="20"/>
+        </w:rPr>
+      </w:pPr>
+      <w:r>
+        <w:rPr>
+          <w:sz w:val="20"/>
+          <w:szCs w:val="20"/>
+        </w:rPr>
+      </w:r>
+    </w:p>
+    <w:p>
+      <w:pPr>
+        <w:pStyle w:val="ListParagraph"/>
+        <w:ind w:left="360"/>
+        <w:jc w:val="both"/>
+        <w:rPr/>
       </w:pPr>
       <w:r>
         <w:rPr>
@@ -8556,7 +8811,7 @@
           <w:sz w:val="20"/>
           <w:szCs w:val="20"/>
         </w:rPr>
-        <w:t xml:space="preserve">Recomendación: </w:t>
+        <w:t xml:space="preserve">Justificación: </w:t>
       </w:r>
       <w:r>
         <w:rPr>
@@ -8565,71 +8820,21 @@
           <w:sz w:val="20"/>
           <w:szCs w:val="20"/>
         </w:rPr>
-        <w:t>M</w:t>
-      </w:r>
-      <w:r>
-        <w:rPr>
-          <w:sz w:val="20"/>
-          <w:szCs w:val="20"/>
-        </w:rPr>
-        <w:t>antener el Adapter de objetos (composición) y concentrar en AdaptadorAsistencia toda la conversión entre los tipos del fabricante (long, java.util.Date, Marcacion con tipo en texto) y los del sistema institucional (String, LocalDate, LocalTime, RegistroAsistencia). Además, añadir DispositivoProveedorActual y SistemaAsistencia.</w:t>
+        <w:t>C</w:t>
+      </w:r>
+      <w:r>
+        <w:rPr>
+          <w:sz w:val="20"/>
+          <w:szCs w:val="20"/>
+        </w:rPr>
+        <w:t>on composición, el sistema solo ve obtenerRegistro(), el adaptador puede envolver cualquier instancia de la biblioteca (incluido un doble de prueba) y una nueva versión del SDK afecta a una sola clase; con herencia se expondrían los métodos del fabricante y se quedaría acoplado a su implementación. Concentrar la conversión de Date en el adaptador evita que java.util.Date se filtre al resto del sistema. Las dos clases nuevas demuestran un requisito del enunciado que el código original no evidenciaba: que el proveedor anterior y el nuevo convivan detrás del mismo contrato y que un tercero se incorpore sin modificar al cliente (SistemaAsistenciaTest.tercerProveedor).</w:t>
       </w:r>
     </w:p>
     <w:p>
       <w:pPr>
         <w:pStyle w:val="ListParagraph"/>
         <w:ind w:left="360"/>
-        <w:rPr>
-          <w:sz w:val="20"/>
-          <w:szCs w:val="20"/>
-        </w:rPr>
-      </w:pPr>
-      <w:r>
-        <w:rPr>
-          <w:sz w:val="20"/>
-          <w:szCs w:val="20"/>
-        </w:rPr>
-      </w:r>
-    </w:p>
-    <w:p>
-      <w:pPr>
-        <w:pStyle w:val="ListParagraph"/>
-        <w:ind w:left="360"/>
-        <w:rPr>
-          <w:sz w:val="20"/>
-          <w:szCs w:val="20"/>
-        </w:rPr>
-      </w:pPr>
-      <w:r>
-        <w:rPr>
-          <w:b/>
-          <w:bCs/>
-          <w:sz w:val="20"/>
-          <w:szCs w:val="20"/>
-        </w:rPr>
-        <w:t xml:space="preserve">Justificación: </w:t>
-      </w:r>
-      <w:r>
-        <w:rPr>
-          <w:b w:val="false"/>
-          <w:bCs w:val="false"/>
-          <w:sz w:val="20"/>
-          <w:szCs w:val="20"/>
-        </w:rPr>
-        <w:t>C</w:t>
-      </w:r>
-      <w:r>
-        <w:rPr>
-          <w:sz w:val="20"/>
-          <w:szCs w:val="20"/>
-        </w:rPr>
-        <w:t>on composición, el sistema solo ve obtenerRegistro(), el adaptador puede envolver cualquier instancia de la biblioteca (incluido un doble de prueba) y una nueva versión del SDK afecta a una sola clase; con herencia se expondrían los métodos del fabricante y se quedaría acoplado a su implementación. Concentrar la conversión de Date en el adaptador evita que java.util.Date se filtre al resto del sistema. Las dos clases nuevas demuestran un requisito del enunciado que el código original no evidenciaba: que el proveedor anterior y el nuevo convivan detrás del mismo contrato y que un tercero se incorpore sin modificar al cliente (SistemaAsistenciaTest.tercerProveedor).</w:t>
-      </w:r>
-    </w:p>
-    <w:p>
-      <w:pPr>
-        <w:pStyle w:val="ListParagraph"/>
-        <w:ind w:left="360"/>
+        <w:jc w:val="both"/>
         <w:rPr>
           <w:sz w:val="20"/>
           <w:szCs w:val="20"/>
@@ -8649,10 +8854,8 @@
           <w:ilvl w:val="0"/>
           <w:numId w:val="4"/>
         </w:numPr>
-        <w:rPr>
-          <w:b/>
-          <w:bCs/>
-        </w:rPr>
+        <w:jc w:val="both"/>
+        <w:rPr/>
       </w:pPr>
       <w:r>
         <w:rPr>
@@ -8672,26 +8875,75 @@
           <w:numId w:val="0"/>
         </w:numPr>
         <w:ind w:hanging="0" w:left="360"/>
-        <w:rPr>
-          <w:sz w:val="20"/>
-          <w:szCs w:val="20"/>
-        </w:rPr>
+        <w:jc w:val="both"/>
+        <w:rPr>
+          <w:sz w:val="20"/>
+          <w:szCs w:val="20"/>
+        </w:rPr>
+      </w:pPr>
+      <w:r>
+        <w:rPr>
+          <w:sz w:val="20"/>
+          <w:szCs w:val="20"/>
+        </w:rPr>
+      </w:r>
+    </w:p>
+    <w:p>
+      <w:pPr>
+        <w:pStyle w:val="ListParagraph"/>
+        <w:ind w:left="360"/>
+        <w:jc w:val="both"/>
+        <w:rPr/>
       </w:pPr>
       <w:r>
         <w:rPr>
           <w:b/>
           <w:bCs/>
-        </w:rPr>
+          <w:sz w:val="20"/>
+          <w:szCs w:val="20"/>
+        </w:rPr>
+        <w:t xml:space="preserve">Recomendación de la IA: </w:t>
+      </w:r>
+      <w:r>
+        <w:rPr>
+          <w:b w:val="false"/>
+          <w:bCs w:val="false"/>
+          <w:sz w:val="20"/>
+          <w:szCs w:val="20"/>
+        </w:rPr>
+        <w:t>A</w:t>
+      </w:r>
+      <w:r>
+        <w:rPr>
+          <w:sz w:val="20"/>
+          <w:szCs w:val="20"/>
+        </w:rPr>
+        <w:t>l documentar el resultado, presentar el diagrama de clases con la distribución horizontal que Mermaid genera por defecto en la versión inicial (direction LR).</w:t>
       </w:r>
     </w:p>
     <w:p>
       <w:pPr>
         <w:pStyle w:val="ListParagraph"/>
         <w:ind w:left="360"/>
-        <w:rPr>
-          <w:sz w:val="20"/>
-          <w:szCs w:val="20"/>
-        </w:rPr>
+        <w:jc w:val="both"/>
+        <w:rPr>
+          <w:sz w:val="20"/>
+          <w:szCs w:val="20"/>
+        </w:rPr>
+      </w:pPr>
+      <w:r>
+        <w:rPr>
+          <w:sz w:val="20"/>
+          <w:szCs w:val="20"/>
+        </w:rPr>
+      </w:r>
+    </w:p>
+    <w:p>
+      <w:pPr>
+        <w:pStyle w:val="ListParagraph"/>
+        <w:ind w:left="360"/>
+        <w:jc w:val="both"/>
+        <w:rPr/>
       </w:pPr>
       <w:r>
         <w:rPr>
@@ -8700,29 +8952,21 @@
           <w:sz w:val="20"/>
           <w:szCs w:val="20"/>
         </w:rPr>
-        <w:t xml:space="preserve">Recomendación de la IA: </w:t>
-      </w:r>
-      <w:r>
-        <w:rPr>
-          <w:b w:val="false"/>
-          <w:bCs w:val="false"/>
-          <w:sz w:val="20"/>
-          <w:szCs w:val="20"/>
-        </w:rPr>
-        <w:t>A</w:t>
-      </w:r>
-      <w:r>
-        <w:rPr>
-          <w:sz w:val="20"/>
-          <w:szCs w:val="20"/>
-        </w:rPr>
-        <w:t>l documentar el resultado, presentar el diagrama de clases con la distribución horizontal que Mermaid genera por defecto en la versión inicial (direction LR).</w:t>
+        <w:t xml:space="preserve">Decisión modificada: </w:t>
+      </w:r>
+      <w:r>
+        <w:rPr>
+          <w:sz w:val="20"/>
+          <w:szCs w:val="20"/>
+        </w:rPr>
+        <w:t>El grupo pidió una distribución vertical. La primera versión vertical seguía siendo muy ancha, porque las tres implementaciones del Target quedaban en una sola fila, así que se reordenaron las relaciones de realización (AsistenciaTarget &lt;|.. Implementación) para que el diagrama se organizara por capas: cliente, interfaz, implementaciones y, por último, la biblioteca y los datos. Se revisaron las imágenes antes de guardarlas; una línea sigue cruzando por detrás de una clase y se dejó así para no alterar el significado del diagrama.</w:t>
       </w:r>
     </w:p>
     <w:p>
       <w:pPr>
         <w:pStyle w:val="ListParagraph"/>
         <w:ind w:left="360"/>
+        <w:jc w:val="both"/>
         <w:rPr>
           <w:sz w:val="20"/>
           <w:szCs w:val="20"/>
@@ -8739,10 +8983,8 @@
       <w:pPr>
         <w:pStyle w:val="ListParagraph"/>
         <w:ind w:left="360"/>
-        <w:rPr>
-          <w:sz w:val="20"/>
-          <w:szCs w:val="20"/>
-        </w:rPr>
+        <w:jc w:val="both"/>
+        <w:rPr/>
       </w:pPr>
       <w:r>
         <w:rPr>
@@ -8751,14 +8993,14 @@
           <w:sz w:val="20"/>
           <w:szCs w:val="20"/>
         </w:rPr>
-        <w:t xml:space="preserve">Decisión modificada: </w:t>
-      </w:r>
-      <w:r>
-        <w:rPr>
-          <w:sz w:val="20"/>
-          <w:szCs w:val="20"/>
-        </w:rPr>
-        <w:t>El grupo pidió una distribución vertical. La primera versión vertical seguía siendo muy ancha, porque las tres implementaciones del Target quedaban en una sola fila, así que se reordenaron las relaciones de realización (AsistenciaTarget &lt;|.. Implementación) para que el diagrama se organizara por capas: cliente, interfaz, implementaciones y, por último, la biblioteca y los datos. Se revisaron las imágenes antes de guardarlas; una línea sigue cruzando por detrás de una clase y se dejó así para no alterar el significado del diagrama.</w:t>
+        <w:t xml:space="preserve">Justificación: </w:t>
+      </w:r>
+      <w:r>
+        <w:rPr>
+          <w:sz w:val="20"/>
+          <w:szCs w:val="20"/>
+        </w:rPr>
+        <w:t>la figura va en un documento de hoja vertical y una imagen muy ancha se vuelve ilegible al reducirla.</w:t>
       </w:r>
     </w:p>
     <w:p>
@@ -8772,91 +9014,6 @@
       </w:pPr>
       <w:r>
         <w:rPr>
-          <w:sz w:val="20"/>
-          <w:szCs w:val="20"/>
-        </w:rPr>
-      </w:r>
-    </w:p>
-    <w:p>
-      <w:pPr>
-        <w:pStyle w:val="ListParagraph"/>
-        <w:ind w:left="360"/>
-        <w:rPr>
-          <w:sz w:val="20"/>
-          <w:szCs w:val="20"/>
-        </w:rPr>
-      </w:pPr>
-      <w:r>
-        <w:rPr>
-          <w:b/>
-          <w:bCs/>
-          <w:sz w:val="20"/>
-          <w:szCs w:val="20"/>
-        </w:rPr>
-        <w:t xml:space="preserve">Justificación: </w:t>
-      </w:r>
-      <w:r>
-        <w:rPr>
-          <w:sz w:val="20"/>
-          <w:szCs w:val="20"/>
-        </w:rPr>
-        <w:t>la figura va en un documento de hoja vertical y una imagen muy ancha se vuelve ilegible al reducirla.</w:t>
-      </w:r>
-    </w:p>
-    <w:p>
-      <w:pPr>
-        <w:pStyle w:val="ListParagraph"/>
-        <w:ind w:left="360"/>
-        <w:rPr>
-          <w:sz w:val="20"/>
-          <w:szCs w:val="20"/>
-        </w:rPr>
-      </w:pPr>
-      <w:r>
-        <w:rPr>
-          <w:sz w:val="20"/>
-          <w:szCs w:val="20"/>
-        </w:rPr>
-      </w:r>
-    </w:p>
-    <w:p>
-      <w:pPr>
-        <w:pStyle w:val="ListParagraph"/>
-        <w:ind w:left="360"/>
-        <w:rPr>
-          <w:sz w:val="20"/>
-          <w:szCs w:val="20"/>
-        </w:rPr>
-      </w:pPr>
-      <w:r>
-        <w:rPr>
-          <w:b/>
-          <w:bCs/>
-          <w:sz w:val="20"/>
-          <w:szCs w:val="20"/>
-        </w:rPr>
-        <w:t>Errores de la IA detectados y corregidos:</w:t>
-      </w:r>
-      <w:r>
-        <w:rPr>
-          <w:sz w:val="20"/>
-          <w:szCs w:val="20"/>
-        </w:rPr>
-        <w:t xml:space="preserve"> la primera versión del adaptador forzaba manualmente los 999 milisegundos del fin del día; se simplificó al comprobar que LocalTime.MAX ya produce 23:59:59.999 al convertir a Date, y la prueba calculaRangoDelDia lo verifica. El diagrama de objetos se había escrito con una sintaxis que Mermaid no admite y se rehízo como flowchart. Además, al actualizar el informe, un script de reemplazo de la IA duplicó la sección del Escenario 02 y dañó el bloque de código del Escenario 01; se detectó al revisar la estructura del archivo y se reconstruyó. Estos casos muestran que el resultado de la IA debe comprobarse ejecutando las pruebas y revisando los artefactos generados.</w:t>
-      </w:r>
-    </w:p>
-    <w:p>
-      <w:pPr>
-        <w:pStyle w:val="Normal"/>
-        <w:rPr>
-          <w:rFonts w:cs="Calibri" w:cstheme="minorHAnsi"/>
-          <w:sz w:val="20"/>
-          <w:szCs w:val="20"/>
-        </w:rPr>
-      </w:pPr>
-      <w:r>
-        <w:rPr>
-          <w:rFonts w:cs="Calibri" w:cstheme="minorHAnsi"/>
           <w:sz w:val="20"/>
           <w:szCs w:val="20"/>
         </w:rPr>
@@ -8905,11 +9062,8 @@
           <w:ilvl w:val="0"/>
           <w:numId w:val="4"/>
         </w:numPr>
-        <w:rPr>
-          <w:rFonts w:cs="Calibri" w:cstheme="minorHAnsi"/>
-          <w:sz w:val="20"/>
-          <w:szCs w:val="20"/>
-        </w:rPr>
+        <w:jc w:val="both"/>
+        <w:rPr/>
       </w:pPr>
       <w:r>
         <w:rPr>
@@ -8990,6 +9144,7 @@
       <w:pPr>
         <w:pStyle w:val="ListParagraph"/>
         <w:ind w:left="360"/>
+        <w:jc w:val="both"/>
         <w:rPr>
           <w:rFonts w:cs="Calibri" w:cstheme="minorHAnsi"/>
           <w:sz w:val="20"/>
@@ -9011,24 +9166,22 @@
           <w:ilvl w:val="0"/>
           <w:numId w:val="4"/>
         </w:numPr>
+        <w:jc w:val="both"/>
+        <w:rPr/>
+      </w:pPr>
+      <w:r>
         <w:rPr>
           <w:rFonts w:cs="Calibri" w:cstheme="minorHAnsi"/>
           <w:sz w:val="20"/>
           <w:szCs w:val="20"/>
         </w:rPr>
-      </w:pPr>
-      <w:r>
-        <w:rPr>
-          <w:rFonts w:cs="Calibri" w:cstheme="minorHAnsi"/>
-          <w:sz w:val="20"/>
-          <w:szCs w:val="20"/>
-        </w:rPr>
         <w:t>En el Escenario 02, el problema era una incompatibilidad de interfaces entre un sistema que no debe cambiar y una biblioteca que no puede cambiarse. Con un Adapter de objetos, toda la traducción de nombres, tipos y estructuras quedó en una sola clase, y el sistema institucional sigue dependiendo solo de su contrato.</w:t>
       </w:r>
     </w:p>
     <w:p>
       <w:pPr>
         <w:pStyle w:val="Normal"/>
+        <w:jc w:val="both"/>
         <w:rPr>
           <w:rFonts w:cs="Calibri" w:cstheme="minorHAnsi"/>
           <w:sz w:val="20"/>
@@ -9050,24 +9203,22 @@
           <w:ilvl w:val="0"/>
           <w:numId w:val="4"/>
         </w:numPr>
+        <w:jc w:val="both"/>
+        <w:rPr/>
+      </w:pPr>
+      <w:r>
         <w:rPr>
           <w:rFonts w:cs="Calibri" w:cstheme="minorHAnsi"/>
           <w:sz w:val="20"/>
           <w:szCs w:val="20"/>
         </w:rPr>
-      </w:pPr>
-      <w:r>
-        <w:rPr>
-          <w:rFonts w:cs="Calibri" w:cstheme="minorHAnsi"/>
-          <w:sz w:val="20"/>
-          <w:szCs w:val="20"/>
-        </w:rPr>
         <w:t>En los dos casos se cumplió el principio Abierto/Cerrado: se agregó una interfaz gráfica sin tocar las clases del Composite, y un nuevo fabricante se integra con otro adaptador sin modificar el cliente.</w:t>
       </w:r>
     </w:p>
     <w:p>
       <w:pPr>
         <w:pStyle w:val="Normal"/>
+        <w:jc w:val="both"/>
         <w:rPr>
           <w:rFonts w:cs="Calibri" w:cstheme="minorHAnsi"/>
           <w:sz w:val="20"/>
@@ -9089,11 +9240,8 @@
           <w:ilvl w:val="0"/>
           <w:numId w:val="4"/>
         </w:numPr>
-        <w:rPr>
-          <w:rFonts w:cs="Calibri" w:cstheme="minorHAnsi"/>
-          <w:sz w:val="20"/>
-          <w:szCs w:val="20"/>
-        </w:rPr>
+        <w:jc w:val="both"/>
+        <w:rPr/>
       </w:pPr>
       <w:r>
         <w:rPr>
@@ -9108,6 +9256,7 @@
       <w:pPr>
         <w:pStyle w:val="ListParagraph"/>
         <w:ind w:left="360"/>
+        <w:jc w:val="both"/>
         <w:rPr>
           <w:rFonts w:cs="Calibri" w:cstheme="minorHAnsi"/>
           <w:sz w:val="20"/>
@@ -9142,18 +9291,15 @@
           <w:ilvl w:val="0"/>
           <w:numId w:val="4"/>
         </w:numPr>
+        <w:jc w:val="both"/>
+        <w:rPr/>
+      </w:pPr>
+      <w:r>
         <w:rPr>
           <w:rFonts w:cs="Calibri" w:cstheme="minorHAnsi"/>
           <w:sz w:val="20"/>
           <w:szCs w:val="20"/>
         </w:rPr>
-      </w:pPr>
-      <w:r>
-        <w:rPr>
-          <w:rFonts w:cs="Calibri" w:cstheme="minorHAnsi"/>
-          <w:sz w:val="20"/>
-          <w:szCs w:val="20"/>
-        </w:rPr>
         <w:t>La inteligencia artificial aceleró el diseño, la implementación y las pruebas, pero sus propuestas debieron validarse: en ambos escenarios el grupo rechazó una recomendación y corrigió diagramas generados, lo que demuestra que el criterio del equipo sigue siendo indispensable.</w:t>
       </w:r>
     </w:p>
@@ -9174,7 +9320,7 @@
         </w:rPr>
         <w:t>Rúbrica de evaluación:</w:t>
       </w:r>
-      <w:bookmarkEnd w:id="5"/>
+      <w:bookmarkEnd w:id="3"/>
     </w:p>
     <w:p>
       <w:pPr>
@@ -9237,6 +9383,7 @@
             <w:pPr>
               <w:pStyle w:val="Normal"/>
               <w:widowControl/>
+              <w:suppressAutoHyphens w:val="true"/>
               <w:spacing w:before="0" w:after="0"/>
               <w:jc w:val="left"/>
               <w:rPr>
@@ -9276,6 +9423,7 @@
             <w:pPr>
               <w:pStyle w:val="Normal"/>
               <w:widowControl/>
+              <w:suppressAutoHyphens w:val="true"/>
               <w:spacing w:before="0" w:after="0"/>
               <w:jc w:val="center"/>
               <w:cnfStyle w:val="100000000000" w:firstRow="1" w:lastRow="0" w:firstColumn="0" w:lastColumn="0" w:oddVBand="0" w:evenVBand="0" w:oddHBand="0" w:evenHBand="0" w:firstRowFirstColumn="0" w:firstRowLastColumn="0" w:lastRowFirstColumn="0" w:lastRowLastColumn="0"/>
@@ -9316,6 +9464,7 @@
             <w:pPr>
               <w:pStyle w:val="Normal"/>
               <w:widowControl/>
+              <w:suppressAutoHyphens w:val="true"/>
               <w:spacing w:before="0" w:after="0"/>
               <w:jc w:val="center"/>
               <w:cnfStyle w:val="100000000000" w:firstRow="1" w:lastRow="0" w:firstColumn="0" w:lastColumn="0" w:oddVBand="0" w:evenVBand="0" w:oddHBand="0" w:evenHBand="0" w:firstRowFirstColumn="0" w:firstRowLastColumn="0" w:lastRowFirstColumn="0" w:lastRowLastColumn="0"/>
@@ -9356,6 +9505,7 @@
             <w:pPr>
               <w:pStyle w:val="Normal"/>
               <w:widowControl/>
+              <w:suppressAutoHyphens w:val="true"/>
               <w:spacing w:before="0" w:after="0"/>
               <w:jc w:val="center"/>
               <w:cnfStyle w:val="100000000000" w:firstRow="1" w:lastRow="0" w:firstColumn="0" w:lastColumn="0" w:oddVBand="0" w:evenVBand="0" w:oddHBand="0" w:evenHBand="0" w:firstRowFirstColumn="0" w:firstRowLastColumn="0" w:lastRowFirstColumn="0" w:lastRowLastColumn="0"/>
@@ -9395,6 +9545,7 @@
             <w:pPr>
               <w:pStyle w:val="Normal"/>
               <w:widowControl/>
+              <w:suppressAutoHyphens w:val="true"/>
               <w:spacing w:before="0" w:after="0"/>
               <w:jc w:val="center"/>
               <w:cnfStyle w:val="100000000000" w:firstRow="1" w:lastRow="0" w:firstColumn="0" w:lastColumn="0" w:oddVBand="0" w:evenVBand="0" w:oddHBand="0" w:evenHBand="0" w:firstRowFirstColumn="0" w:firstRowLastColumn="0" w:lastRowFirstColumn="0" w:lastRowLastColumn="0"/>
@@ -9440,6 +9591,7 @@
             <w:pPr>
               <w:pStyle w:val="Normal"/>
               <w:widowControl/>
+              <w:suppressAutoHyphens w:val="true"/>
               <w:spacing w:before="0" w:after="0"/>
               <w:jc w:val="left"/>
               <w:rPr>
@@ -9479,6 +9631,7 @@
             <w:pPr>
               <w:pStyle w:val="Normal"/>
               <w:widowControl/>
+              <w:suppressAutoHyphens w:val="true"/>
               <w:spacing w:before="0" w:after="0"/>
               <w:jc w:val="center"/>
               <w:cnfStyle w:val="000000100000" w:firstRow="0" w:lastRow="0" w:firstColumn="0" w:lastColumn="0" w:oddVBand="0" w:evenVBand="0" w:oddHBand="1" w:evenHBand="0" w:firstRowFirstColumn="0" w:firstRowLastColumn="0" w:lastRowFirstColumn="0" w:lastRowLastColumn="0"/>
@@ -9515,6 +9668,7 @@
             <w:pPr>
               <w:pStyle w:val="Normal"/>
               <w:widowControl/>
+              <w:suppressAutoHyphens w:val="true"/>
               <w:spacing w:before="0" w:after="0"/>
               <w:jc w:val="center"/>
               <w:cnfStyle w:val="000000100000" w:firstRow="0" w:lastRow="0" w:firstColumn="0" w:lastColumn="0" w:oddVBand="0" w:evenVBand="0" w:oddHBand="1" w:evenHBand="0" w:firstRowFirstColumn="0" w:firstRowLastColumn="0" w:lastRowFirstColumn="0" w:lastRowLastColumn="0"/>
@@ -9551,6 +9705,7 @@
             <w:pPr>
               <w:pStyle w:val="Normal"/>
               <w:widowControl/>
+              <w:suppressAutoHyphens w:val="true"/>
               <w:spacing w:before="0" w:after="0"/>
               <w:jc w:val="center"/>
               <w:cnfStyle w:val="000000100000" w:firstRow="0" w:lastRow="0" w:firstColumn="0" w:lastColumn="0" w:oddVBand="0" w:evenVBand="0" w:oddHBand="1" w:evenHBand="0" w:firstRowFirstColumn="0" w:firstRowLastColumn="0" w:lastRowFirstColumn="0" w:lastRowLastColumn="0"/>
@@ -9586,6 +9741,7 @@
             <w:pPr>
               <w:pStyle w:val="Normal"/>
               <w:widowControl/>
+              <w:suppressAutoHyphens w:val="true"/>
               <w:spacing w:before="0" w:after="0"/>
               <w:jc w:val="center"/>
               <w:cnfStyle w:val="000000100000" w:firstRow="0" w:lastRow="0" w:firstColumn="0" w:lastColumn="0" w:oddVBand="0" w:evenVBand="0" w:oddHBand="1" w:evenHBand="0" w:firstRowFirstColumn="0" w:firstRowLastColumn="0" w:lastRowFirstColumn="0" w:lastRowLastColumn="0"/>
@@ -9630,6 +9786,7 @@
             <w:pPr>
               <w:pStyle w:val="Normal"/>
               <w:widowControl/>
+              <w:suppressAutoHyphens w:val="true"/>
               <w:spacing w:before="0" w:after="0"/>
               <w:jc w:val="left"/>
               <w:rPr>
@@ -9671,6 +9828,7 @@
             <w:pPr>
               <w:pStyle w:val="Normal"/>
               <w:widowControl/>
+              <w:suppressAutoHyphens w:val="true"/>
               <w:spacing w:before="0" w:after="0"/>
               <w:jc w:val="center"/>
               <w:cnfStyle w:val="000000000000" w:firstRow="0" w:lastRow="0" w:firstColumn="0" w:lastColumn="0" w:oddVBand="0" w:evenVBand="0" w:oddHBand="0" w:evenHBand="0" w:firstRowFirstColumn="0" w:firstRowLastColumn="0" w:lastRowFirstColumn="0" w:lastRowLastColumn="0"/>
@@ -9709,6 +9867,7 @@
             <w:pPr>
               <w:pStyle w:val="Normal"/>
               <w:widowControl/>
+              <w:suppressAutoHyphens w:val="true"/>
               <w:spacing w:before="0" w:after="0"/>
               <w:jc w:val="center"/>
               <w:cnfStyle w:val="000000000000" w:firstRow="0" w:lastRow="0" w:firstColumn="0" w:lastColumn="0" w:oddVBand="0" w:evenVBand="0" w:oddHBand="0" w:evenHBand="0" w:firstRowFirstColumn="0" w:firstRowLastColumn="0" w:lastRowFirstColumn="0" w:lastRowLastColumn="0"/>
@@ -9747,6 +9906,7 @@
             <w:pPr>
               <w:pStyle w:val="Normal"/>
               <w:widowControl/>
+              <w:suppressAutoHyphens w:val="true"/>
               <w:spacing w:before="0" w:after="0"/>
               <w:jc w:val="center"/>
               <w:cnfStyle w:val="000000000000" w:firstRow="0" w:lastRow="0" w:firstColumn="0" w:lastColumn="0" w:oddVBand="0" w:evenVBand="0" w:oddHBand="0" w:evenHBand="0" w:firstRowFirstColumn="0" w:firstRowLastColumn="0" w:lastRowFirstColumn="0" w:lastRowLastColumn="0"/>
@@ -9784,6 +9944,7 @@
             <w:pPr>
               <w:pStyle w:val="Normal"/>
               <w:widowControl/>
+              <w:suppressAutoHyphens w:val="true"/>
               <w:spacing w:before="0" w:after="0"/>
               <w:jc w:val="center"/>
               <w:cnfStyle w:val="000000000000" w:firstRow="0" w:lastRow="0" w:firstColumn="0" w:lastColumn="0" w:oddVBand="0" w:evenVBand="0" w:oddHBand="0" w:evenHBand="0" w:firstRowFirstColumn="0" w:firstRowLastColumn="0" w:lastRowFirstColumn="0" w:lastRowLastColumn="0"/>
@@ -9827,6 +9988,7 @@
             <w:pPr>
               <w:pStyle w:val="Normal"/>
               <w:widowControl/>
+              <w:suppressAutoHyphens w:val="true"/>
               <w:spacing w:before="0" w:after="0"/>
               <w:jc w:val="left"/>
               <w:rPr>
@@ -9866,6 +10028,7 @@
             <w:pPr>
               <w:pStyle w:val="Normal"/>
               <w:widowControl/>
+              <w:suppressAutoHyphens w:val="true"/>
               <w:spacing w:before="0" w:after="0"/>
               <w:jc w:val="center"/>
               <w:cnfStyle w:val="000000100000" w:firstRow="0" w:lastRow="0" w:firstColumn="0" w:lastColumn="0" w:oddVBand="0" w:evenVBand="0" w:oddHBand="1" w:evenHBand="0" w:firstRowFirstColumn="0" w:firstRowLastColumn="0" w:lastRowFirstColumn="0" w:lastRowLastColumn="0"/>
@@ -9902,6 +10065,7 @@
             <w:pPr>
               <w:pStyle w:val="Normal"/>
               <w:widowControl/>
+              <w:suppressAutoHyphens w:val="true"/>
               <w:spacing w:before="0" w:after="0"/>
               <w:jc w:val="center"/>
               <w:cnfStyle w:val="000000100000" w:firstRow="0" w:lastRow="0" w:firstColumn="0" w:lastColumn="0" w:oddVBand="0" w:evenVBand="0" w:oddHBand="1" w:evenHBand="0" w:firstRowFirstColumn="0" w:firstRowLastColumn="0" w:lastRowFirstColumn="0" w:lastRowLastColumn="0"/>
@@ -9938,6 +10102,7 @@
             <w:pPr>
               <w:pStyle w:val="Normal"/>
               <w:widowControl/>
+              <w:suppressAutoHyphens w:val="true"/>
               <w:spacing w:before="0" w:after="0"/>
               <w:jc w:val="center"/>
               <w:cnfStyle w:val="000000100000" w:firstRow="0" w:lastRow="0" w:firstColumn="0" w:lastColumn="0" w:oddVBand="0" w:evenVBand="0" w:oddHBand="1" w:evenHBand="0" w:firstRowFirstColumn="0" w:firstRowLastColumn="0" w:lastRowFirstColumn="0" w:lastRowLastColumn="0"/>
@@ -9973,6 +10138,7 @@
             <w:pPr>
               <w:pStyle w:val="Normal"/>
               <w:widowControl/>
+              <w:suppressAutoHyphens w:val="true"/>
               <w:spacing w:before="0" w:after="0"/>
               <w:jc w:val="center"/>
               <w:cnfStyle w:val="000000100000" w:firstRow="0" w:lastRow="0" w:firstColumn="0" w:lastColumn="0" w:oddVBand="0" w:evenVBand="0" w:oddHBand="1" w:evenHBand="0" w:firstRowFirstColumn="0" w:firstRowLastColumn="0" w:lastRowFirstColumn="0" w:lastRowLastColumn="0"/>
@@ -10017,6 +10183,7 @@
             <w:pPr>
               <w:pStyle w:val="Normal"/>
               <w:widowControl/>
+              <w:suppressAutoHyphens w:val="true"/>
               <w:spacing w:before="0" w:after="0"/>
               <w:jc w:val="left"/>
               <w:rPr>
@@ -10058,6 +10225,7 @@
             <w:pPr>
               <w:pStyle w:val="Normal"/>
               <w:widowControl/>
+              <w:suppressAutoHyphens w:val="true"/>
               <w:spacing w:before="0" w:after="0"/>
               <w:jc w:val="center"/>
               <w:cnfStyle w:val="000000000000" w:firstRow="0" w:lastRow="0" w:firstColumn="0" w:lastColumn="0" w:oddVBand="0" w:evenVBand="0" w:oddHBand="0" w:evenHBand="0" w:firstRowFirstColumn="0" w:firstRowLastColumn="0" w:lastRowFirstColumn="0" w:lastRowLastColumn="0"/>
@@ -10096,6 +10264,7 @@
             <w:pPr>
               <w:pStyle w:val="Normal"/>
               <w:widowControl/>
+              <w:suppressAutoHyphens w:val="true"/>
               <w:spacing w:before="0" w:after="0"/>
               <w:jc w:val="center"/>
               <w:cnfStyle w:val="000000000000" w:firstRow="0" w:lastRow="0" w:firstColumn="0" w:lastColumn="0" w:oddVBand="0" w:evenVBand="0" w:oddHBand="0" w:evenHBand="0" w:firstRowFirstColumn="0" w:firstRowLastColumn="0" w:lastRowFirstColumn="0" w:lastRowLastColumn="0"/>
@@ -10134,6 +10303,7 @@
             <w:pPr>
               <w:pStyle w:val="Normal"/>
               <w:widowControl/>
+              <w:suppressAutoHyphens w:val="true"/>
               <w:spacing w:before="0" w:after="0"/>
               <w:jc w:val="center"/>
               <w:cnfStyle w:val="000000000000" w:firstRow="0" w:lastRow="0" w:firstColumn="0" w:lastColumn="0" w:oddVBand="0" w:evenVBand="0" w:oddHBand="0" w:evenHBand="0" w:firstRowFirstColumn="0" w:firstRowLastColumn="0" w:lastRowFirstColumn="0" w:lastRowLastColumn="0"/>
@@ -10171,6 +10341,7 @@
             <w:pPr>
               <w:pStyle w:val="Normal"/>
               <w:widowControl/>
+              <w:suppressAutoHyphens w:val="true"/>
               <w:spacing w:before="0" w:after="0"/>
               <w:jc w:val="center"/>
               <w:cnfStyle w:val="000000000000" w:firstRow="0" w:lastRow="0" w:firstColumn="0" w:lastColumn="0" w:oddVBand="0" w:evenVBand="0" w:oddHBand="0" w:evenHBand="0" w:firstRowFirstColumn="0" w:firstRowLastColumn="0" w:lastRowFirstColumn="0" w:lastRowLastColumn="0"/>
@@ -10214,6 +10385,7 @@
             <w:pPr>
               <w:pStyle w:val="Normal"/>
               <w:widowControl/>
+              <w:suppressAutoHyphens w:val="true"/>
               <w:spacing w:before="0" w:after="0"/>
               <w:jc w:val="left"/>
               <w:rPr>
@@ -10253,6 +10425,7 @@
             <w:pPr>
               <w:pStyle w:val="Normal"/>
               <w:widowControl/>
+              <w:suppressAutoHyphens w:val="true"/>
               <w:spacing w:before="0" w:after="0"/>
               <w:jc w:val="center"/>
               <w:cnfStyle w:val="000000100000" w:firstRow="0" w:lastRow="0" w:firstColumn="0" w:lastColumn="0" w:oddVBand="0" w:evenVBand="0" w:oddHBand="1" w:evenHBand="0" w:firstRowFirstColumn="0" w:firstRowLastColumn="0" w:lastRowFirstColumn="0" w:lastRowLastColumn="0"/>
@@ -10289,6 +10462,7 @@
             <w:pPr>
               <w:pStyle w:val="Normal"/>
               <w:widowControl/>
+              <w:suppressAutoHyphens w:val="true"/>
               <w:spacing w:before="0" w:after="0"/>
               <w:jc w:val="center"/>
               <w:cnfStyle w:val="000000100000" w:firstRow="0" w:lastRow="0" w:firstColumn="0" w:lastColumn="0" w:oddVBand="0" w:evenVBand="0" w:oddHBand="1" w:evenHBand="0" w:firstRowFirstColumn="0" w:firstRowLastColumn="0" w:lastRowFirstColumn="0" w:lastRowLastColumn="0"/>
@@ -10325,6 +10499,7 @@
             <w:pPr>
               <w:pStyle w:val="Normal"/>
               <w:widowControl/>
+              <w:suppressAutoHyphens w:val="true"/>
               <w:spacing w:before="0" w:after="0"/>
               <w:jc w:val="center"/>
               <w:cnfStyle w:val="000000100000" w:firstRow="0" w:lastRow="0" w:firstColumn="0" w:lastColumn="0" w:oddVBand="0" w:evenVBand="0" w:oddHBand="1" w:evenHBand="0" w:firstRowFirstColumn="0" w:firstRowLastColumn="0" w:lastRowFirstColumn="0" w:lastRowLastColumn="0"/>
@@ -10360,6 +10535,7 @@
             <w:pPr>
               <w:pStyle w:val="Normal"/>
               <w:widowControl/>
+              <w:suppressAutoHyphens w:val="true"/>
               <w:spacing w:before="0" w:after="0"/>
               <w:jc w:val="center"/>
               <w:cnfStyle w:val="000000100000" w:firstRow="0" w:lastRow="0" w:firstColumn="0" w:lastColumn="0" w:oddVBand="0" w:evenVBand="0" w:oddHBand="1" w:evenHBand="0" w:firstRowFirstColumn="0" w:firstRowLastColumn="0" w:lastRowFirstColumn="0" w:lastRowLastColumn="0"/>
@@ -10575,7 +10751,7 @@
     </w:pPr>
     <w:r>
       <w:drawing>
-        <wp:anchor behindDoc="1" distT="0" distB="0" distL="0" distR="0" simplePos="0" locked="0" layoutInCell="1" allowOverlap="1" relativeHeight="101">
+        <wp:anchor behindDoc="1" distT="0" distB="0" distL="0" distR="0" simplePos="0" locked="0" layoutInCell="1" allowOverlap="1" relativeHeight="107">
           <wp:simplePos x="0" y="0"/>
           <wp:positionH relativeFrom="column">
             <wp:posOffset>-1184910</wp:posOffset>
@@ -10653,7 +10829,7 @@
     </w:pPr>
     <w:r>
       <w:drawing>
-        <wp:anchor behindDoc="1" distT="0" distB="0" distL="0" distR="0" simplePos="0" locked="0" layoutInCell="1" allowOverlap="1" relativeHeight="100">
+        <wp:anchor behindDoc="1" distT="0" distB="0" distL="0" distR="0" simplePos="0" locked="0" layoutInCell="1" allowOverlap="1" relativeHeight="106">
           <wp:simplePos x="0" y="0"/>
           <wp:positionH relativeFrom="column">
             <wp:posOffset>-679450</wp:posOffset>
@@ -10700,7 +10876,7 @@
       <mc:AlternateContent>
         <mc:Choice Requires="wps">
           <w:drawing>
-            <wp:anchor behindDoc="1" distT="0" distB="12700" distL="0" distR="9525" simplePos="0" locked="0" layoutInCell="1" allowOverlap="1" relativeHeight="137" wp14:anchorId="62E62719">
+            <wp:anchor behindDoc="1" distT="3175" distB="3175" distL="0" distR="635" simplePos="0" locked="0" layoutInCell="1" allowOverlap="1" relativeHeight="145" wp14:anchorId="62E62719">
               <wp:simplePos x="0" y="0"/>
               <wp:positionH relativeFrom="column">
                 <wp:posOffset>-681355</wp:posOffset>
@@ -10726,10 +10902,7 @@
                       </a:prstGeom>
                       <a:ln>
                         <a:solidFill>
-                          <a:srgbClr val="ffc000">
-                            <a:lumMod val="60000"/>
-                            <a:lumOff val="40000"/>
-                          </a:srgbClr>
+                          <a:srgbClr val="ffd966"/>
                         </a:solidFill>
                       </a:ln>
                     </wps:spPr>
@@ -10788,7 +10961,7 @@
         <w:rFonts w:cs="Times New Roman" w:ascii="Times New Roman" w:hAnsi="Times New Roman"/>
         <w:color w:themeColor="background2" w:themeShade="1a" w:val="171717"/>
       </w:rPr>
-      <w:instrText xml:space="preserve"> PAGE \* ARABIC </w:instrText>
+      <w:instrText xml:space="preserve"> PAGE </w:instrText>
     </w:r>
     <w:r>
       <w:rPr>
@@ -10806,7 +10979,7 @@
         <w:rFonts w:cs="Times New Roman" w:ascii="Times New Roman" w:hAnsi="Times New Roman"/>
         <w:color w:themeColor="background2" w:themeShade="1a" w:val="171717"/>
       </w:rPr>
-      <w:t>19</w:t>
+      <w:t>20</w:t>
     </w:r>
     <w:r>
       <w:rPr>
@@ -10842,7 +11015,7 @@
         <w:rFonts w:cs="Times New Roman" w:ascii="Times New Roman" w:hAnsi="Times New Roman"/>
         <w:color w:themeColor="background2" w:themeShade="1a" w:val="171717"/>
       </w:rPr>
-      <w:instrText xml:space="preserve"> NUMPAGES \* ARABIC </w:instrText>
+      <w:instrText xml:space="preserve"> NUMPAGES </w:instrText>
     </w:r>
     <w:r>
       <w:rPr>
@@ -10860,7 +11033,7 @@
         <w:rFonts w:cs="Times New Roman" w:ascii="Times New Roman" w:hAnsi="Times New Roman"/>
         <w:color w:themeColor="background2" w:themeShade="1a" w:val="171717"/>
       </w:rPr>
-      <w:t>19</w:t>
+      <w:t>20</w:t>
     </w:r>
     <w:r>
       <w:rPr>
@@ -11021,7 +11194,7 @@
       <mc:AlternateContent>
         <mc:Choice Requires="wps">
           <w:drawing>
-            <wp:anchor behindDoc="1" distT="0" distB="12700" distL="0" distR="9525" simplePos="0" locked="0" layoutInCell="1" allowOverlap="1" relativeHeight="39" wp14:anchorId="62E62719">
+            <wp:anchor behindDoc="1" distT="3175" distB="3175" distL="0" distR="635" simplePos="0" locked="0" layoutInCell="1" allowOverlap="1" relativeHeight="40" wp14:anchorId="62E62719">
               <wp:simplePos x="0" y="0"/>
               <wp:positionH relativeFrom="column">
                 <wp:posOffset>-681355</wp:posOffset>
@@ -11047,10 +11220,7 @@
                       </a:prstGeom>
                       <a:ln>
                         <a:solidFill>
-                          <a:srgbClr val="ffc000">
-                            <a:lumMod val="60000"/>
-                            <a:lumOff val="40000"/>
-                          </a:srgbClr>
+                          <a:srgbClr val="ffd966"/>
                         </a:solidFill>
                       </a:ln>
                     </wps:spPr>
@@ -11109,7 +11279,7 @@
         <w:rFonts w:cs="Times New Roman" w:ascii="Times New Roman" w:hAnsi="Times New Roman"/>
         <w:color w:themeColor="background2" w:themeShade="1a" w:val="171717"/>
       </w:rPr>
-      <w:instrText xml:space="preserve"> PAGE \* ARABIC </w:instrText>
+      <w:instrText xml:space="preserve"> PAGE </w:instrText>
     </w:r>
     <w:r>
       <w:rPr>
@@ -11163,7 +11333,7 @@
         <w:rFonts w:cs="Times New Roman" w:ascii="Times New Roman" w:hAnsi="Times New Roman"/>
         <w:color w:themeColor="background2" w:themeShade="1a" w:val="171717"/>
       </w:rPr>
-      <w:instrText xml:space="preserve"> NUMPAGES \* ARABIC </w:instrText>
+      <w:instrText xml:space="preserve"> NUMPAGES </w:instrText>
     </w:r>
     <w:r>
       <w:rPr>
@@ -11181,7 +11351,7 @@
         <w:rFonts w:cs="Times New Roman" w:ascii="Times New Roman" w:hAnsi="Times New Roman"/>
         <w:color w:themeColor="background2" w:themeShade="1a" w:val="171717"/>
       </w:rPr>
-      <w:t>19</w:t>
+      <w:t>20</w:t>
     </w:r>
     <w:r>
       <w:rPr>
@@ -11336,7 +11506,7 @@
       <mc:AlternateContent>
         <mc:Choice Requires="wps">
           <w:drawing>
-            <wp:anchor behindDoc="1" distT="0" distB="12700" distL="0" distR="9525" simplePos="0" locked="0" layoutInCell="1" allowOverlap="1" relativeHeight="39" wp14:anchorId="62E62719">
+            <wp:anchor behindDoc="1" distT="3175" distB="3175" distL="0" distR="635" simplePos="0" locked="0" layoutInCell="1" allowOverlap="1" relativeHeight="40" wp14:anchorId="62E62719">
               <wp:simplePos x="0" y="0"/>
               <wp:positionH relativeFrom="column">
                 <wp:posOffset>-681355</wp:posOffset>
@@ -11362,10 +11532,7 @@
                       </a:prstGeom>
                       <a:ln>
                         <a:solidFill>
-                          <a:srgbClr val="ffc000">
-                            <a:lumMod val="60000"/>
-                            <a:lumOff val="40000"/>
-                          </a:srgbClr>
+                          <a:srgbClr val="ffd966"/>
                         </a:solidFill>
                       </a:ln>
                     </wps:spPr>
@@ -11424,7 +11591,7 @@
         <w:rFonts w:cs="Times New Roman" w:ascii="Times New Roman" w:hAnsi="Times New Roman"/>
         <w:color w:themeColor="background2" w:themeShade="1a" w:val="171717"/>
       </w:rPr>
-      <w:instrText xml:space="preserve"> PAGE \* ARABIC </w:instrText>
+      <w:instrText xml:space="preserve"> PAGE </w:instrText>
     </w:r>
     <w:r>
       <w:rPr>
@@ -11478,7 +11645,7 @@
         <w:rFonts w:cs="Times New Roman" w:ascii="Times New Roman" w:hAnsi="Times New Roman"/>
         <w:color w:themeColor="background2" w:themeShade="1a" w:val="171717"/>
       </w:rPr>
-      <w:instrText xml:space="preserve"> NUMPAGES \* ARABIC </w:instrText>
+      <w:instrText xml:space="preserve"> NUMPAGES </w:instrText>
     </w:r>
     <w:r>
       <w:rPr>
@@ -11496,7 +11663,7 @@
         <w:rFonts w:cs="Times New Roman" w:ascii="Times New Roman" w:hAnsi="Times New Roman"/>
         <w:color w:themeColor="background2" w:themeShade="1a" w:val="171717"/>
       </w:rPr>
-      <w:t>19</w:t>
+      <w:t>20</w:t>
     </w:r>
     <w:r>
       <w:rPr>
@@ -11526,7 +11693,7 @@
     </w:pPr>
     <w:r>
       <w:drawing>
-        <wp:anchor behindDoc="1" distT="0" distB="0" distL="0" distR="0" simplePos="0" locked="0" layoutInCell="1" allowOverlap="1" relativeHeight="49">
+        <wp:anchor behindDoc="1" distT="0" distB="0" distL="0" distR="0" simplePos="0" locked="0" layoutInCell="1" allowOverlap="1" relativeHeight="50">
           <wp:simplePos x="0" y="0"/>
           <wp:positionH relativeFrom="column">
             <wp:posOffset>-1184910</wp:posOffset>
@@ -11604,7 +11771,7 @@
     </w:pPr>
     <w:r>
       <w:drawing>
-        <wp:anchor behindDoc="1" distT="0" distB="0" distL="0" distR="0" simplePos="0" locked="0" layoutInCell="1" allowOverlap="1" relativeHeight="51">
+        <wp:anchor behindDoc="1" distT="0" distB="0" distL="0" distR="0" simplePos="0" locked="0" layoutInCell="1" allowOverlap="1" relativeHeight="83">
           <wp:simplePos x="0" y="0"/>
           <wp:positionH relativeFrom="column">
             <wp:posOffset>-679450</wp:posOffset>
@@ -11651,7 +11818,7 @@
       <mc:AlternateContent>
         <mc:Choice Requires="wps">
           <w:drawing>
-            <wp:anchor behindDoc="1" distT="0" distB="12700" distL="0" distR="9525" simplePos="0" locked="0" layoutInCell="1" allowOverlap="1" relativeHeight="87" wp14:anchorId="62E62719">
+            <wp:anchor behindDoc="1" distT="3175" distB="3175" distL="0" distR="635" simplePos="0" locked="0" layoutInCell="1" allowOverlap="1" relativeHeight="98" wp14:anchorId="62E62719">
               <wp:simplePos x="0" y="0"/>
               <wp:positionH relativeFrom="column">
                 <wp:posOffset>-681355</wp:posOffset>
@@ -11677,10 +11844,7 @@
                       </a:prstGeom>
                       <a:ln>
                         <a:solidFill>
-                          <a:srgbClr val="ffc000">
-                            <a:lumMod val="60000"/>
-                            <a:lumOff val="40000"/>
-                          </a:srgbClr>
+                          <a:srgbClr val="ffd966"/>
                         </a:solidFill>
                       </a:ln>
                     </wps:spPr>
@@ -11739,7 +11903,7 @@
         <w:rFonts w:cs="Times New Roman" w:ascii="Times New Roman" w:hAnsi="Times New Roman"/>
         <w:color w:themeColor="background2" w:themeShade="1a" w:val="171717"/>
       </w:rPr>
-      <w:instrText xml:space="preserve"> PAGE \* ARABIC </w:instrText>
+      <w:instrText xml:space="preserve"> PAGE </w:instrText>
     </w:r>
     <w:r>
       <w:rPr>
@@ -11793,7 +11957,7 @@
         <w:rFonts w:cs="Times New Roman" w:ascii="Times New Roman" w:hAnsi="Times New Roman"/>
         <w:color w:themeColor="background2" w:themeShade="1a" w:val="171717"/>
       </w:rPr>
-      <w:instrText xml:space="preserve"> NUMPAGES \* ARABIC </w:instrText>
+      <w:instrText xml:space="preserve"> NUMPAGES </w:instrText>
     </w:r>
     <w:r>
       <w:rPr>
@@ -11811,7 +11975,7 @@
         <w:rFonts w:cs="Times New Roman" w:ascii="Times New Roman" w:hAnsi="Times New Roman"/>
         <w:color w:themeColor="background2" w:themeShade="1a" w:val="171717"/>
       </w:rPr>
-      <w:t>19</w:t>
+      <w:t>20</w:t>
     </w:r>
     <w:r>
       <w:rPr>
@@ -11847,7 +12011,7 @@
     </w:pPr>
     <w:r>
       <w:drawing>
-        <wp:anchor behindDoc="1" distT="0" distB="0" distL="0" distR="0" simplePos="0" locked="0" layoutInCell="1" allowOverlap="1" relativeHeight="86">
+        <wp:anchor behindDoc="1" distT="0" distB="0" distL="0" distR="0" simplePos="0" locked="0" layoutInCell="1" allowOverlap="1" relativeHeight="96">
           <wp:simplePos x="0" y="0"/>
           <wp:positionH relativeFrom="column">
             <wp:posOffset>-1184910</wp:posOffset>
@@ -11925,7 +12089,7 @@
     </w:pPr>
     <w:r>
       <w:drawing>
-        <wp:anchor behindDoc="1" distT="0" distB="0" distL="0" distR="0" simplePos="0" locked="0" layoutInCell="1" allowOverlap="1" relativeHeight="70">
+        <wp:anchor behindDoc="1" distT="0" distB="0" distL="0" distR="0" simplePos="0" locked="0" layoutInCell="1" allowOverlap="1" relativeHeight="81">
           <wp:simplePos x="0" y="0"/>
           <wp:positionH relativeFrom="column">
             <wp:posOffset>-679450</wp:posOffset>
@@ -11972,7 +12136,7 @@
       <mc:AlternateContent>
         <mc:Choice Requires="wps">
           <w:drawing>
-            <wp:anchor behindDoc="1" distT="0" distB="12700" distL="0" distR="9525" simplePos="0" locked="0" layoutInCell="1" allowOverlap="1" relativeHeight="119" wp14:anchorId="62E62719">
+            <wp:anchor behindDoc="1" distT="3175" distB="3175" distL="0" distR="635" simplePos="0" locked="0" layoutInCell="1" allowOverlap="1" relativeHeight="127" wp14:anchorId="62E62719">
               <wp:simplePos x="0" y="0"/>
               <wp:positionH relativeFrom="column">
                 <wp:posOffset>-681355</wp:posOffset>
@@ -11998,10 +12162,7 @@
                       </a:prstGeom>
                       <a:ln>
                         <a:solidFill>
-                          <a:srgbClr val="ffc000">
-                            <a:lumMod val="60000"/>
-                            <a:lumOff val="40000"/>
-                          </a:srgbClr>
+                          <a:srgbClr val="ffd966"/>
                         </a:solidFill>
                       </a:ln>
                     </wps:spPr>
@@ -12060,7 +12221,7 @@
         <w:rFonts w:cs="Times New Roman" w:ascii="Times New Roman" w:hAnsi="Times New Roman"/>
         <w:color w:themeColor="background2" w:themeShade="1a" w:val="171717"/>
       </w:rPr>
-      <w:instrText xml:space="preserve"> PAGE \* ARABIC </w:instrText>
+      <w:instrText xml:space="preserve"> PAGE </w:instrText>
     </w:r>
     <w:r>
       <w:rPr>
@@ -12078,7 +12239,7 @@
         <w:rFonts w:cs="Times New Roman" w:ascii="Times New Roman" w:hAnsi="Times New Roman"/>
         <w:color w:themeColor="background2" w:themeShade="1a" w:val="171717"/>
       </w:rPr>
-      <w:t>13</w:t>
+      <w:t>14</w:t>
     </w:r>
     <w:r>
       <w:rPr>
@@ -12114,7 +12275,7 @@
         <w:rFonts w:cs="Times New Roman" w:ascii="Times New Roman" w:hAnsi="Times New Roman"/>
         <w:color w:themeColor="background2" w:themeShade="1a" w:val="171717"/>
       </w:rPr>
-      <w:instrText xml:space="preserve"> NUMPAGES \* ARABIC </w:instrText>
+      <w:instrText xml:space="preserve"> NUMPAGES </w:instrText>
     </w:r>
     <w:r>
       <w:rPr>
@@ -12132,7 +12293,7 @@
         <w:rFonts w:cs="Times New Roman" w:ascii="Times New Roman" w:hAnsi="Times New Roman"/>
         <w:color w:themeColor="background2" w:themeShade="1a" w:val="171717"/>
       </w:rPr>
-      <w:t>19</w:t>
+      <w:t>20</w:t>
     </w:r>
     <w:r>
       <w:rPr>
@@ -12168,7 +12329,7 @@
     </w:pPr>
     <w:r>
       <w:drawing>
-        <wp:anchor behindDoc="1" distT="0" distB="0" distL="0" distR="0" simplePos="0" locked="0" layoutInCell="1" allowOverlap="1" relativeHeight="109">
+        <wp:anchor behindDoc="1" distT="0" distB="0" distL="0" distR="0" simplePos="0" locked="0" layoutInCell="1" allowOverlap="1" relativeHeight="112">
           <wp:simplePos x="0" y="0"/>
           <wp:positionH relativeFrom="column">
             <wp:posOffset>-1184910</wp:posOffset>
@@ -12293,7 +12454,7 @@
       <mc:AlternateContent>
         <mc:Choice Requires="wps">
           <w:drawing>
-            <wp:anchor behindDoc="1" distT="0" distB="12700" distL="0" distR="9525" simplePos="0" locked="0" layoutInCell="1" allowOverlap="1" relativeHeight="134" wp14:anchorId="62E62719">
+            <wp:anchor behindDoc="1" distT="3175" distB="3175" distL="0" distR="635" simplePos="0" locked="0" layoutInCell="1" allowOverlap="1" relativeHeight="142" wp14:anchorId="62E62719">
               <wp:simplePos x="0" y="0"/>
               <wp:positionH relativeFrom="column">
                 <wp:posOffset>-681355</wp:posOffset>
@@ -12319,10 +12480,7 @@
                       </a:prstGeom>
                       <a:ln>
                         <a:solidFill>
-                          <a:srgbClr val="ffc000">
-                            <a:lumMod val="60000"/>
-                            <a:lumOff val="40000"/>
-                          </a:srgbClr>
+                          <a:srgbClr val="ffd966"/>
                         </a:solidFill>
                       </a:ln>
                     </wps:spPr>
@@ -12381,7 +12539,7 @@
         <w:rFonts w:cs="Times New Roman" w:ascii="Times New Roman" w:hAnsi="Times New Roman"/>
         <w:color w:themeColor="background2" w:themeShade="1a" w:val="171717"/>
       </w:rPr>
-      <w:instrText xml:space="preserve"> PAGE \* ARABIC </w:instrText>
+      <w:instrText xml:space="preserve"> PAGE </w:instrText>
     </w:r>
     <w:r>
       <w:rPr>
@@ -12399,7 +12557,7 @@
         <w:rFonts w:cs="Times New Roman" w:ascii="Times New Roman" w:hAnsi="Times New Roman"/>
         <w:color w:themeColor="background2" w:themeShade="1a" w:val="171717"/>
       </w:rPr>
-      <w:t>18</w:t>
+      <w:t>19</w:t>
     </w:r>
     <w:r>
       <w:rPr>
@@ -12435,7 +12593,7 @@
         <w:rFonts w:cs="Times New Roman" w:ascii="Times New Roman" w:hAnsi="Times New Roman"/>
         <w:color w:themeColor="background2" w:themeShade="1a" w:val="171717"/>
       </w:rPr>
-      <w:instrText xml:space="preserve"> NUMPAGES \* ARABIC </w:instrText>
+      <w:instrText xml:space="preserve"> NUMPAGES </w:instrText>
     </w:r>
     <w:r>
       <w:rPr>
@@ -12453,7 +12611,7 @@
         <w:rFonts w:cs="Times New Roman" w:ascii="Times New Roman" w:hAnsi="Times New Roman"/>
         <w:color w:themeColor="background2" w:themeShade="1a" w:val="171717"/>
       </w:rPr>
-      <w:t>19</w:t>
+      <w:t>20</w:t>
     </w:r>
     <w:r>
       <w:rPr>
@@ -12486,7 +12644,7 @@
       <mc:AlternateContent>
         <mc:Choice Requires="wps">
           <w:drawing>
-            <wp:anchor behindDoc="1" distT="0" distB="0" distL="114300" distR="113030" simplePos="0" locked="0" layoutInCell="0" allowOverlap="1" relativeHeight="23">
+            <wp:anchor behindDoc="1" distT="0" distB="0" distL="635" distR="0" simplePos="0" locked="0" layoutInCell="0" allowOverlap="1" relativeHeight="22">
               <wp:simplePos x="0" y="0"/>
               <wp:positionH relativeFrom="margin">
                 <wp:align>center</wp:align>
@@ -12530,30 +12688,11 @@
         </mc:Choice>
         <mc:Fallback>
           <w:pict>
-            <v:shapetype id="_x0000_t75" coordsize="21600,21600" o:spt="75" o:preferrelative="t" path="m@4@5l@4@11@9@11@9@5xe" filled="f" stroked="f">
-              <v:stroke joinstyle="miter"/>
-              <v:formulas>
-                <v:f eqn="if lineDrawn pixelLineWidth 0"/>
-                <v:f eqn="sum @0 1 0"/>
-                <v:f eqn="sum 0 0 @1"/>
-                <v:f eqn="prod @2 1 2"/>
-                <v:f eqn="prod @3 21600 pixelWidth"/>
-                <v:f eqn="prod @3 21600 pixelHeight"/>
-                <v:f eqn="sum @0 0 1"/>
-                <v:f eqn="prod @6 1 2"/>
-                <v:f eqn="prod @7 21600 pixelWidth"/>
-                <v:f eqn="sum @8 21600 0"/>
-                <v:f eqn="prod @7 21600 pixelHeight"/>
-                <v:f eqn="sum @10 21600 0"/>
-              </v:formulas>
-              <v:path o:extrusionok="f" gradientshapeok="t" o:connecttype="rect"/>
-              <o:lock v:ext="edit" aspectratio="t"/>
-            </v:shapetype>
-            <v:shape id="WordPictureWatermark34350960" o:spid="shape_0" stroked="f" o:allowincell="f" style="position:absolute;margin-left:0.05pt;margin-top:0pt;width:0pt;height:0pt;mso-wrap-style:none;v-text-anchor:middle;mso-position-horizontal:center;mso-position-horizontal-relative:margin;mso-position-vertical:center;mso-position-vertical-relative:margin" type="_x0000_t75">
+            <v:rect id="WordPictureWatermark34350960" o:spid="shape_0" path="m0,0l-2147483645,0l-2147483645,-2147483646l0,-2147483646xe" stroked="f" o:allowincell="f" style="position:absolute;margin-left:0pt;margin-top:0pt;width:0pt;height:3.55pt;mso-wrap-style:none;v-text-anchor:middle;mso-position-horizontal:center;mso-position-horizontal-relative:margin;mso-position-vertical:center;mso-position-vertical-relative:margin">
               <v:fill o:detectmouseclick="t" on="false"/>
               <v:stroke color="#3465a4" joinstyle="round" endcap="flat"/>
               <w10:wrap type="none"/>
-            </v:shape>
+            </v:rect>
           </w:pict>
         </mc:Fallback>
       </mc:AlternateContent>
@@ -12581,7 +12720,7 @@
         <w:szCs w:val="18"/>
       </w:rPr>
       <w:drawing>
-        <wp:anchor behindDoc="1" distT="0" distB="0" distL="0" distR="0" simplePos="0" locked="0" layoutInCell="1" allowOverlap="1" relativeHeight="95">
+        <wp:anchor behindDoc="1" distT="0" distB="0" distL="0" distR="0" simplePos="0" locked="0" layoutInCell="1" allowOverlap="1" relativeHeight="92">
           <wp:simplePos x="0" y="0"/>
           <wp:positionH relativeFrom="column">
             <wp:posOffset>4743450</wp:posOffset>
@@ -12626,7 +12765,7 @@
         </wp:anchor>
       </w:drawing>
       <w:drawing>
-        <wp:anchor behindDoc="1" distT="0" distB="0" distL="0" distR="0" simplePos="0" locked="0" layoutInCell="1" allowOverlap="1" relativeHeight="111">
+        <wp:anchor behindDoc="1" distT="0" distB="0" distL="0" distR="0" simplePos="0" locked="0" layoutInCell="1" allowOverlap="1" relativeHeight="105">
           <wp:simplePos x="0" y="0"/>
           <wp:positionH relativeFrom="column">
             <wp:posOffset>-1864360</wp:posOffset>
@@ -12673,7 +12812,7 @@
       <mc:AlternateContent>
         <mc:Choice Requires="wps">
           <w:drawing>
-            <wp:anchor behindDoc="1" distT="0" distB="0" distL="114300" distR="113030" simplePos="0" locked="0" layoutInCell="0" allowOverlap="1" relativeHeight="135">
+            <wp:anchor behindDoc="1" distT="0" distB="0" distL="635" distR="0" simplePos="0" locked="0" layoutInCell="0" allowOverlap="1" relativeHeight="143">
               <wp:simplePos x="0" y="0"/>
               <wp:positionH relativeFrom="margin">
                 <wp:align>center</wp:align>
@@ -12717,11 +12856,11 @@
         </mc:Choice>
         <mc:Fallback>
           <w:pict>
-            <v:shape id="WordPictureWatermark 4" o:spid="shape_0" stroked="f" o:allowincell="f" style="position:absolute;margin-left:350pt;margin-top:212.55pt;width:0pt;height:0pt;mso-wrap-style:none;v-text-anchor:middle;mso-position-horizontal:center;mso-position-horizontal-relative:margin;mso-position-vertical:center;mso-position-vertical-relative:margin" type="_x0000_t75">
+            <v:rect id="WordPictureWatermark 4" o:spid="shape_0" path="m0,0l-2147483645,0l-2147483645,-2147483646l0,-2147483646xe" stroked="f" o:allowincell="f" style="position:absolute;margin-left:350pt;margin-top:212.55pt;width:0pt;height:3.55pt;mso-wrap-style:none;v-text-anchor:middle;mso-position-horizontal:center;mso-position-horizontal-relative:margin;mso-position-vertical:center;mso-position-vertical-relative:margin">
               <v:fill o:detectmouseclick="t" on="false"/>
               <v:stroke color="#3465a4" joinstyle="round" endcap="flat"/>
               <w10:wrap type="none"/>
-            </v:shape>
+            </v:rect>
           </w:pict>
         </mc:Fallback>
       </mc:AlternateContent>
@@ -12737,7 +12876,7 @@
       <mc:AlternateContent>
         <mc:Choice Requires="wps">
           <w:drawing>
-            <wp:anchor behindDoc="1" distT="0" distB="12700" distL="0" distR="9525" simplePos="0" locked="0" layoutInCell="1" allowOverlap="1" relativeHeight="136" wp14:anchorId="29C96EFF">
+            <wp:anchor behindDoc="1" distT="3175" distB="3175" distL="0" distR="635" simplePos="0" locked="0" layoutInCell="1" allowOverlap="1" relativeHeight="144" wp14:anchorId="29C96EFF">
               <wp:simplePos x="0" y="0"/>
               <wp:positionH relativeFrom="column">
                 <wp:posOffset>-682625</wp:posOffset>
@@ -12763,10 +12902,7 @@
                       </a:prstGeom>
                       <a:ln>
                         <a:solidFill>
-                          <a:srgbClr val="ffc000">
-                            <a:lumMod val="60000"/>
-                            <a:lumOff val="40000"/>
-                          </a:srgbClr>
+                          <a:srgbClr val="ffd966"/>
                         </a:solidFill>
                       </a:ln>
                     </wps:spPr>
@@ -12921,7 +13057,7 @@
       <mc:AlternateContent>
         <mc:Choice Requires="wps">
           <w:drawing>
-            <wp:anchor behindDoc="1" distT="0" distB="0" distL="114300" distR="113030" simplePos="0" locked="0" layoutInCell="0" allowOverlap="1" relativeHeight="28">
+            <wp:anchor behindDoc="1" distT="0" distB="0" distL="635" distR="0" simplePos="0" locked="0" layoutInCell="0" allowOverlap="1" relativeHeight="28">
               <wp:simplePos x="0" y="0"/>
               <wp:positionH relativeFrom="margin">
                 <wp:align>center</wp:align>
@@ -12965,11 +13101,11 @@
         </mc:Choice>
         <mc:Fallback>
           <w:pict>
-            <v:shape id="WordPictureWatermark34350961" o:spid="shape_0" stroked="f" o:allowincell="f" style="position:absolute;margin-left:212.55pt;margin-top:350pt;width:0pt;height:0pt;mso-wrap-style:none;v-text-anchor:middle;mso-position-horizontal:center;mso-position-horizontal-relative:margin;mso-position-vertical:center;mso-position-vertical-relative:margin" type="_x0000_t75">
+            <v:rect id="WordPictureWatermark34350961" o:spid="shape_0" path="m0,0l-2147483645,0l-2147483645,-2147483646l0,-2147483646xe" stroked="f" o:allowincell="f" style="position:absolute;margin-left:212.55pt;margin-top:350pt;width:0pt;height:3.55pt;mso-wrap-style:none;v-text-anchor:middle;mso-position-horizontal:center;mso-position-horizontal-relative:margin;mso-position-vertical:center;mso-position-vertical-relative:margin">
               <v:fill o:detectmouseclick="t" on="false"/>
               <v:stroke color="#3465a4" joinstyle="round" endcap="flat"/>
               <w10:wrap type="none"/>
-            </v:shape>
+            </v:rect>
           </w:pict>
         </mc:Fallback>
       </mc:AlternateContent>
@@ -12985,7 +13121,7 @@
       <mc:AlternateContent>
         <mc:Choice Requires="wps">
           <w:drawing>
-            <wp:anchor behindDoc="1" distT="0" distB="12700" distL="0" distR="9525" simplePos="0" locked="0" layoutInCell="1" allowOverlap="1" relativeHeight="34" wp14:anchorId="29C96EFF">
+            <wp:anchor behindDoc="1" distT="3175" distB="3175" distL="0" distR="635" simplePos="0" locked="0" layoutInCell="1" allowOverlap="1" relativeHeight="34" wp14:anchorId="29C96EFF">
               <wp:simplePos x="0" y="0"/>
               <wp:positionH relativeFrom="column">
                 <wp:posOffset>-682625</wp:posOffset>
@@ -13011,10 +13147,7 @@
                       </a:prstGeom>
                       <a:ln>
                         <a:solidFill>
-                          <a:srgbClr val="ffc000">
-                            <a:lumMod val="60000"/>
-                            <a:lumOff val="40000"/>
-                          </a:srgbClr>
+                          <a:srgbClr val="ffd966"/>
                         </a:solidFill>
                       </a:ln>
                     </wps:spPr>
@@ -13163,7 +13296,7 @@
       <mc:AlternateContent>
         <mc:Choice Requires="wps">
           <w:drawing>
-            <wp:anchor behindDoc="1" distT="0" distB="0" distL="114300" distR="113030" simplePos="0" locked="0" layoutInCell="0" allowOverlap="1" relativeHeight="28">
+            <wp:anchor behindDoc="1" distT="0" distB="0" distL="635" distR="0" simplePos="0" locked="0" layoutInCell="0" allowOverlap="1" relativeHeight="28">
               <wp:simplePos x="0" y="0"/>
               <wp:positionH relativeFrom="margin">
                 <wp:align>center</wp:align>
@@ -13207,11 +13340,11 @@
         </mc:Choice>
         <mc:Fallback>
           <w:pict>
-            <v:shape id="WordPictureWatermark34350961" o:spid="shape_0" stroked="f" o:allowincell="f" style="position:absolute;margin-left:212.55pt;margin-top:350pt;width:0pt;height:0pt;mso-wrap-style:none;v-text-anchor:middle;mso-position-horizontal:center;mso-position-horizontal-relative:margin;mso-position-vertical:center;mso-position-vertical-relative:margin" type="_x0000_t75">
+            <v:rect id="WordPictureWatermark34350961" o:spid="shape_0" path="m0,0l-2147483645,0l-2147483645,-2147483646l0,-2147483646xe" stroked="f" o:allowincell="f" style="position:absolute;margin-left:212.55pt;margin-top:350pt;width:0pt;height:3.55pt;mso-wrap-style:none;v-text-anchor:middle;mso-position-horizontal:center;mso-position-horizontal-relative:margin;mso-position-vertical:center;mso-position-vertical-relative:margin">
               <v:fill o:detectmouseclick="t" on="false"/>
               <v:stroke color="#3465a4" joinstyle="round" endcap="flat"/>
               <w10:wrap type="none"/>
-            </v:shape>
+            </v:rect>
           </w:pict>
         </mc:Fallback>
       </mc:AlternateContent>
@@ -13227,7 +13360,7 @@
       <mc:AlternateContent>
         <mc:Choice Requires="wps">
           <w:drawing>
-            <wp:anchor behindDoc="1" distT="0" distB="12700" distL="0" distR="9525" simplePos="0" locked="0" layoutInCell="1" allowOverlap="1" relativeHeight="34" wp14:anchorId="29C96EFF">
+            <wp:anchor behindDoc="1" distT="3175" distB="3175" distL="0" distR="635" simplePos="0" locked="0" layoutInCell="1" allowOverlap="1" relativeHeight="34" wp14:anchorId="29C96EFF">
               <wp:simplePos x="0" y="0"/>
               <wp:positionH relativeFrom="column">
                 <wp:posOffset>-682625</wp:posOffset>
@@ -13253,10 +13386,7 @@
                       </a:prstGeom>
                       <a:ln>
                         <a:solidFill>
-                          <a:srgbClr val="ffc000">
-                            <a:lumMod val="60000"/>
-                            <a:lumOff val="40000"/>
-                          </a:srgbClr>
+                          <a:srgbClr val="ffd966"/>
                         </a:solidFill>
                       </a:ln>
                     </wps:spPr>
@@ -13313,7 +13443,7 @@
         <w:szCs w:val="18"/>
       </w:rPr>
       <w:drawing>
-        <wp:anchor behindDoc="1" distT="0" distB="0" distL="0" distR="0" simplePos="0" locked="0" layoutInCell="1" allowOverlap="1" relativeHeight="41">
+        <wp:anchor behindDoc="1" distT="0" distB="0" distL="0" distR="0" simplePos="0" locked="0" layoutInCell="1" allowOverlap="1" relativeHeight="42">
           <wp:simplePos x="0" y="0"/>
           <wp:positionH relativeFrom="column">
             <wp:posOffset>-1864360</wp:posOffset>
@@ -13358,7 +13488,7 @@
         </wp:anchor>
       </w:drawing>
       <w:drawing>
-        <wp:anchor behindDoc="1" distT="0" distB="0" distL="0" distR="0" simplePos="0" locked="0" layoutInCell="1" allowOverlap="1" relativeHeight="43">
+        <wp:anchor behindDoc="1" distT="0" distB="0" distL="0" distR="0" simplePos="0" locked="0" layoutInCell="1" allowOverlap="1" relativeHeight="44">
           <wp:simplePos x="0" y="0"/>
           <wp:positionH relativeFrom="column">
             <wp:posOffset>4743450</wp:posOffset>
@@ -13405,7 +13535,7 @@
       <mc:AlternateContent>
         <mc:Choice Requires="wps">
           <w:drawing>
-            <wp:anchor behindDoc="1" distT="0" distB="0" distL="114300" distR="113030" simplePos="0" locked="0" layoutInCell="0" allowOverlap="1" relativeHeight="45">
+            <wp:anchor behindDoc="1" distT="0" distB="0" distL="635" distR="0" simplePos="0" locked="0" layoutInCell="0" allowOverlap="1" relativeHeight="46">
               <wp:simplePos x="0" y="0"/>
               <wp:positionH relativeFrom="margin">
                 <wp:align>center</wp:align>
@@ -13449,11 +13579,11 @@
         </mc:Choice>
         <mc:Fallback>
           <w:pict>
-            <v:shape id="WordPictureWatermark 1" o:spid="shape_0" stroked="f" o:allowincell="f" style="position:absolute;margin-left:212.55pt;margin-top:350pt;width:0pt;height:0pt;mso-wrap-style:none;v-text-anchor:middle;mso-position-horizontal:center;mso-position-horizontal-relative:margin;mso-position-vertical:center;mso-position-vertical-relative:margin" type="_x0000_t75">
+            <v:rect id="WordPictureWatermark 1" o:spid="shape_0" path="m0,0l-2147483645,0l-2147483645,-2147483646l0,-2147483646xe" stroked="f" o:allowincell="f" style="position:absolute;margin-left:212.55pt;margin-top:350pt;width:0pt;height:3.55pt;mso-wrap-style:none;v-text-anchor:middle;mso-position-horizontal:center;mso-position-horizontal-relative:margin;mso-position-vertical:center;mso-position-vertical-relative:margin">
               <v:fill o:detectmouseclick="t" on="false"/>
               <v:stroke color="#3465a4" joinstyle="round" endcap="flat"/>
               <w10:wrap type="none"/>
-            </v:shape>
+            </v:rect>
           </w:pict>
         </mc:Fallback>
       </mc:AlternateContent>
@@ -13469,7 +13599,7 @@
       <mc:AlternateContent>
         <mc:Choice Requires="wps">
           <w:drawing>
-            <wp:anchor behindDoc="1" distT="0" distB="12700" distL="0" distR="9525" simplePos="0" locked="0" layoutInCell="1" allowOverlap="1" relativeHeight="47" wp14:anchorId="29C96EFF">
+            <wp:anchor behindDoc="1" distT="3175" distB="3175" distL="0" distR="635" simplePos="0" locked="0" layoutInCell="1" allowOverlap="1" relativeHeight="48" wp14:anchorId="29C96EFF">
               <wp:simplePos x="0" y="0"/>
               <wp:positionH relativeFrom="column">
                 <wp:posOffset>-682625</wp:posOffset>
@@ -13495,10 +13625,7 @@
                       </a:prstGeom>
                       <a:ln>
                         <a:solidFill>
-                          <a:srgbClr val="ffc000">
-                            <a:lumMod val="60000"/>
-                            <a:lumOff val="40000"/>
-                          </a:srgbClr>
+                          <a:srgbClr val="ffd966"/>
                         </a:solidFill>
                       </a:ln>
                     </wps:spPr>
@@ -13561,7 +13688,52 @@
         <w:szCs w:val="18"/>
       </w:rPr>
       <w:drawing>
-        <wp:anchor behindDoc="1" distT="0" distB="0" distL="0" distR="0" simplePos="0" locked="0" layoutInCell="1" allowOverlap="1" relativeHeight="58">
+        <wp:anchor behindDoc="1" distT="0" distB="0" distL="0" distR="0" simplePos="0" locked="0" layoutInCell="1" allowOverlap="1" relativeHeight="57">
+          <wp:simplePos x="0" y="0"/>
+          <wp:positionH relativeFrom="column">
+            <wp:posOffset>-1864360</wp:posOffset>
+          </wp:positionH>
+          <wp:positionV relativeFrom="paragraph">
+            <wp:posOffset>-474345</wp:posOffset>
+          </wp:positionV>
+          <wp:extent cx="8589010" cy="572770"/>
+          <wp:effectExtent l="0" t="0" r="0" b="0"/>
+          <wp:wrapNone/>
+          <wp:docPr id="33" name="Imagen 6 Copia 1 Copia 1" descr=""/>
+          <wp:cNvGraphicFramePr>
+            <a:graphicFrameLocks xmlns:a="http://schemas.openxmlformats.org/drawingml/2006/main" noChangeAspect="1"/>
+          </wp:cNvGraphicFramePr>
+          <a:graphic xmlns:a="http://schemas.openxmlformats.org/drawingml/2006/main">
+            <a:graphicData uri="http://schemas.openxmlformats.org/drawingml/2006/picture">
+              <pic:pic xmlns:pic="http://schemas.openxmlformats.org/drawingml/2006/picture">
+                <pic:nvPicPr>
+                  <pic:cNvPr id="33" name="Imagen 6 Copia 1 Copia 1" descr=""/>
+                  <pic:cNvPicPr>
+                    <a:picLocks noChangeAspect="1" noChangeArrowheads="1"/>
+                  </pic:cNvPicPr>
+                </pic:nvPicPr>
+                <pic:blipFill>
+                  <a:blip r:embed="rId1"/>
+                  <a:stretch>
+                    <a:fillRect/>
+                  </a:stretch>
+                </pic:blipFill>
+                <pic:spPr bwMode="auto">
+                  <a:xfrm>
+                    <a:off x="0" y="0"/>
+                    <a:ext cx="8589010" cy="572770"/>
+                  </a:xfrm>
+                  <a:prstGeom prst="rect">
+                    <a:avLst/>
+                  </a:prstGeom>
+                </pic:spPr>
+              </pic:pic>
+            </a:graphicData>
+          </a:graphic>
+        </wp:anchor>
+      </w:drawing>
+      <w:drawing>
+        <wp:anchor behindDoc="1" distT="0" distB="0" distL="0" distR="0" simplePos="0" locked="0" layoutInCell="1" allowOverlap="1" relativeHeight="64">
           <wp:simplePos x="0" y="0"/>
           <wp:positionH relativeFrom="column">
             <wp:posOffset>4743450</wp:posOffset>
@@ -13572,7 +13744,7 @@
           <wp:extent cx="1311275" cy="294005"/>
           <wp:effectExtent l="0" t="0" r="0" b="0"/>
           <wp:wrapNone/>
-          <wp:docPr id="33" name="Imagen 9 Copia 1 Copia 1" descr=""/>
+          <wp:docPr id="34" name="Imagen 9 Copia 1 Copia 1" descr=""/>
           <wp:cNvGraphicFramePr>
             <a:graphicFrameLocks xmlns:a="http://schemas.openxmlformats.org/drawingml/2006/main" noChangeAspect="1"/>
           </wp:cNvGraphicFramePr>
@@ -13580,13 +13752,13 @@
             <a:graphicData uri="http://schemas.openxmlformats.org/drawingml/2006/picture">
               <pic:pic xmlns:pic="http://schemas.openxmlformats.org/drawingml/2006/picture">
                 <pic:nvPicPr>
-                  <pic:cNvPr id="33" name="Imagen 9 Copia 1 Copia 1" descr=""/>
+                  <pic:cNvPr id="34" name="Imagen 9 Copia 1 Copia 1" descr=""/>
                   <pic:cNvPicPr>
                     <a:picLocks noChangeAspect="1" noChangeArrowheads="1"/>
                   </pic:cNvPicPr>
                 </pic:nvPicPr>
                 <pic:blipFill>
-                  <a:blip r:embed="rId1"/>
+                  <a:blip r:embed="rId2"/>
                   <a:stretch>
                     <a:fillRect/>
                   </a:stretch>
@@ -13605,55 +13777,10 @@
           </a:graphic>
         </wp:anchor>
       </w:drawing>
-      <w:drawing>
-        <wp:anchor behindDoc="1" distT="0" distB="0" distL="0" distR="0" simplePos="0" locked="0" layoutInCell="1" allowOverlap="1" relativeHeight="64">
-          <wp:simplePos x="0" y="0"/>
-          <wp:positionH relativeFrom="column">
-            <wp:posOffset>-1864360</wp:posOffset>
-          </wp:positionH>
-          <wp:positionV relativeFrom="paragraph">
-            <wp:posOffset>-474345</wp:posOffset>
-          </wp:positionV>
-          <wp:extent cx="8589010" cy="572770"/>
-          <wp:effectExtent l="0" t="0" r="0" b="0"/>
-          <wp:wrapNone/>
-          <wp:docPr id="34" name="Imagen 6 Copia 1 Copia 1" descr=""/>
-          <wp:cNvGraphicFramePr>
-            <a:graphicFrameLocks xmlns:a="http://schemas.openxmlformats.org/drawingml/2006/main" noChangeAspect="1"/>
-          </wp:cNvGraphicFramePr>
-          <a:graphic xmlns:a="http://schemas.openxmlformats.org/drawingml/2006/main">
-            <a:graphicData uri="http://schemas.openxmlformats.org/drawingml/2006/picture">
-              <pic:pic xmlns:pic="http://schemas.openxmlformats.org/drawingml/2006/picture">
-                <pic:nvPicPr>
-                  <pic:cNvPr id="34" name="Imagen 6 Copia 1 Copia 1" descr=""/>
-                  <pic:cNvPicPr>
-                    <a:picLocks noChangeAspect="1" noChangeArrowheads="1"/>
-                  </pic:cNvPicPr>
-                </pic:nvPicPr>
-                <pic:blipFill>
-                  <a:blip r:embed="rId2"/>
-                  <a:stretch>
-                    <a:fillRect/>
-                  </a:stretch>
-                </pic:blipFill>
-                <pic:spPr bwMode="auto">
-                  <a:xfrm>
-                    <a:off x="0" y="0"/>
-                    <a:ext cx="8589010" cy="572770"/>
-                  </a:xfrm>
-                  <a:prstGeom prst="rect">
-                    <a:avLst/>
-                  </a:prstGeom>
-                </pic:spPr>
-              </pic:pic>
-            </a:graphicData>
-          </a:graphic>
-        </wp:anchor>
-      </w:drawing>
       <mc:AlternateContent>
         <mc:Choice Requires="wps">
           <w:drawing>
-            <wp:anchor behindDoc="1" distT="0" distB="0" distL="114300" distR="113030" simplePos="0" locked="0" layoutInCell="0" allowOverlap="1" relativeHeight="99">
+            <wp:anchor behindDoc="1" distT="0" distB="0" distL="635" distR="0" simplePos="0" locked="0" layoutInCell="0" allowOverlap="1" relativeHeight="113">
               <wp:simplePos x="0" y="0"/>
               <wp:positionH relativeFrom="margin">
                 <wp:align>center</wp:align>
@@ -13697,11 +13824,11 @@
         </mc:Choice>
         <mc:Fallback>
           <w:pict>
-            <v:shape id="WordPictureWatermark 2" o:spid="shape_0" stroked="f" o:allowincell="f" style="position:absolute;margin-left:212.55pt;margin-top:350pt;width:0pt;height:0pt;mso-wrap-style:none;v-text-anchor:middle;mso-position-horizontal:center;mso-position-horizontal-relative:margin;mso-position-vertical:center;mso-position-vertical-relative:margin" type="_x0000_t75">
+            <v:rect id="WordPictureWatermark 2" o:spid="shape_0" path="m0,0l-2147483645,0l-2147483645,-2147483646l0,-2147483646xe" stroked="f" o:allowincell="f" style="position:absolute;margin-left:212.55pt;margin-top:350pt;width:0pt;height:3.55pt;mso-wrap-style:none;v-text-anchor:middle;mso-position-horizontal:center;mso-position-horizontal-relative:margin;mso-position-vertical:center;mso-position-vertical-relative:margin">
               <v:fill o:detectmouseclick="t" on="false"/>
               <v:stroke color="#3465a4" joinstyle="round" endcap="flat"/>
               <w10:wrap type="none"/>
-            </v:shape>
+            </v:rect>
           </w:pict>
         </mc:Fallback>
       </mc:AlternateContent>
@@ -13717,7 +13844,7 @@
       <mc:AlternateContent>
         <mc:Choice Requires="wps">
           <w:drawing>
-            <wp:anchor behindDoc="1" distT="0" distB="12700" distL="0" distR="9525" simplePos="0" locked="0" layoutInCell="1" allowOverlap="1" relativeHeight="113" wp14:anchorId="29C96EFF">
+            <wp:anchor behindDoc="1" distT="3175" distB="3175" distL="0" distR="635" simplePos="0" locked="0" layoutInCell="1" allowOverlap="1" relativeHeight="120" wp14:anchorId="29C96EFF">
               <wp:simplePos x="0" y="0"/>
               <wp:positionH relativeFrom="column">
                 <wp:posOffset>-682625</wp:posOffset>
@@ -13743,10 +13870,7 @@
                       </a:prstGeom>
                       <a:ln>
                         <a:solidFill>
-                          <a:srgbClr val="ffc000">
-                            <a:lumMod val="60000"/>
-                            <a:lumOff val="40000"/>
-                          </a:srgbClr>
+                          <a:srgbClr val="ffd966"/>
                         </a:solidFill>
                       </a:ln>
                     </wps:spPr>
@@ -13812,6 +13936,51 @@
         <wp:anchor behindDoc="1" distT="0" distB="0" distL="0" distR="0" simplePos="0" locked="0" layoutInCell="1" allowOverlap="1" relativeHeight="75">
           <wp:simplePos x="0" y="0"/>
           <wp:positionH relativeFrom="column">
+            <wp:posOffset>-1864360</wp:posOffset>
+          </wp:positionH>
+          <wp:positionV relativeFrom="paragraph">
+            <wp:posOffset>-474345</wp:posOffset>
+          </wp:positionV>
+          <wp:extent cx="8589010" cy="572770"/>
+          <wp:effectExtent l="0" t="0" r="0" b="0"/>
+          <wp:wrapNone/>
+          <wp:docPr id="46" name="Imagen 6 Copia 1 Copia 1 Copia 1" descr=""/>
+          <wp:cNvGraphicFramePr>
+            <a:graphicFrameLocks xmlns:a="http://schemas.openxmlformats.org/drawingml/2006/main" noChangeAspect="1"/>
+          </wp:cNvGraphicFramePr>
+          <a:graphic xmlns:a="http://schemas.openxmlformats.org/drawingml/2006/main">
+            <a:graphicData uri="http://schemas.openxmlformats.org/drawingml/2006/picture">
+              <pic:pic xmlns:pic="http://schemas.openxmlformats.org/drawingml/2006/picture">
+                <pic:nvPicPr>
+                  <pic:cNvPr id="46" name="Imagen 6 Copia 1 Copia 1 Copia 1" descr=""/>
+                  <pic:cNvPicPr>
+                    <a:picLocks noChangeAspect="1" noChangeArrowheads="1"/>
+                  </pic:cNvPicPr>
+                </pic:nvPicPr>
+                <pic:blipFill>
+                  <a:blip r:embed="rId1"/>
+                  <a:stretch>
+                    <a:fillRect/>
+                  </a:stretch>
+                </pic:blipFill>
+                <pic:spPr bwMode="auto">
+                  <a:xfrm>
+                    <a:off x="0" y="0"/>
+                    <a:ext cx="8589010" cy="572770"/>
+                  </a:xfrm>
+                  <a:prstGeom prst="rect">
+                    <a:avLst/>
+                  </a:prstGeom>
+                </pic:spPr>
+              </pic:pic>
+            </a:graphicData>
+          </a:graphic>
+        </wp:anchor>
+      </w:drawing>
+      <w:drawing>
+        <wp:anchor behindDoc="1" distT="0" distB="0" distL="0" distR="0" simplePos="0" locked="0" layoutInCell="1" allowOverlap="1" relativeHeight="80">
+          <wp:simplePos x="0" y="0"/>
+          <wp:positionH relativeFrom="column">
             <wp:posOffset>4743450</wp:posOffset>
           </wp:positionH>
           <wp:positionV relativeFrom="paragraph">
@@ -13820,7 +13989,7 @@
           <wp:extent cx="1311275" cy="294005"/>
           <wp:effectExtent l="0" t="0" r="0" b="0"/>
           <wp:wrapNone/>
-          <wp:docPr id="46" name="Imagen 9 Copia 1 Copia 1 Copia 1" descr=""/>
+          <wp:docPr id="47" name="Imagen 9 Copia 1 Copia 1 Copia 1" descr=""/>
           <wp:cNvGraphicFramePr>
             <a:graphicFrameLocks xmlns:a="http://schemas.openxmlformats.org/drawingml/2006/main" noChangeAspect="1"/>
           </wp:cNvGraphicFramePr>
@@ -13828,13 +13997,13 @@
             <a:graphicData uri="http://schemas.openxmlformats.org/drawingml/2006/picture">
               <pic:pic xmlns:pic="http://schemas.openxmlformats.org/drawingml/2006/picture">
                 <pic:nvPicPr>
-                  <pic:cNvPr id="46" name="Imagen 9 Copia 1 Copia 1 Copia 1" descr=""/>
+                  <pic:cNvPr id="47" name="Imagen 9 Copia 1 Copia 1 Copia 1" descr=""/>
                   <pic:cNvPicPr>
                     <a:picLocks noChangeAspect="1" noChangeArrowheads="1"/>
                   </pic:cNvPicPr>
                 </pic:nvPicPr>
                 <pic:blipFill>
-                  <a:blip r:embed="rId1"/>
+                  <a:blip r:embed="rId2"/>
                   <a:stretch>
                     <a:fillRect/>
                   </a:stretch>
@@ -13853,55 +14022,10 @@
           </a:graphic>
         </wp:anchor>
       </w:drawing>
-      <w:drawing>
-        <wp:anchor behindDoc="1" distT="0" distB="0" distL="0" distR="0" simplePos="0" locked="0" layoutInCell="1" allowOverlap="1" relativeHeight="82">
-          <wp:simplePos x="0" y="0"/>
-          <wp:positionH relativeFrom="column">
-            <wp:posOffset>-1864360</wp:posOffset>
-          </wp:positionH>
-          <wp:positionV relativeFrom="paragraph">
-            <wp:posOffset>-474345</wp:posOffset>
-          </wp:positionV>
-          <wp:extent cx="8589010" cy="572770"/>
-          <wp:effectExtent l="0" t="0" r="0" b="0"/>
-          <wp:wrapNone/>
-          <wp:docPr id="47" name="Imagen 6 Copia 1 Copia 1 Copia 1" descr=""/>
-          <wp:cNvGraphicFramePr>
-            <a:graphicFrameLocks xmlns:a="http://schemas.openxmlformats.org/drawingml/2006/main" noChangeAspect="1"/>
-          </wp:cNvGraphicFramePr>
-          <a:graphic xmlns:a="http://schemas.openxmlformats.org/drawingml/2006/main">
-            <a:graphicData uri="http://schemas.openxmlformats.org/drawingml/2006/picture">
-              <pic:pic xmlns:pic="http://schemas.openxmlformats.org/drawingml/2006/picture">
-                <pic:nvPicPr>
-                  <pic:cNvPr id="47" name="Imagen 6 Copia 1 Copia 1 Copia 1" descr=""/>
-                  <pic:cNvPicPr>
-                    <a:picLocks noChangeAspect="1" noChangeArrowheads="1"/>
-                  </pic:cNvPicPr>
-                </pic:nvPicPr>
-                <pic:blipFill>
-                  <a:blip r:embed="rId2"/>
-                  <a:stretch>
-                    <a:fillRect/>
-                  </a:stretch>
-                </pic:blipFill>
-                <pic:spPr bwMode="auto">
-                  <a:xfrm>
-                    <a:off x="0" y="0"/>
-                    <a:ext cx="8589010" cy="572770"/>
-                  </a:xfrm>
-                  <a:prstGeom prst="rect">
-                    <a:avLst/>
-                  </a:prstGeom>
-                </pic:spPr>
-              </pic:pic>
-            </a:graphicData>
-          </a:graphic>
-        </wp:anchor>
-      </w:drawing>
       <mc:AlternateContent>
         <mc:Choice Requires="wps">
           <w:drawing>
-            <wp:anchor behindDoc="1" distT="0" distB="0" distL="114300" distR="113030" simplePos="0" locked="0" layoutInCell="0" allowOverlap="1" relativeHeight="124">
+            <wp:anchor behindDoc="1" distT="0" distB="0" distL="635" distR="0" simplePos="0" locked="0" layoutInCell="0" allowOverlap="1" relativeHeight="132">
               <wp:simplePos x="0" y="0"/>
               <wp:positionH relativeFrom="margin">
                 <wp:align>center</wp:align>
@@ -13945,11 +14069,11 @@
         </mc:Choice>
         <mc:Fallback>
           <w:pict>
-            <v:shape id="WordPictureWatermark 3" o:spid="shape_0" stroked="f" o:allowincell="f" style="position:absolute;margin-left:212.55pt;margin-top:350pt;width:0pt;height:0pt;mso-wrap-style:none;v-text-anchor:middle;mso-position-horizontal:center;mso-position-horizontal-relative:margin;mso-position-vertical:center;mso-position-vertical-relative:margin" type="_x0000_t75">
+            <v:rect id="WordPictureWatermark 3" o:spid="shape_0" path="m0,0l-2147483645,0l-2147483645,-2147483646l0,-2147483646xe" stroked="f" o:allowincell="f" style="position:absolute;margin-left:212.55pt;margin-top:350pt;width:0pt;height:3.55pt;mso-wrap-style:none;v-text-anchor:middle;mso-position-horizontal:center;mso-position-horizontal-relative:margin;mso-position-vertical:center;mso-position-vertical-relative:margin">
               <v:fill o:detectmouseclick="t" on="false"/>
               <v:stroke color="#3465a4" joinstyle="round" endcap="flat"/>
               <w10:wrap type="none"/>
-            </v:shape>
+            </v:rect>
           </w:pict>
         </mc:Fallback>
       </mc:AlternateContent>
@@ -13965,7 +14089,7 @@
       <mc:AlternateContent>
         <mc:Choice Requires="wps">
           <w:drawing>
-            <wp:anchor behindDoc="1" distT="0" distB="12700" distL="0" distR="9525" simplePos="0" locked="0" layoutInCell="1" allowOverlap="1" relativeHeight="129" wp14:anchorId="29C96EFF">
+            <wp:anchor behindDoc="1" distT="3175" distB="3175" distL="0" distR="635" simplePos="0" locked="0" layoutInCell="1" allowOverlap="1" relativeHeight="137" wp14:anchorId="29C96EFF">
               <wp:simplePos x="0" y="0"/>
               <wp:positionH relativeFrom="column">
                 <wp:posOffset>-682625</wp:posOffset>
@@ -13991,10 +14115,7 @@
                       </a:prstGeom>
                       <a:ln>
                         <a:solidFill>
-                          <a:srgbClr val="ffc000">
-                            <a:lumMod val="60000"/>
-                            <a:lumOff val="40000"/>
-                          </a:srgbClr>
+                          <a:srgbClr val="ffd966"/>
                         </a:solidFill>
                       </a:ln>
                     </wps:spPr>
@@ -15684,6 +15805,7 @@
     <w:qFormat/>
     <w:pPr>
       <w:widowControl/>
+      <w:suppressAutoHyphens w:val="true"/>
       <w:bidi w:val="0"/>
       <w:spacing w:before="0" w:after="0"/>
       <w:jc w:val="left"/>
@@ -15981,7 +16103,6 @@
   </w:style>
   <w:style w:type="character" w:styleId="Caracteresdenotaalpie">
     <w:name w:val="Caracteres de nota al pie"/>
-    <w:basedOn w:val="DefaultParagraphFont"/>
     <w:uiPriority w:val="99"/>
     <w:semiHidden/>
     <w:unhideWhenUsed/>
@@ -16043,6 +16164,13 @@
     <w:rPr>
       <w:i/>
       <w:iCs/>
+    </w:rPr>
+  </w:style>
+  <w:style w:type="character" w:styleId="Bolos">
+    <w:name w:val="Bolos"/>
+    <w:qFormat/>
+    <w:rPr>
+      <w:rFonts w:ascii="OpenSymbol" w:hAnsi="OpenSymbol" w:eastAsia="OpenSymbol" w:cs="OpenSymbol"/>
     </w:rPr>
   </w:style>
   <w:style w:type="paragraph" w:styleId="Ttulo">
@@ -16289,6 +16417,7 @@
     <w:rsid w:val="00b7278f"/>
     <w:pPr>
       <w:widowControl/>
+      <w:suppressAutoHyphens w:val="true"/>
       <w:bidi w:val="0"/>
       <w:spacing w:before="0" w:after="0"/>
       <w:jc w:val="left"/>

</xml_diff>